<commit_message>
Add Mermaid class diagram to docs package
</commit_message>
<xml_diff>
--- a/deliverables/RiziEvents-Technical-Documentation.docx
+++ b/deliverables/RiziEvents-Technical-Documentation.docx
@@ -570,6 +570,12 @@
       </w:pPr>
       <w:r>
         <w:t>6. Components and Classes</w:t>
+      </w:r>
+    </w:p>
+    <w:p/>
+    <w:p>
+      <w:r>
+        <w:t>The class and component relationships are documented in `docs/diagrams/class-diagram.mmd`.</w:t>
       </w:r>
     </w:p>
     <w:p/>
@@ -3200,6 +3206,270 @@
         <w:t xml:space="preserve">    Prod -. deploy .-&gt; Vercel</w:t>
         <w:br/>
         <w:t xml:space="preserve">    Stage -. validate .-&gt; Vercel</w:t>
+      </w:r>
+    </w:p>
+    <w:p>
+      <w:pPr>
+        <w:pStyle w:val="Heading2"/>
+      </w:pPr>
+      <w:r>
+        <w:t>Class and Component Diagram</w:t>
+      </w:r>
+    </w:p>
+    <w:p>
+      <w:r>
+        <w:t>Mermaid source:</w:t>
+      </w:r>
+    </w:p>
+    <w:p>
+      <w:pPr>
+        <w:pStyle w:val="CodeBlock"/>
+      </w:pPr>
+      <w:r>
+        <w:t>classDiagram</w:t>
+        <w:br/>
+        <w:t xml:space="preserve">    class AuthUI {</w:t>
+        <w:br/>
+        <w:t xml:space="preserve">        +renderLoginForm()</w:t>
+        <w:br/>
+        <w:t xml:space="preserve">        +renderRegisterForm()</w:t>
+        <w:br/>
+        <w:t xml:space="preserve">        +submitCredentials()</w:t>
+        <w:br/>
+        <w:t xml:space="preserve">    }</w:t>
+        <w:br/>
+        <w:br/>
+        <w:t xml:space="preserve">    class EventManagementUI {</w:t>
+        <w:br/>
+        <w:t xml:space="preserve">        +renderEventForm()</w:t>
+        <w:br/>
+        <w:t xml:space="preserve">        +saveDraft()</w:t>
+        <w:br/>
+        <w:t xml:space="preserve">        +publishEvent()</w:t>
+        <w:br/>
+        <w:t xml:space="preserve">        +viewGuestList()</w:t>
+        <w:br/>
+        <w:t xml:space="preserve">    }</w:t>
+        <w:br/>
+        <w:br/>
+        <w:t xml:space="preserve">    class PublicEventPage {</w:t>
+        <w:br/>
+        <w:t xml:space="preserve">        +loadEventBySlug()</w:t>
+        <w:br/>
+        <w:t xml:space="preserve">        +renderEventDetails()</w:t>
+        <w:br/>
+        <w:t xml:space="preserve">        +showVenueDirections()</w:t>
+        <w:br/>
+        <w:t xml:space="preserve">    }</w:t>
+        <w:br/>
+        <w:br/>
+        <w:t xml:space="preserve">    class GuestRegistrationUI {</w:t>
+        <w:br/>
+        <w:t xml:space="preserve">        +renderRegistrationForm()</w:t>
+        <w:br/>
+        <w:t xml:space="preserve">        +submitRegistration()</w:t>
+        <w:br/>
+        <w:t xml:space="preserve">        +showConfirmation()</w:t>
+        <w:br/>
+        <w:t xml:space="preserve">    }</w:t>
+        <w:br/>
+        <w:br/>
+        <w:t xml:space="preserve">    class GuestListUI {</w:t>
+        <w:br/>
+        <w:t xml:space="preserve">        +renderGuestList()</w:t>
+        <w:br/>
+        <w:t xml:space="preserve">        +filterGuests()</w:t>
+        <w:br/>
+        <w:t xml:space="preserve">        +openCheckInScreen()</w:t>
+        <w:br/>
+        <w:t xml:space="preserve">    }</w:t>
+        <w:br/>
+        <w:br/>
+        <w:t xml:space="preserve">    class OfflineCheckInUI {</w:t>
+        <w:br/>
+        <w:t xml:space="preserve">        +searchGuest()</w:t>
+        <w:br/>
+        <w:t xml:space="preserve">        +confirmCheckIn()</w:t>
+        <w:br/>
+        <w:t xml:space="preserve">        +showAttendanceStatus()</w:t>
+        <w:br/>
+        <w:t xml:space="preserve">    }</w:t>
+        <w:br/>
+        <w:br/>
+        <w:t xml:space="preserve">    class AuthService {</w:t>
+        <w:br/>
+        <w:t xml:space="preserve">        +registerOrganizer()</w:t>
+        <w:br/>
+        <w:t xml:space="preserve">        +loginOrganizer()</w:t>
+        <w:br/>
+        <w:t xml:space="preserve">        +getCurrentOrganizer()</w:t>
+        <w:br/>
+        <w:t xml:space="preserve">    }</w:t>
+        <w:br/>
+        <w:br/>
+        <w:t xml:space="preserve">    class EventService {</w:t>
+        <w:br/>
+        <w:t xml:space="preserve">        +createEvent()</w:t>
+        <w:br/>
+        <w:t xml:space="preserve">        +updateEvent()</w:t>
+        <w:br/>
+        <w:t xml:space="preserve">        +publishEvent()</w:t>
+        <w:br/>
+        <w:t xml:space="preserve">        +getPublicEventBySlug()</w:t>
+        <w:br/>
+        <w:t xml:space="preserve">    }</w:t>
+        <w:br/>
+        <w:br/>
+        <w:t xml:space="preserve">    class GuestService {</w:t>
+        <w:br/>
+        <w:t xml:space="preserve">        +registerGuest()</w:t>
+        <w:br/>
+        <w:t xml:space="preserve">        +listGuestsByEvent()</w:t>
+        <w:br/>
+        <w:t xml:space="preserve">        +getGuestById()</w:t>
+        <w:br/>
+        <w:t xml:space="preserve">    }</w:t>
+        <w:br/>
+        <w:br/>
+        <w:t xml:space="preserve">    class VenueLocationService {</w:t>
+        <w:br/>
+        <w:t xml:space="preserve">        +saveVenueLocation()</w:t>
+        <w:br/>
+        <w:t xml:space="preserve">        +buildDirectionsUrl()</w:t>
+        <w:br/>
+        <w:t xml:space="preserve">        +mapPlaceToVenueFields()</w:t>
+        <w:br/>
+        <w:t xml:space="preserve">    }</w:t>
+        <w:br/>
+        <w:br/>
+        <w:t xml:space="preserve">    class CheckInService {</w:t>
+        <w:br/>
+        <w:t xml:space="preserve">        +checkInGuest()</w:t>
+        <w:br/>
+        <w:t xml:space="preserve">        +getAttendanceStatus()</w:t>
+        <w:br/>
+        <w:t xml:space="preserve">        +preventDuplicateCheckIn()</w:t>
+        <w:br/>
+        <w:t xml:space="preserve">    }</w:t>
+        <w:br/>
+        <w:br/>
+        <w:t xml:space="preserve">    class User {</w:t>
+        <w:br/>
+        <w:t xml:space="preserve">        +uuid id</w:t>
+        <w:br/>
+        <w:t xml:space="preserve">        +string email</w:t>
+        <w:br/>
+        <w:t xml:space="preserve">        +string name</w:t>
+        <w:br/>
+        <w:t xml:space="preserve">        +string role</w:t>
+        <w:br/>
+        <w:t xml:space="preserve">    }</w:t>
+        <w:br/>
+        <w:br/>
+        <w:t xml:space="preserve">    class Event {</w:t>
+        <w:br/>
+        <w:t xml:space="preserve">        +uuid id</w:t>
+        <w:br/>
+        <w:t xml:space="preserve">        +uuid organizerId</w:t>
+        <w:br/>
+        <w:t xml:space="preserve">        +string slug</w:t>
+        <w:br/>
+        <w:t xml:space="preserve">        +string title</w:t>
+        <w:br/>
+        <w:t xml:space="preserve">        +string status</w:t>
+        <w:br/>
+        <w:t xml:space="preserve">        +int capacity</w:t>
+        <w:br/>
+        <w:t xml:space="preserve">        +string placeId</w:t>
+        <w:br/>
+        <w:t xml:space="preserve">        +float latitude</w:t>
+        <w:br/>
+        <w:t xml:space="preserve">        +float longitude</w:t>
+        <w:br/>
+        <w:t xml:space="preserve">    }</w:t>
+        <w:br/>
+        <w:br/>
+        <w:t xml:space="preserve">    class Guest {</w:t>
+        <w:br/>
+        <w:t xml:space="preserve">        +uuid id</w:t>
+        <w:br/>
+        <w:t xml:space="preserve">        +uuid eventId</w:t>
+        <w:br/>
+        <w:t xml:space="preserve">        +string fullName</w:t>
+        <w:br/>
+        <w:t xml:space="preserve">        +string email</w:t>
+        <w:br/>
+        <w:t xml:space="preserve">        +string phone</w:t>
+        <w:br/>
+        <w:t xml:space="preserve">        +string tier</w:t>
+        <w:br/>
+        <w:t xml:space="preserve">        +string status</w:t>
+        <w:br/>
+        <w:t xml:space="preserve">        +datetime checkedInAt</w:t>
+        <w:br/>
+        <w:t xml:space="preserve">    }</w:t>
+        <w:br/>
+        <w:br/>
+        <w:t xml:space="preserve">    class AgendaItem {</w:t>
+        <w:br/>
+        <w:t xml:space="preserve">        +uuid id</w:t>
+        <w:br/>
+        <w:t xml:space="preserve">        +uuid eventId</w:t>
+        <w:br/>
+        <w:t xml:space="preserve">        +uuid speakerId</w:t>
+        <w:br/>
+        <w:t xml:space="preserve">        +string title</w:t>
+        <w:br/>
+        <w:t xml:space="preserve">        +datetime startTime</w:t>
+        <w:br/>
+        <w:t xml:space="preserve">        +datetime endTime</w:t>
+        <w:br/>
+        <w:t xml:space="preserve">    }</w:t>
+        <w:br/>
+        <w:br/>
+        <w:t xml:space="preserve">    class Speaker {</w:t>
+        <w:br/>
+        <w:t xml:space="preserve">        +uuid id</w:t>
+        <w:br/>
+        <w:t xml:space="preserve">        +uuid eventId</w:t>
+        <w:br/>
+        <w:t xml:space="preserve">        +string fullName</w:t>
+        <w:br/>
+        <w:t xml:space="preserve">        +string jobTitle</w:t>
+        <w:br/>
+        <w:t xml:space="preserve">        +string bio</w:t>
+        <w:br/>
+        <w:t xml:space="preserve">    }</w:t>
+        <w:br/>
+        <w:br/>
+        <w:t xml:space="preserve">    AuthUI --&gt; AuthService : uses</w:t>
+        <w:br/>
+        <w:t xml:space="preserve">    EventManagementUI --&gt; EventService : uses</w:t>
+        <w:br/>
+        <w:t xml:space="preserve">    EventManagementUI --&gt; GuestService : reads guests</w:t>
+        <w:br/>
+        <w:t xml:space="preserve">    PublicEventPage --&gt; EventService : loads event</w:t>
+        <w:br/>
+        <w:t xml:space="preserve">    PublicEventPage --&gt; VenueLocationService : gets map data</w:t>
+        <w:br/>
+        <w:t xml:space="preserve">    GuestRegistrationUI --&gt; GuestService : registers guest</w:t>
+        <w:br/>
+        <w:t xml:space="preserve">    GuestListUI --&gt; GuestService : lists guests</w:t>
+        <w:br/>
+        <w:t xml:space="preserve">    OfflineCheckInUI --&gt; CheckInService : checks in guest</w:t>
+        <w:br/>
+        <w:t xml:space="preserve">    CheckInService --&gt; GuestService : reads guest</w:t>
+        <w:br/>
+        <w:br/>
+        <w:t xml:space="preserve">    User "1" --&gt; "many" Event : creates</w:t>
+        <w:br/>
+        <w:t xml:space="preserve">    Event "1" --&gt; "many" Guest : contains</w:t>
+        <w:br/>
+        <w:t xml:space="preserve">    Event "1" --&gt; "many" AgendaItem : schedules</w:t>
+        <w:br/>
+        <w:t xml:space="preserve">    Event "1" --&gt; "many" Speaker : features</w:t>
+        <w:br/>
+        <w:t xml:space="preserve">    Speaker "0..1" --&gt; "many" AgendaItem : presents</w:t>
       </w:r>
     </w:p>
     <w:p>

</xml_diff>

<commit_message>
Embed Mermaid diagrams in markdown for GitHub rendering
</commit_message>
<xml_diff>
--- a/deliverables/RiziEvents-Technical-Documentation.docx
+++ b/deliverables/RiziEvents-Technical-Documentation.docx
@@ -566,6 +566,184 @@
     <w:p/>
     <w:p>
       <w:pPr>
+        <w:pStyle w:val="Heading3"/>
+      </w:pPr>
+      <w:r>
+        <w:t>Mermaid: System Architecture</w:t>
+      </w:r>
+    </w:p>
+    <w:p/>
+    <w:p>
+      <w:pPr>
+        <w:pStyle w:val="IntenseQuote"/>
+      </w:pPr>
+      <w:r>
+        <w:t>MERMAID</w:t>
+      </w:r>
+    </w:p>
+    <w:p>
+      <w:pPr>
+        <w:pStyle w:val="CodeBlock"/>
+      </w:pPr>
+      <w:r>
+        <w:t>flowchart LR</w:t>
+      </w:r>
+    </w:p>
+    <w:p>
+      <w:pPr>
+        <w:pStyle w:val="CodeBlock"/>
+      </w:pPr>
+      <w:r>
+        <w:t xml:space="preserve">    Guest["Guest User"] --&gt; Browser["Web Browser"]</w:t>
+      </w:r>
+    </w:p>
+    <w:p>
+      <w:pPr>
+        <w:pStyle w:val="CodeBlock"/>
+      </w:pPr>
+      <w:r>
+        <w:t xml:space="preserve">    Organizer["Organizer"] --&gt; Browser</w:t>
+      </w:r>
+    </w:p>
+    <w:p>
+      <w:pPr>
+        <w:pStyle w:val="CodeBlock"/>
+      </w:pPr>
+      <w:r>
+        <w:t xml:space="preserve"> </w:t>
+      </w:r>
+    </w:p>
+    <w:p>
+      <w:pPr>
+        <w:pStyle w:val="CodeBlock"/>
+      </w:pPr>
+      <w:r>
+        <w:t xml:space="preserve">    Browser --&gt; Vercel["Vercel / Next.js Web App"]</w:t>
+      </w:r>
+    </w:p>
+    <w:p>
+      <w:pPr>
+        <w:pStyle w:val="CodeBlock"/>
+      </w:pPr>
+      <w:r>
+        <w:t xml:space="preserve">    Vercel --&gt; Auth["Supabase Auth"]</w:t>
+      </w:r>
+    </w:p>
+    <w:p>
+      <w:pPr>
+        <w:pStyle w:val="CodeBlock"/>
+      </w:pPr>
+      <w:r>
+        <w:t xml:space="preserve">    Vercel --&gt; DB["Supabase Postgres"]</w:t>
+      </w:r>
+    </w:p>
+    <w:p>
+      <w:pPr>
+        <w:pStyle w:val="CodeBlock"/>
+      </w:pPr>
+      <w:r>
+        <w:t xml:space="preserve">    Vercel --&gt; Storage["Supabase Storage"]</w:t>
+      </w:r>
+    </w:p>
+    <w:p>
+      <w:pPr>
+        <w:pStyle w:val="CodeBlock"/>
+      </w:pPr>
+      <w:r>
+        <w:t xml:space="preserve">    Vercel --&gt; Maps["Google Maps API and Places SDK"]</w:t>
+      </w:r>
+    </w:p>
+    <w:p>
+      <w:pPr>
+        <w:pStyle w:val="CodeBlock"/>
+      </w:pPr>
+      <w:r>
+        <w:t xml:space="preserve"> </w:t>
+      </w:r>
+    </w:p>
+    <w:p>
+      <w:pPr>
+        <w:pStyle w:val="CodeBlock"/>
+      </w:pPr>
+      <w:r>
+        <w:t xml:space="preserve">    Auth --&gt; DB</w:t>
+      </w:r>
+    </w:p>
+    <w:p>
+      <w:pPr>
+        <w:pStyle w:val="CodeBlock"/>
+      </w:pPr>
+      <w:r>
+        <w:t xml:space="preserve">    DB --&gt; RLS["Row Level Security Policies"]</w:t>
+      </w:r>
+    </w:p>
+    <w:p>
+      <w:pPr>
+        <w:pStyle w:val="CodeBlock"/>
+      </w:pPr>
+      <w:r>
+        <w:t xml:space="preserve"> </w:t>
+      </w:r>
+    </w:p>
+    <w:p>
+      <w:pPr>
+        <w:pStyle w:val="CodeBlock"/>
+      </w:pPr>
+      <w:r>
+        <w:t xml:space="preserve">    subgraph Environments</w:t>
+      </w:r>
+    </w:p>
+    <w:p>
+      <w:pPr>
+        <w:pStyle w:val="CodeBlock"/>
+      </w:pPr>
+      <w:r>
+        <w:t xml:space="preserve">      Prod["Production: rizi.app"]</w:t>
+      </w:r>
+    </w:p>
+    <w:p>
+      <w:pPr>
+        <w:pStyle w:val="CodeBlock"/>
+      </w:pPr>
+      <w:r>
+        <w:t xml:space="preserve">      Stage["Staging: staging.rizi.app"]</w:t>
+      </w:r>
+    </w:p>
+    <w:p>
+      <w:pPr>
+        <w:pStyle w:val="CodeBlock"/>
+      </w:pPr>
+      <w:r>
+        <w:t xml:space="preserve">    end</w:t>
+      </w:r>
+    </w:p>
+    <w:p>
+      <w:pPr>
+        <w:pStyle w:val="CodeBlock"/>
+      </w:pPr>
+      <w:r>
+        <w:t xml:space="preserve"> </w:t>
+      </w:r>
+    </w:p>
+    <w:p>
+      <w:pPr>
+        <w:pStyle w:val="CodeBlock"/>
+      </w:pPr>
+      <w:r>
+        <w:t xml:space="preserve">    Prod -. deploy .-&gt; Vercel</w:t>
+      </w:r>
+    </w:p>
+    <w:p>
+      <w:pPr>
+        <w:pStyle w:val="CodeBlock"/>
+      </w:pPr>
+      <w:r>
+        <w:t xml:space="preserve">    Stage -. validate .-&gt; Vercel</w:t>
+      </w:r>
+    </w:p>
+    <w:p/>
+    <w:p>
+      <w:pPr>
         <w:pStyle w:val="Heading2"/>
       </w:pPr>
       <w:r>
@@ -769,6 +947,1072 @@
     <w:p/>
     <w:p>
       <w:pPr>
+        <w:pStyle w:val="Heading3"/>
+      </w:pPr>
+      <w:r>
+        <w:t>Mermaid: Class and Component Diagram</w:t>
+      </w:r>
+    </w:p>
+    <w:p/>
+    <w:p>
+      <w:pPr>
+        <w:pStyle w:val="IntenseQuote"/>
+      </w:pPr>
+      <w:r>
+        <w:t>MERMAID</w:t>
+      </w:r>
+    </w:p>
+    <w:p>
+      <w:pPr>
+        <w:pStyle w:val="CodeBlock"/>
+      </w:pPr>
+      <w:r>
+        <w:t>classDiagram</w:t>
+      </w:r>
+    </w:p>
+    <w:p>
+      <w:pPr>
+        <w:pStyle w:val="CodeBlock"/>
+      </w:pPr>
+      <w:r>
+        <w:t xml:space="preserve">    class AuthUI {</w:t>
+      </w:r>
+    </w:p>
+    <w:p>
+      <w:pPr>
+        <w:pStyle w:val="CodeBlock"/>
+      </w:pPr>
+      <w:r>
+        <w:t xml:space="preserve">        +renderLoginForm()</w:t>
+      </w:r>
+    </w:p>
+    <w:p>
+      <w:pPr>
+        <w:pStyle w:val="CodeBlock"/>
+      </w:pPr>
+      <w:r>
+        <w:t xml:space="preserve">        +renderRegisterForm()</w:t>
+      </w:r>
+    </w:p>
+    <w:p>
+      <w:pPr>
+        <w:pStyle w:val="CodeBlock"/>
+      </w:pPr>
+      <w:r>
+        <w:t xml:space="preserve">        +submitCredentials()</w:t>
+      </w:r>
+    </w:p>
+    <w:p>
+      <w:pPr>
+        <w:pStyle w:val="CodeBlock"/>
+      </w:pPr>
+      <w:r>
+        <w:t xml:space="preserve">    }</w:t>
+      </w:r>
+    </w:p>
+    <w:p>
+      <w:pPr>
+        <w:pStyle w:val="CodeBlock"/>
+      </w:pPr>
+      <w:r>
+        <w:t xml:space="preserve"> </w:t>
+      </w:r>
+    </w:p>
+    <w:p>
+      <w:pPr>
+        <w:pStyle w:val="CodeBlock"/>
+      </w:pPr>
+      <w:r>
+        <w:t xml:space="preserve">    class EventManagementUI {</w:t>
+      </w:r>
+    </w:p>
+    <w:p>
+      <w:pPr>
+        <w:pStyle w:val="CodeBlock"/>
+      </w:pPr>
+      <w:r>
+        <w:t xml:space="preserve">        +renderEventForm()</w:t>
+      </w:r>
+    </w:p>
+    <w:p>
+      <w:pPr>
+        <w:pStyle w:val="CodeBlock"/>
+      </w:pPr>
+      <w:r>
+        <w:t xml:space="preserve">        +saveDraft()</w:t>
+      </w:r>
+    </w:p>
+    <w:p>
+      <w:pPr>
+        <w:pStyle w:val="CodeBlock"/>
+      </w:pPr>
+      <w:r>
+        <w:t xml:space="preserve">        +publishEvent()</w:t>
+      </w:r>
+    </w:p>
+    <w:p>
+      <w:pPr>
+        <w:pStyle w:val="CodeBlock"/>
+      </w:pPr>
+      <w:r>
+        <w:t xml:space="preserve">        +viewGuestList()</w:t>
+      </w:r>
+    </w:p>
+    <w:p>
+      <w:pPr>
+        <w:pStyle w:val="CodeBlock"/>
+      </w:pPr>
+      <w:r>
+        <w:t xml:space="preserve">    }</w:t>
+      </w:r>
+    </w:p>
+    <w:p>
+      <w:pPr>
+        <w:pStyle w:val="CodeBlock"/>
+      </w:pPr>
+      <w:r>
+        <w:t xml:space="preserve"> </w:t>
+      </w:r>
+    </w:p>
+    <w:p>
+      <w:pPr>
+        <w:pStyle w:val="CodeBlock"/>
+      </w:pPr>
+      <w:r>
+        <w:t xml:space="preserve">    class PublicEventPage {</w:t>
+      </w:r>
+    </w:p>
+    <w:p>
+      <w:pPr>
+        <w:pStyle w:val="CodeBlock"/>
+      </w:pPr>
+      <w:r>
+        <w:t xml:space="preserve">        +loadEventBySlug()</w:t>
+      </w:r>
+    </w:p>
+    <w:p>
+      <w:pPr>
+        <w:pStyle w:val="CodeBlock"/>
+      </w:pPr>
+      <w:r>
+        <w:t xml:space="preserve">        +renderEventDetails()</w:t>
+      </w:r>
+    </w:p>
+    <w:p>
+      <w:pPr>
+        <w:pStyle w:val="CodeBlock"/>
+      </w:pPr>
+      <w:r>
+        <w:t xml:space="preserve">        +showVenueDirections()</w:t>
+      </w:r>
+    </w:p>
+    <w:p>
+      <w:pPr>
+        <w:pStyle w:val="CodeBlock"/>
+      </w:pPr>
+      <w:r>
+        <w:t xml:space="preserve">    }</w:t>
+      </w:r>
+    </w:p>
+    <w:p>
+      <w:pPr>
+        <w:pStyle w:val="CodeBlock"/>
+      </w:pPr>
+      <w:r>
+        <w:t xml:space="preserve"> </w:t>
+      </w:r>
+    </w:p>
+    <w:p>
+      <w:pPr>
+        <w:pStyle w:val="CodeBlock"/>
+      </w:pPr>
+      <w:r>
+        <w:t xml:space="preserve">    class GuestRegistrationUI {</w:t>
+      </w:r>
+    </w:p>
+    <w:p>
+      <w:pPr>
+        <w:pStyle w:val="CodeBlock"/>
+      </w:pPr>
+      <w:r>
+        <w:t xml:space="preserve">        +renderRegistrationForm()</w:t>
+      </w:r>
+    </w:p>
+    <w:p>
+      <w:pPr>
+        <w:pStyle w:val="CodeBlock"/>
+      </w:pPr>
+      <w:r>
+        <w:t xml:space="preserve">        +submitRegistration()</w:t>
+      </w:r>
+    </w:p>
+    <w:p>
+      <w:pPr>
+        <w:pStyle w:val="CodeBlock"/>
+      </w:pPr>
+      <w:r>
+        <w:t xml:space="preserve">        +showConfirmation()</w:t>
+      </w:r>
+    </w:p>
+    <w:p>
+      <w:pPr>
+        <w:pStyle w:val="CodeBlock"/>
+      </w:pPr>
+      <w:r>
+        <w:t xml:space="preserve">    }</w:t>
+      </w:r>
+    </w:p>
+    <w:p>
+      <w:pPr>
+        <w:pStyle w:val="CodeBlock"/>
+      </w:pPr>
+      <w:r>
+        <w:t xml:space="preserve"> </w:t>
+      </w:r>
+    </w:p>
+    <w:p>
+      <w:pPr>
+        <w:pStyle w:val="CodeBlock"/>
+      </w:pPr>
+      <w:r>
+        <w:t xml:space="preserve">    class GuestListUI {</w:t>
+      </w:r>
+    </w:p>
+    <w:p>
+      <w:pPr>
+        <w:pStyle w:val="CodeBlock"/>
+      </w:pPr>
+      <w:r>
+        <w:t xml:space="preserve">        +renderGuestList()</w:t>
+      </w:r>
+    </w:p>
+    <w:p>
+      <w:pPr>
+        <w:pStyle w:val="CodeBlock"/>
+      </w:pPr>
+      <w:r>
+        <w:t xml:space="preserve">        +filterGuests()</w:t>
+      </w:r>
+    </w:p>
+    <w:p>
+      <w:pPr>
+        <w:pStyle w:val="CodeBlock"/>
+      </w:pPr>
+      <w:r>
+        <w:t xml:space="preserve">        +openCheckInScreen()</w:t>
+      </w:r>
+    </w:p>
+    <w:p>
+      <w:pPr>
+        <w:pStyle w:val="CodeBlock"/>
+      </w:pPr>
+      <w:r>
+        <w:t xml:space="preserve">    }</w:t>
+      </w:r>
+    </w:p>
+    <w:p>
+      <w:pPr>
+        <w:pStyle w:val="CodeBlock"/>
+      </w:pPr>
+      <w:r>
+        <w:t xml:space="preserve"> </w:t>
+      </w:r>
+    </w:p>
+    <w:p>
+      <w:pPr>
+        <w:pStyle w:val="CodeBlock"/>
+      </w:pPr>
+      <w:r>
+        <w:t xml:space="preserve">    class OfflineCheckInUI {</w:t>
+      </w:r>
+    </w:p>
+    <w:p>
+      <w:pPr>
+        <w:pStyle w:val="CodeBlock"/>
+      </w:pPr>
+      <w:r>
+        <w:t xml:space="preserve">        +searchGuest()</w:t>
+      </w:r>
+    </w:p>
+    <w:p>
+      <w:pPr>
+        <w:pStyle w:val="CodeBlock"/>
+      </w:pPr>
+      <w:r>
+        <w:t xml:space="preserve">        +confirmCheckIn()</w:t>
+      </w:r>
+    </w:p>
+    <w:p>
+      <w:pPr>
+        <w:pStyle w:val="CodeBlock"/>
+      </w:pPr>
+      <w:r>
+        <w:t xml:space="preserve">        +showAttendanceStatus()</w:t>
+      </w:r>
+    </w:p>
+    <w:p>
+      <w:pPr>
+        <w:pStyle w:val="CodeBlock"/>
+      </w:pPr>
+      <w:r>
+        <w:t xml:space="preserve">    }</w:t>
+      </w:r>
+    </w:p>
+    <w:p>
+      <w:pPr>
+        <w:pStyle w:val="CodeBlock"/>
+      </w:pPr>
+      <w:r>
+        <w:t xml:space="preserve"> </w:t>
+      </w:r>
+    </w:p>
+    <w:p>
+      <w:pPr>
+        <w:pStyle w:val="CodeBlock"/>
+      </w:pPr>
+      <w:r>
+        <w:t xml:space="preserve">    class AuthService {</w:t>
+      </w:r>
+    </w:p>
+    <w:p>
+      <w:pPr>
+        <w:pStyle w:val="CodeBlock"/>
+      </w:pPr>
+      <w:r>
+        <w:t xml:space="preserve">        +registerOrganizer()</w:t>
+      </w:r>
+    </w:p>
+    <w:p>
+      <w:pPr>
+        <w:pStyle w:val="CodeBlock"/>
+      </w:pPr>
+      <w:r>
+        <w:t xml:space="preserve">        +loginOrganizer()</w:t>
+      </w:r>
+    </w:p>
+    <w:p>
+      <w:pPr>
+        <w:pStyle w:val="CodeBlock"/>
+      </w:pPr>
+      <w:r>
+        <w:t xml:space="preserve">        +getCurrentOrganizer()</w:t>
+      </w:r>
+    </w:p>
+    <w:p>
+      <w:pPr>
+        <w:pStyle w:val="CodeBlock"/>
+      </w:pPr>
+      <w:r>
+        <w:t xml:space="preserve">    }</w:t>
+      </w:r>
+    </w:p>
+    <w:p>
+      <w:pPr>
+        <w:pStyle w:val="CodeBlock"/>
+      </w:pPr>
+      <w:r>
+        <w:t xml:space="preserve"> </w:t>
+      </w:r>
+    </w:p>
+    <w:p>
+      <w:pPr>
+        <w:pStyle w:val="CodeBlock"/>
+      </w:pPr>
+      <w:r>
+        <w:t xml:space="preserve">    class EventService {</w:t>
+      </w:r>
+    </w:p>
+    <w:p>
+      <w:pPr>
+        <w:pStyle w:val="CodeBlock"/>
+      </w:pPr>
+      <w:r>
+        <w:t xml:space="preserve">        +createEvent()</w:t>
+      </w:r>
+    </w:p>
+    <w:p>
+      <w:pPr>
+        <w:pStyle w:val="CodeBlock"/>
+      </w:pPr>
+      <w:r>
+        <w:t xml:space="preserve">        +updateEvent()</w:t>
+      </w:r>
+    </w:p>
+    <w:p>
+      <w:pPr>
+        <w:pStyle w:val="CodeBlock"/>
+      </w:pPr>
+      <w:r>
+        <w:t xml:space="preserve">        +publishEvent()</w:t>
+      </w:r>
+    </w:p>
+    <w:p>
+      <w:pPr>
+        <w:pStyle w:val="CodeBlock"/>
+      </w:pPr>
+      <w:r>
+        <w:t xml:space="preserve">        +getPublicEventBySlug()</w:t>
+      </w:r>
+    </w:p>
+    <w:p>
+      <w:pPr>
+        <w:pStyle w:val="CodeBlock"/>
+      </w:pPr>
+      <w:r>
+        <w:t xml:space="preserve">    }</w:t>
+      </w:r>
+    </w:p>
+    <w:p>
+      <w:pPr>
+        <w:pStyle w:val="CodeBlock"/>
+      </w:pPr>
+      <w:r>
+        <w:t xml:space="preserve"> </w:t>
+      </w:r>
+    </w:p>
+    <w:p>
+      <w:pPr>
+        <w:pStyle w:val="CodeBlock"/>
+      </w:pPr>
+      <w:r>
+        <w:t xml:space="preserve">    class GuestService {</w:t>
+      </w:r>
+    </w:p>
+    <w:p>
+      <w:pPr>
+        <w:pStyle w:val="CodeBlock"/>
+      </w:pPr>
+      <w:r>
+        <w:t xml:space="preserve">        +registerGuest()</w:t>
+      </w:r>
+    </w:p>
+    <w:p>
+      <w:pPr>
+        <w:pStyle w:val="CodeBlock"/>
+      </w:pPr>
+      <w:r>
+        <w:t xml:space="preserve">        +listGuestsByEvent()</w:t>
+      </w:r>
+    </w:p>
+    <w:p>
+      <w:pPr>
+        <w:pStyle w:val="CodeBlock"/>
+      </w:pPr>
+      <w:r>
+        <w:t xml:space="preserve">        +getGuestById()</w:t>
+      </w:r>
+    </w:p>
+    <w:p>
+      <w:pPr>
+        <w:pStyle w:val="CodeBlock"/>
+      </w:pPr>
+      <w:r>
+        <w:t xml:space="preserve">    }</w:t>
+      </w:r>
+    </w:p>
+    <w:p>
+      <w:pPr>
+        <w:pStyle w:val="CodeBlock"/>
+      </w:pPr>
+      <w:r>
+        <w:t xml:space="preserve"> </w:t>
+      </w:r>
+    </w:p>
+    <w:p>
+      <w:pPr>
+        <w:pStyle w:val="CodeBlock"/>
+      </w:pPr>
+      <w:r>
+        <w:t xml:space="preserve">    class VenueLocationService {</w:t>
+      </w:r>
+    </w:p>
+    <w:p>
+      <w:pPr>
+        <w:pStyle w:val="CodeBlock"/>
+      </w:pPr>
+      <w:r>
+        <w:t xml:space="preserve">        +saveVenueLocation()</w:t>
+      </w:r>
+    </w:p>
+    <w:p>
+      <w:pPr>
+        <w:pStyle w:val="CodeBlock"/>
+      </w:pPr>
+      <w:r>
+        <w:t xml:space="preserve">        +buildDirectionsUrl()</w:t>
+      </w:r>
+    </w:p>
+    <w:p>
+      <w:pPr>
+        <w:pStyle w:val="CodeBlock"/>
+      </w:pPr>
+      <w:r>
+        <w:t xml:space="preserve">        +mapPlaceToVenueFields()</w:t>
+      </w:r>
+    </w:p>
+    <w:p>
+      <w:pPr>
+        <w:pStyle w:val="CodeBlock"/>
+      </w:pPr>
+      <w:r>
+        <w:t xml:space="preserve">    }</w:t>
+      </w:r>
+    </w:p>
+    <w:p>
+      <w:pPr>
+        <w:pStyle w:val="CodeBlock"/>
+      </w:pPr>
+      <w:r>
+        <w:t xml:space="preserve"> </w:t>
+      </w:r>
+    </w:p>
+    <w:p>
+      <w:pPr>
+        <w:pStyle w:val="CodeBlock"/>
+      </w:pPr>
+      <w:r>
+        <w:t xml:space="preserve">    class CheckInService {</w:t>
+      </w:r>
+    </w:p>
+    <w:p>
+      <w:pPr>
+        <w:pStyle w:val="CodeBlock"/>
+      </w:pPr>
+      <w:r>
+        <w:t xml:space="preserve">        +checkInGuest()</w:t>
+      </w:r>
+    </w:p>
+    <w:p>
+      <w:pPr>
+        <w:pStyle w:val="CodeBlock"/>
+      </w:pPr>
+      <w:r>
+        <w:t xml:space="preserve">        +getAttendanceStatus()</w:t>
+      </w:r>
+    </w:p>
+    <w:p>
+      <w:pPr>
+        <w:pStyle w:val="CodeBlock"/>
+      </w:pPr>
+      <w:r>
+        <w:t xml:space="preserve">        +preventDuplicateCheckIn()</w:t>
+      </w:r>
+    </w:p>
+    <w:p>
+      <w:pPr>
+        <w:pStyle w:val="CodeBlock"/>
+      </w:pPr>
+      <w:r>
+        <w:t xml:space="preserve">    }</w:t>
+      </w:r>
+    </w:p>
+    <w:p>
+      <w:pPr>
+        <w:pStyle w:val="CodeBlock"/>
+      </w:pPr>
+      <w:r>
+        <w:t xml:space="preserve"> </w:t>
+      </w:r>
+    </w:p>
+    <w:p>
+      <w:pPr>
+        <w:pStyle w:val="CodeBlock"/>
+      </w:pPr>
+      <w:r>
+        <w:t xml:space="preserve">    class User {</w:t>
+      </w:r>
+    </w:p>
+    <w:p>
+      <w:pPr>
+        <w:pStyle w:val="CodeBlock"/>
+      </w:pPr>
+      <w:r>
+        <w:t xml:space="preserve">        +uuid id</w:t>
+      </w:r>
+    </w:p>
+    <w:p>
+      <w:pPr>
+        <w:pStyle w:val="CodeBlock"/>
+      </w:pPr>
+      <w:r>
+        <w:t xml:space="preserve">        +string email</w:t>
+      </w:r>
+    </w:p>
+    <w:p>
+      <w:pPr>
+        <w:pStyle w:val="CodeBlock"/>
+      </w:pPr>
+      <w:r>
+        <w:t xml:space="preserve">        +string name</w:t>
+      </w:r>
+    </w:p>
+    <w:p>
+      <w:pPr>
+        <w:pStyle w:val="CodeBlock"/>
+      </w:pPr>
+      <w:r>
+        <w:t xml:space="preserve">        +string role</w:t>
+      </w:r>
+    </w:p>
+    <w:p>
+      <w:pPr>
+        <w:pStyle w:val="CodeBlock"/>
+      </w:pPr>
+      <w:r>
+        <w:t xml:space="preserve">    }</w:t>
+      </w:r>
+    </w:p>
+    <w:p>
+      <w:pPr>
+        <w:pStyle w:val="CodeBlock"/>
+      </w:pPr>
+      <w:r>
+        <w:t xml:space="preserve"> </w:t>
+      </w:r>
+    </w:p>
+    <w:p>
+      <w:pPr>
+        <w:pStyle w:val="CodeBlock"/>
+      </w:pPr>
+      <w:r>
+        <w:t xml:space="preserve">    class Event {</w:t>
+      </w:r>
+    </w:p>
+    <w:p>
+      <w:pPr>
+        <w:pStyle w:val="CodeBlock"/>
+      </w:pPr>
+      <w:r>
+        <w:t xml:space="preserve">        +uuid id</w:t>
+      </w:r>
+    </w:p>
+    <w:p>
+      <w:pPr>
+        <w:pStyle w:val="CodeBlock"/>
+      </w:pPr>
+      <w:r>
+        <w:t xml:space="preserve">        +uuid organizerId</w:t>
+      </w:r>
+    </w:p>
+    <w:p>
+      <w:pPr>
+        <w:pStyle w:val="CodeBlock"/>
+      </w:pPr>
+      <w:r>
+        <w:t xml:space="preserve">        +string slug</w:t>
+      </w:r>
+    </w:p>
+    <w:p>
+      <w:pPr>
+        <w:pStyle w:val="CodeBlock"/>
+      </w:pPr>
+      <w:r>
+        <w:t xml:space="preserve">        +string title</w:t>
+      </w:r>
+    </w:p>
+    <w:p>
+      <w:pPr>
+        <w:pStyle w:val="CodeBlock"/>
+      </w:pPr>
+      <w:r>
+        <w:t xml:space="preserve">        +string status</w:t>
+      </w:r>
+    </w:p>
+    <w:p>
+      <w:pPr>
+        <w:pStyle w:val="CodeBlock"/>
+      </w:pPr>
+      <w:r>
+        <w:t xml:space="preserve">        +int capacity</w:t>
+      </w:r>
+    </w:p>
+    <w:p>
+      <w:pPr>
+        <w:pStyle w:val="CodeBlock"/>
+      </w:pPr>
+      <w:r>
+        <w:t xml:space="preserve">        +string placeId</w:t>
+      </w:r>
+    </w:p>
+    <w:p>
+      <w:pPr>
+        <w:pStyle w:val="CodeBlock"/>
+      </w:pPr>
+      <w:r>
+        <w:t xml:space="preserve">        +float latitude</w:t>
+      </w:r>
+    </w:p>
+    <w:p>
+      <w:pPr>
+        <w:pStyle w:val="CodeBlock"/>
+      </w:pPr>
+      <w:r>
+        <w:t xml:space="preserve">        +float longitude</w:t>
+      </w:r>
+    </w:p>
+    <w:p>
+      <w:pPr>
+        <w:pStyle w:val="CodeBlock"/>
+      </w:pPr>
+      <w:r>
+        <w:t xml:space="preserve">    }</w:t>
+      </w:r>
+    </w:p>
+    <w:p>
+      <w:pPr>
+        <w:pStyle w:val="CodeBlock"/>
+      </w:pPr>
+      <w:r>
+        <w:t xml:space="preserve"> </w:t>
+      </w:r>
+    </w:p>
+    <w:p>
+      <w:pPr>
+        <w:pStyle w:val="CodeBlock"/>
+      </w:pPr>
+      <w:r>
+        <w:t xml:space="preserve">    class Guest {</w:t>
+      </w:r>
+    </w:p>
+    <w:p>
+      <w:pPr>
+        <w:pStyle w:val="CodeBlock"/>
+      </w:pPr>
+      <w:r>
+        <w:t xml:space="preserve">        +uuid id</w:t>
+      </w:r>
+    </w:p>
+    <w:p>
+      <w:pPr>
+        <w:pStyle w:val="CodeBlock"/>
+      </w:pPr>
+      <w:r>
+        <w:t xml:space="preserve">        +uuid eventId</w:t>
+      </w:r>
+    </w:p>
+    <w:p>
+      <w:pPr>
+        <w:pStyle w:val="CodeBlock"/>
+      </w:pPr>
+      <w:r>
+        <w:t xml:space="preserve">        +string fullName</w:t>
+      </w:r>
+    </w:p>
+    <w:p>
+      <w:pPr>
+        <w:pStyle w:val="CodeBlock"/>
+      </w:pPr>
+      <w:r>
+        <w:t xml:space="preserve">        +string email</w:t>
+      </w:r>
+    </w:p>
+    <w:p>
+      <w:pPr>
+        <w:pStyle w:val="CodeBlock"/>
+      </w:pPr>
+      <w:r>
+        <w:t xml:space="preserve">        +string phone</w:t>
+      </w:r>
+    </w:p>
+    <w:p>
+      <w:pPr>
+        <w:pStyle w:val="CodeBlock"/>
+      </w:pPr>
+      <w:r>
+        <w:t xml:space="preserve">        +string tier</w:t>
+      </w:r>
+    </w:p>
+    <w:p>
+      <w:pPr>
+        <w:pStyle w:val="CodeBlock"/>
+      </w:pPr>
+      <w:r>
+        <w:t xml:space="preserve">        +string status</w:t>
+      </w:r>
+    </w:p>
+    <w:p>
+      <w:pPr>
+        <w:pStyle w:val="CodeBlock"/>
+      </w:pPr>
+      <w:r>
+        <w:t xml:space="preserve">        +datetime checkedInAt</w:t>
+      </w:r>
+    </w:p>
+    <w:p>
+      <w:pPr>
+        <w:pStyle w:val="CodeBlock"/>
+      </w:pPr>
+      <w:r>
+        <w:t xml:space="preserve">    }</w:t>
+      </w:r>
+    </w:p>
+    <w:p>
+      <w:pPr>
+        <w:pStyle w:val="CodeBlock"/>
+      </w:pPr>
+      <w:r>
+        <w:t xml:space="preserve"> </w:t>
+      </w:r>
+    </w:p>
+    <w:p>
+      <w:pPr>
+        <w:pStyle w:val="CodeBlock"/>
+      </w:pPr>
+      <w:r>
+        <w:t xml:space="preserve">    class AgendaItem {</w:t>
+      </w:r>
+    </w:p>
+    <w:p>
+      <w:pPr>
+        <w:pStyle w:val="CodeBlock"/>
+      </w:pPr>
+      <w:r>
+        <w:t xml:space="preserve">        +uuid id</w:t>
+      </w:r>
+    </w:p>
+    <w:p>
+      <w:pPr>
+        <w:pStyle w:val="CodeBlock"/>
+      </w:pPr>
+      <w:r>
+        <w:t xml:space="preserve">        +uuid eventId</w:t>
+      </w:r>
+    </w:p>
+    <w:p>
+      <w:pPr>
+        <w:pStyle w:val="CodeBlock"/>
+      </w:pPr>
+      <w:r>
+        <w:t xml:space="preserve">        +uuid speakerId</w:t>
+      </w:r>
+    </w:p>
+    <w:p>
+      <w:pPr>
+        <w:pStyle w:val="CodeBlock"/>
+      </w:pPr>
+      <w:r>
+        <w:t xml:space="preserve">        +string title</w:t>
+      </w:r>
+    </w:p>
+    <w:p>
+      <w:pPr>
+        <w:pStyle w:val="CodeBlock"/>
+      </w:pPr>
+      <w:r>
+        <w:t xml:space="preserve">        +datetime startTime</w:t>
+      </w:r>
+    </w:p>
+    <w:p>
+      <w:pPr>
+        <w:pStyle w:val="CodeBlock"/>
+      </w:pPr>
+      <w:r>
+        <w:t xml:space="preserve">        +datetime endTime</w:t>
+      </w:r>
+    </w:p>
+    <w:p>
+      <w:pPr>
+        <w:pStyle w:val="CodeBlock"/>
+      </w:pPr>
+      <w:r>
+        <w:t xml:space="preserve">    }</w:t>
+      </w:r>
+    </w:p>
+    <w:p>
+      <w:pPr>
+        <w:pStyle w:val="CodeBlock"/>
+      </w:pPr>
+      <w:r>
+        <w:t xml:space="preserve"> </w:t>
+      </w:r>
+    </w:p>
+    <w:p>
+      <w:pPr>
+        <w:pStyle w:val="CodeBlock"/>
+      </w:pPr>
+      <w:r>
+        <w:t xml:space="preserve">    class Speaker {</w:t>
+      </w:r>
+    </w:p>
+    <w:p>
+      <w:pPr>
+        <w:pStyle w:val="CodeBlock"/>
+      </w:pPr>
+      <w:r>
+        <w:t xml:space="preserve">        +uuid id</w:t>
+      </w:r>
+    </w:p>
+    <w:p>
+      <w:pPr>
+        <w:pStyle w:val="CodeBlock"/>
+      </w:pPr>
+      <w:r>
+        <w:t xml:space="preserve">        +uuid eventId</w:t>
+      </w:r>
+    </w:p>
+    <w:p>
+      <w:pPr>
+        <w:pStyle w:val="CodeBlock"/>
+      </w:pPr>
+      <w:r>
+        <w:t xml:space="preserve">        +string fullName</w:t>
+      </w:r>
+    </w:p>
+    <w:p>
+      <w:pPr>
+        <w:pStyle w:val="CodeBlock"/>
+      </w:pPr>
+      <w:r>
+        <w:t xml:space="preserve">        +string jobTitle</w:t>
+      </w:r>
+    </w:p>
+    <w:p>
+      <w:pPr>
+        <w:pStyle w:val="CodeBlock"/>
+      </w:pPr>
+      <w:r>
+        <w:t xml:space="preserve">        +string bio</w:t>
+      </w:r>
+    </w:p>
+    <w:p>
+      <w:pPr>
+        <w:pStyle w:val="CodeBlock"/>
+      </w:pPr>
+      <w:r>
+        <w:t xml:space="preserve">    }</w:t>
+      </w:r>
+    </w:p>
+    <w:p>
+      <w:pPr>
+        <w:pStyle w:val="CodeBlock"/>
+      </w:pPr>
+      <w:r>
+        <w:t xml:space="preserve"> </w:t>
+      </w:r>
+    </w:p>
+    <w:p>
+      <w:pPr>
+        <w:pStyle w:val="CodeBlock"/>
+      </w:pPr>
+      <w:r>
+        <w:t xml:space="preserve">    AuthUI --&gt; AuthService : uses</w:t>
+      </w:r>
+    </w:p>
+    <w:p>
+      <w:pPr>
+        <w:pStyle w:val="CodeBlock"/>
+      </w:pPr>
+      <w:r>
+        <w:t xml:space="preserve">    EventManagementUI --&gt; EventService : uses</w:t>
+      </w:r>
+    </w:p>
+    <w:p>
+      <w:pPr>
+        <w:pStyle w:val="CodeBlock"/>
+      </w:pPr>
+      <w:r>
+        <w:t xml:space="preserve">    EventManagementUI --&gt; GuestService : reads guests</w:t>
+      </w:r>
+    </w:p>
+    <w:p>
+      <w:pPr>
+        <w:pStyle w:val="CodeBlock"/>
+      </w:pPr>
+      <w:r>
+        <w:t xml:space="preserve">    PublicEventPage --&gt; EventService : loads event</w:t>
+      </w:r>
+    </w:p>
+    <w:p>
+      <w:pPr>
+        <w:pStyle w:val="CodeBlock"/>
+      </w:pPr>
+      <w:r>
+        <w:t xml:space="preserve">    PublicEventPage --&gt; VenueLocationService : gets map data</w:t>
+      </w:r>
+    </w:p>
+    <w:p>
+      <w:pPr>
+        <w:pStyle w:val="CodeBlock"/>
+      </w:pPr>
+      <w:r>
+        <w:t xml:space="preserve">    GuestRegistrationUI --&gt; GuestService : registers guest</w:t>
+      </w:r>
+    </w:p>
+    <w:p>
+      <w:pPr>
+        <w:pStyle w:val="CodeBlock"/>
+      </w:pPr>
+      <w:r>
+        <w:t xml:space="preserve">    GuestListUI --&gt; GuestService : lists guests</w:t>
+      </w:r>
+    </w:p>
+    <w:p>
+      <w:pPr>
+        <w:pStyle w:val="CodeBlock"/>
+      </w:pPr>
+      <w:r>
+        <w:t xml:space="preserve">    OfflineCheckInUI --&gt; CheckInService : checks in guest</w:t>
+      </w:r>
+    </w:p>
+    <w:p>
+      <w:pPr>
+        <w:pStyle w:val="CodeBlock"/>
+      </w:pPr>
+      <w:r>
+        <w:t xml:space="preserve">    CheckInService --&gt; GuestService : reads guest</w:t>
+      </w:r>
+    </w:p>
+    <w:p>
+      <w:pPr>
+        <w:pStyle w:val="CodeBlock"/>
+      </w:pPr>
+      <w:r>
+        <w:t xml:space="preserve"> </w:t>
+      </w:r>
+    </w:p>
+    <w:p>
+      <w:pPr>
+        <w:pStyle w:val="CodeBlock"/>
+      </w:pPr>
+      <w:r>
+        <w:t xml:space="preserve">    User "1" --&gt; "many" Event : creates</w:t>
+      </w:r>
+    </w:p>
+    <w:p>
+      <w:pPr>
+        <w:pStyle w:val="CodeBlock"/>
+      </w:pPr>
+      <w:r>
+        <w:t xml:space="preserve">    Event "1" --&gt; "many" Guest : contains</w:t>
+      </w:r>
+    </w:p>
+    <w:p>
+      <w:pPr>
+        <w:pStyle w:val="CodeBlock"/>
+      </w:pPr>
+      <w:r>
+        <w:t xml:space="preserve">    Event "1" --&gt; "many" AgendaItem : schedules</w:t>
+      </w:r>
+    </w:p>
+    <w:p>
+      <w:pPr>
+        <w:pStyle w:val="CodeBlock"/>
+      </w:pPr>
+      <w:r>
+        <w:t xml:space="preserve">    Event "1" --&gt; "many" Speaker : features</w:t>
+      </w:r>
+    </w:p>
+    <w:p>
+      <w:pPr>
+        <w:pStyle w:val="CodeBlock"/>
+      </w:pPr>
+      <w:r>
+        <w:t xml:space="preserve">    Speaker "0..1" --&gt; "many" AgendaItem : presents</w:t>
+      </w:r>
+    </w:p>
+    <w:p/>
+    <w:p>
+      <w:pPr>
         <w:pStyle w:val="Heading2"/>
       </w:pPr>
       <w:r>
@@ -909,6 +2153,536 @@
     <w:p/>
     <w:p>
       <w:pPr>
+        <w:pStyle w:val="Heading3"/>
+      </w:pPr>
+      <w:r>
+        <w:t>Mermaid: Database ER Diagram</w:t>
+      </w:r>
+    </w:p>
+    <w:p/>
+    <w:p>
+      <w:pPr>
+        <w:pStyle w:val="IntenseQuote"/>
+      </w:pPr>
+      <w:r>
+        <w:t>MERMAID</w:t>
+      </w:r>
+    </w:p>
+    <w:p>
+      <w:pPr>
+        <w:pStyle w:val="CodeBlock"/>
+      </w:pPr>
+      <w:r>
+        <w:t>erDiagram</w:t>
+      </w:r>
+    </w:p>
+    <w:p>
+      <w:pPr>
+        <w:pStyle w:val="CodeBlock"/>
+      </w:pPr>
+      <w:r>
+        <w:t xml:space="preserve">    USERS ||--o{ EVENTS : creates</w:t>
+      </w:r>
+    </w:p>
+    <w:p>
+      <w:pPr>
+        <w:pStyle w:val="CodeBlock"/>
+      </w:pPr>
+      <w:r>
+        <w:t xml:space="preserve">    EVENTS ||--o{ GUESTS : registers</w:t>
+      </w:r>
+    </w:p>
+    <w:p>
+      <w:pPr>
+        <w:pStyle w:val="CodeBlock"/>
+      </w:pPr>
+      <w:r>
+        <w:t xml:space="preserve">    EVENTS ||--o{ AGENDA_ITEMS : includes</w:t>
+      </w:r>
+    </w:p>
+    <w:p>
+      <w:pPr>
+        <w:pStyle w:val="CodeBlock"/>
+      </w:pPr>
+      <w:r>
+        <w:t xml:space="preserve">    EVENTS ||--o{ SPEAKERS : features</w:t>
+      </w:r>
+    </w:p>
+    <w:p>
+      <w:pPr>
+        <w:pStyle w:val="CodeBlock"/>
+      </w:pPr>
+      <w:r>
+        <w:t xml:space="preserve">    SPEAKERS o|--o{ AGENDA_ITEMS : may_present</w:t>
+      </w:r>
+    </w:p>
+    <w:p>
+      <w:pPr>
+        <w:pStyle w:val="CodeBlock"/>
+      </w:pPr>
+      <w:r>
+        <w:t xml:space="preserve"> </w:t>
+      </w:r>
+    </w:p>
+    <w:p>
+      <w:pPr>
+        <w:pStyle w:val="CodeBlock"/>
+      </w:pPr>
+      <w:r>
+        <w:t xml:space="preserve">    USERS {</w:t>
+      </w:r>
+    </w:p>
+    <w:p>
+      <w:pPr>
+        <w:pStyle w:val="CodeBlock"/>
+      </w:pPr>
+      <w:r>
+        <w:t xml:space="preserve">        uuid id PK</w:t>
+      </w:r>
+    </w:p>
+    <w:p>
+      <w:pPr>
+        <w:pStyle w:val="CodeBlock"/>
+      </w:pPr>
+      <w:r>
+        <w:t xml:space="preserve">        string email</w:t>
+      </w:r>
+    </w:p>
+    <w:p>
+      <w:pPr>
+        <w:pStyle w:val="CodeBlock"/>
+      </w:pPr>
+      <w:r>
+        <w:t xml:space="preserve">        string name</w:t>
+      </w:r>
+    </w:p>
+    <w:p>
+      <w:pPr>
+        <w:pStyle w:val="CodeBlock"/>
+      </w:pPr>
+      <w:r>
+        <w:t xml:space="preserve">        string role</w:t>
+      </w:r>
+    </w:p>
+    <w:p>
+      <w:pPr>
+        <w:pStyle w:val="CodeBlock"/>
+      </w:pPr>
+      <w:r>
+        <w:t xml:space="preserve">        datetime created_at</w:t>
+      </w:r>
+    </w:p>
+    <w:p>
+      <w:pPr>
+        <w:pStyle w:val="CodeBlock"/>
+      </w:pPr>
+      <w:r>
+        <w:t xml:space="preserve">    }</w:t>
+      </w:r>
+    </w:p>
+    <w:p>
+      <w:pPr>
+        <w:pStyle w:val="CodeBlock"/>
+      </w:pPr>
+      <w:r>
+        <w:t xml:space="preserve"> </w:t>
+      </w:r>
+    </w:p>
+    <w:p>
+      <w:pPr>
+        <w:pStyle w:val="CodeBlock"/>
+      </w:pPr>
+      <w:r>
+        <w:t xml:space="preserve">    EVENTS {</w:t>
+      </w:r>
+    </w:p>
+    <w:p>
+      <w:pPr>
+        <w:pStyle w:val="CodeBlock"/>
+      </w:pPr>
+      <w:r>
+        <w:t xml:space="preserve">        uuid id PK</w:t>
+      </w:r>
+    </w:p>
+    <w:p>
+      <w:pPr>
+        <w:pStyle w:val="CodeBlock"/>
+      </w:pPr>
+      <w:r>
+        <w:t xml:space="preserve">        uuid organizer_id FK</w:t>
+      </w:r>
+    </w:p>
+    <w:p>
+      <w:pPr>
+        <w:pStyle w:val="CodeBlock"/>
+      </w:pPr>
+      <w:r>
+        <w:t xml:space="preserve">        string slug</w:t>
+      </w:r>
+    </w:p>
+    <w:p>
+      <w:pPr>
+        <w:pStyle w:val="CodeBlock"/>
+      </w:pPr>
+      <w:r>
+        <w:t xml:space="preserve">        string title</w:t>
+      </w:r>
+    </w:p>
+    <w:p>
+      <w:pPr>
+        <w:pStyle w:val="CodeBlock"/>
+      </w:pPr>
+      <w:r>
+        <w:t xml:space="preserve">        string status</w:t>
+      </w:r>
+    </w:p>
+    <w:p>
+      <w:pPr>
+        <w:pStyle w:val="CodeBlock"/>
+      </w:pPr>
+      <w:r>
+        <w:t xml:space="preserve">        datetime start_date</w:t>
+      </w:r>
+    </w:p>
+    <w:p>
+      <w:pPr>
+        <w:pStyle w:val="CodeBlock"/>
+      </w:pPr>
+      <w:r>
+        <w:t xml:space="preserve">        datetime end_date</w:t>
+      </w:r>
+    </w:p>
+    <w:p>
+      <w:pPr>
+        <w:pStyle w:val="CodeBlock"/>
+      </w:pPr>
+      <w:r>
+        <w:t xml:space="preserve">        string venue_name</w:t>
+      </w:r>
+    </w:p>
+    <w:p>
+      <w:pPr>
+        <w:pStyle w:val="CodeBlock"/>
+      </w:pPr>
+      <w:r>
+        <w:t xml:space="preserve">        string venue_address</w:t>
+      </w:r>
+    </w:p>
+    <w:p>
+      <w:pPr>
+        <w:pStyle w:val="CodeBlock"/>
+      </w:pPr>
+      <w:r>
+        <w:t xml:space="preserve">        string city</w:t>
+      </w:r>
+    </w:p>
+    <w:p>
+      <w:pPr>
+        <w:pStyle w:val="CodeBlock"/>
+      </w:pPr>
+      <w:r>
+        <w:t xml:space="preserve">        string place_id</w:t>
+      </w:r>
+    </w:p>
+    <w:p>
+      <w:pPr>
+        <w:pStyle w:val="CodeBlock"/>
+      </w:pPr>
+      <w:r>
+        <w:t xml:space="preserve">        float latitude</w:t>
+      </w:r>
+    </w:p>
+    <w:p>
+      <w:pPr>
+        <w:pStyle w:val="CodeBlock"/>
+      </w:pPr>
+      <w:r>
+        <w:t xml:space="preserve">        float longitude</w:t>
+      </w:r>
+    </w:p>
+    <w:p>
+      <w:pPr>
+        <w:pStyle w:val="CodeBlock"/>
+      </w:pPr>
+      <w:r>
+        <w:t xml:space="preserve">        int capacity</w:t>
+      </w:r>
+    </w:p>
+    <w:p>
+      <w:pPr>
+        <w:pStyle w:val="CodeBlock"/>
+      </w:pPr>
+      <w:r>
+        <w:t xml:space="preserve">        json brand_config</w:t>
+      </w:r>
+    </w:p>
+    <w:p>
+      <w:pPr>
+        <w:pStyle w:val="CodeBlock"/>
+      </w:pPr>
+      <w:r>
+        <w:t xml:space="preserve">        datetime created_at</w:t>
+      </w:r>
+    </w:p>
+    <w:p>
+      <w:pPr>
+        <w:pStyle w:val="CodeBlock"/>
+      </w:pPr>
+      <w:r>
+        <w:t xml:space="preserve">    }</w:t>
+      </w:r>
+    </w:p>
+    <w:p>
+      <w:pPr>
+        <w:pStyle w:val="CodeBlock"/>
+      </w:pPr>
+      <w:r>
+        <w:t xml:space="preserve"> </w:t>
+      </w:r>
+    </w:p>
+    <w:p>
+      <w:pPr>
+        <w:pStyle w:val="CodeBlock"/>
+      </w:pPr>
+      <w:r>
+        <w:t xml:space="preserve">    GUESTS {</w:t>
+      </w:r>
+    </w:p>
+    <w:p>
+      <w:pPr>
+        <w:pStyle w:val="CodeBlock"/>
+      </w:pPr>
+      <w:r>
+        <w:t xml:space="preserve">        uuid id PK</w:t>
+      </w:r>
+    </w:p>
+    <w:p>
+      <w:pPr>
+        <w:pStyle w:val="CodeBlock"/>
+      </w:pPr>
+      <w:r>
+        <w:t xml:space="preserve">        uuid event_id FK</w:t>
+      </w:r>
+    </w:p>
+    <w:p>
+      <w:pPr>
+        <w:pStyle w:val="CodeBlock"/>
+      </w:pPr>
+      <w:r>
+        <w:t xml:space="preserve">        string full_name</w:t>
+      </w:r>
+    </w:p>
+    <w:p>
+      <w:pPr>
+        <w:pStyle w:val="CodeBlock"/>
+      </w:pPr>
+      <w:r>
+        <w:t xml:space="preserve">        string email</w:t>
+      </w:r>
+    </w:p>
+    <w:p>
+      <w:pPr>
+        <w:pStyle w:val="CodeBlock"/>
+      </w:pPr>
+      <w:r>
+        <w:t xml:space="preserve">        string phone</w:t>
+      </w:r>
+    </w:p>
+    <w:p>
+      <w:pPr>
+        <w:pStyle w:val="CodeBlock"/>
+      </w:pPr>
+      <w:r>
+        <w:t xml:space="preserve">        string tier</w:t>
+      </w:r>
+    </w:p>
+    <w:p>
+      <w:pPr>
+        <w:pStyle w:val="CodeBlock"/>
+      </w:pPr>
+      <w:r>
+        <w:t xml:space="preserve">        string status</w:t>
+      </w:r>
+    </w:p>
+    <w:p>
+      <w:pPr>
+        <w:pStyle w:val="CodeBlock"/>
+      </w:pPr>
+      <w:r>
+        <w:t xml:space="preserve">        datetime checked_in_at</w:t>
+      </w:r>
+    </w:p>
+    <w:p>
+      <w:pPr>
+        <w:pStyle w:val="CodeBlock"/>
+      </w:pPr>
+      <w:r>
+        <w:t xml:space="preserve">        datetime created_at</w:t>
+      </w:r>
+    </w:p>
+    <w:p>
+      <w:pPr>
+        <w:pStyle w:val="CodeBlock"/>
+      </w:pPr>
+      <w:r>
+        <w:t xml:space="preserve">    }</w:t>
+      </w:r>
+    </w:p>
+    <w:p>
+      <w:pPr>
+        <w:pStyle w:val="CodeBlock"/>
+      </w:pPr>
+      <w:r>
+        <w:t xml:space="preserve"> </w:t>
+      </w:r>
+    </w:p>
+    <w:p>
+      <w:pPr>
+        <w:pStyle w:val="CodeBlock"/>
+      </w:pPr>
+      <w:r>
+        <w:t xml:space="preserve">    AGENDA_ITEMS {</w:t>
+      </w:r>
+    </w:p>
+    <w:p>
+      <w:pPr>
+        <w:pStyle w:val="CodeBlock"/>
+      </w:pPr>
+      <w:r>
+        <w:t xml:space="preserve">        uuid id PK</w:t>
+      </w:r>
+    </w:p>
+    <w:p>
+      <w:pPr>
+        <w:pStyle w:val="CodeBlock"/>
+      </w:pPr>
+      <w:r>
+        <w:t xml:space="preserve">        uuid event_id FK</w:t>
+      </w:r>
+    </w:p>
+    <w:p>
+      <w:pPr>
+        <w:pStyle w:val="CodeBlock"/>
+      </w:pPr>
+      <w:r>
+        <w:t xml:space="preserve">        uuid speaker_id FK</w:t>
+      </w:r>
+    </w:p>
+    <w:p>
+      <w:pPr>
+        <w:pStyle w:val="CodeBlock"/>
+      </w:pPr>
+      <w:r>
+        <w:t xml:space="preserve">        string title</w:t>
+      </w:r>
+    </w:p>
+    <w:p>
+      <w:pPr>
+        <w:pStyle w:val="CodeBlock"/>
+      </w:pPr>
+      <w:r>
+        <w:t xml:space="preserve">        string item_type</w:t>
+      </w:r>
+    </w:p>
+    <w:p>
+      <w:pPr>
+        <w:pStyle w:val="CodeBlock"/>
+      </w:pPr>
+      <w:r>
+        <w:t xml:space="preserve">        datetime start_time</w:t>
+      </w:r>
+    </w:p>
+    <w:p>
+      <w:pPr>
+        <w:pStyle w:val="CodeBlock"/>
+      </w:pPr>
+      <w:r>
+        <w:t xml:space="preserve">        datetime end_time</w:t>
+      </w:r>
+    </w:p>
+    <w:p>
+      <w:pPr>
+        <w:pStyle w:val="CodeBlock"/>
+      </w:pPr>
+      <w:r>
+        <w:t xml:space="preserve">        string location_name</w:t>
+      </w:r>
+    </w:p>
+    <w:p>
+      <w:pPr>
+        <w:pStyle w:val="CodeBlock"/>
+      </w:pPr>
+      <w:r>
+        <w:t xml:space="preserve">    }</w:t>
+      </w:r>
+    </w:p>
+    <w:p>
+      <w:pPr>
+        <w:pStyle w:val="CodeBlock"/>
+      </w:pPr>
+      <w:r>
+        <w:t xml:space="preserve"> </w:t>
+      </w:r>
+    </w:p>
+    <w:p>
+      <w:pPr>
+        <w:pStyle w:val="CodeBlock"/>
+      </w:pPr>
+      <w:r>
+        <w:t xml:space="preserve">    SPEAKERS {</w:t>
+      </w:r>
+    </w:p>
+    <w:p>
+      <w:pPr>
+        <w:pStyle w:val="CodeBlock"/>
+      </w:pPr>
+      <w:r>
+        <w:t xml:space="preserve">        uuid id PK</w:t>
+      </w:r>
+    </w:p>
+    <w:p>
+      <w:pPr>
+        <w:pStyle w:val="CodeBlock"/>
+      </w:pPr>
+      <w:r>
+        <w:t xml:space="preserve">        uuid event_id FK</w:t>
+      </w:r>
+    </w:p>
+    <w:p>
+      <w:pPr>
+        <w:pStyle w:val="CodeBlock"/>
+      </w:pPr>
+      <w:r>
+        <w:t xml:space="preserve">        string full_name</w:t>
+      </w:r>
+    </w:p>
+    <w:p>
+      <w:pPr>
+        <w:pStyle w:val="CodeBlock"/>
+      </w:pPr>
+      <w:r>
+        <w:t xml:space="preserve">        string job_title</w:t>
+      </w:r>
+    </w:p>
+    <w:p>
+      <w:pPr>
+        <w:pStyle w:val="CodeBlock"/>
+      </w:pPr>
+      <w:r>
+        <w:t xml:space="preserve">        string bio</w:t>
+      </w:r>
+    </w:p>
+    <w:p>
+      <w:pPr>
+        <w:pStyle w:val="CodeBlock"/>
+      </w:pPr>
+      <w:r>
+        <w:t xml:space="preserve">    }</w:t>
+      </w:r>
+    </w:p>
+    <w:p/>
+    <w:p>
+      <w:pPr>
         <w:pStyle w:val="Heading2"/>
       </w:pPr>
       <w:r>
@@ -978,6 +2752,492 @@
       </w:pPr>
       <w:r>
         <w:t>Organizer performs offline/manual check-in.</w:t>
+      </w:r>
+    </w:p>
+    <w:p/>
+    <w:p>
+      <w:pPr>
+        <w:pStyle w:val="Heading3"/>
+      </w:pPr>
+      <w:r>
+        <w:t>Mermaid: Create and Publish Event</w:t>
+      </w:r>
+    </w:p>
+    <w:p/>
+    <w:p>
+      <w:pPr>
+        <w:pStyle w:val="IntenseQuote"/>
+      </w:pPr>
+      <w:r>
+        <w:t>MERMAID</w:t>
+      </w:r>
+    </w:p>
+    <w:p>
+      <w:pPr>
+        <w:pStyle w:val="CodeBlock"/>
+      </w:pPr>
+      <w:r>
+        <w:t>sequenceDiagram</w:t>
+      </w:r>
+    </w:p>
+    <w:p>
+      <w:pPr>
+        <w:pStyle w:val="CodeBlock"/>
+      </w:pPr>
+      <w:r>
+        <w:t xml:space="preserve">    actor Organizer</w:t>
+      </w:r>
+    </w:p>
+    <w:p>
+      <w:pPr>
+        <w:pStyle w:val="CodeBlock"/>
+      </w:pPr>
+      <w:r>
+        <w:t xml:space="preserve">    participant UI as Next.js Web App</w:t>
+      </w:r>
+    </w:p>
+    <w:p>
+      <w:pPr>
+        <w:pStyle w:val="CodeBlock"/>
+      </w:pPr>
+      <w:r>
+        <w:t xml:space="preserve">    participant Auth as Supabase Auth</w:t>
+      </w:r>
+    </w:p>
+    <w:p>
+      <w:pPr>
+        <w:pStyle w:val="CodeBlock"/>
+      </w:pPr>
+      <w:r>
+        <w:t xml:space="preserve">    participant API as EventService</w:t>
+      </w:r>
+    </w:p>
+    <w:p>
+      <w:pPr>
+        <w:pStyle w:val="CodeBlock"/>
+      </w:pPr>
+      <w:r>
+        <w:t xml:space="preserve">    participant DB as Supabase Postgres</w:t>
+      </w:r>
+    </w:p>
+    <w:p>
+      <w:pPr>
+        <w:pStyle w:val="CodeBlock"/>
+      </w:pPr>
+      <w:r>
+        <w:t xml:space="preserve"> </w:t>
+      </w:r>
+    </w:p>
+    <w:p>
+      <w:pPr>
+        <w:pStyle w:val="CodeBlock"/>
+      </w:pPr>
+      <w:r>
+        <w:t xml:space="preserve">    Organizer-&gt;&gt;UI: Sign in with email and password</w:t>
+      </w:r>
+    </w:p>
+    <w:p>
+      <w:pPr>
+        <w:pStyle w:val="CodeBlock"/>
+      </w:pPr>
+      <w:r>
+        <w:t xml:space="preserve">    UI-&gt;&gt;Auth: Authenticate organizer</w:t>
+      </w:r>
+    </w:p>
+    <w:p>
+      <w:pPr>
+        <w:pStyle w:val="CodeBlock"/>
+      </w:pPr>
+      <w:r>
+        <w:t xml:space="preserve">    Auth--&gt;&gt;UI: Session returned</w:t>
+      </w:r>
+    </w:p>
+    <w:p>
+      <w:pPr>
+        <w:pStyle w:val="CodeBlock"/>
+      </w:pPr>
+      <w:r>
+        <w:t xml:space="preserve">    Organizer-&gt;&gt;UI: Submit create event form</w:t>
+      </w:r>
+    </w:p>
+    <w:p>
+      <w:pPr>
+        <w:pStyle w:val="CodeBlock"/>
+      </w:pPr>
+      <w:r>
+        <w:t xml:space="preserve">    UI-&gt;&gt;API: POST /api/events</w:t>
+      </w:r>
+    </w:p>
+    <w:p>
+      <w:pPr>
+        <w:pStyle w:val="CodeBlock"/>
+      </w:pPr>
+      <w:r>
+        <w:t xml:space="preserve">    API-&gt;&gt;DB: Insert draft event and generated slug</w:t>
+      </w:r>
+    </w:p>
+    <w:p>
+      <w:pPr>
+        <w:pStyle w:val="CodeBlock"/>
+      </w:pPr>
+      <w:r>
+        <w:t xml:space="preserve">    DB--&gt;&gt;API: Event created</w:t>
+      </w:r>
+    </w:p>
+    <w:p>
+      <w:pPr>
+        <w:pStyle w:val="CodeBlock"/>
+      </w:pPr>
+      <w:r>
+        <w:t xml:space="preserve">    API--&gt;&gt;UI: Draft event response</w:t>
+      </w:r>
+    </w:p>
+    <w:p>
+      <w:pPr>
+        <w:pStyle w:val="CodeBlock"/>
+      </w:pPr>
+      <w:r>
+        <w:t xml:space="preserve">    Organizer-&gt;&gt;UI: Publish event</w:t>
+      </w:r>
+    </w:p>
+    <w:p>
+      <w:pPr>
+        <w:pStyle w:val="CodeBlock"/>
+      </w:pPr>
+      <w:r>
+        <w:t xml:space="preserve">    UI-&gt;&gt;API: POST /api/events/{eventId}/publish</w:t>
+      </w:r>
+    </w:p>
+    <w:p>
+      <w:pPr>
+        <w:pStyle w:val="CodeBlock"/>
+      </w:pPr>
+      <w:r>
+        <w:t xml:space="preserve">    API-&gt;&gt;DB: Update event status to published</w:t>
+      </w:r>
+    </w:p>
+    <w:p>
+      <w:pPr>
+        <w:pStyle w:val="CodeBlock"/>
+      </w:pPr>
+      <w:r>
+        <w:t xml:space="preserve">    DB--&gt;&gt;API: Published event</w:t>
+      </w:r>
+    </w:p>
+    <w:p>
+      <w:pPr>
+        <w:pStyle w:val="CodeBlock"/>
+      </w:pPr>
+      <w:r>
+        <w:t xml:space="preserve">    API--&gt;&gt;UI: Public URL returned</w:t>
+      </w:r>
+    </w:p>
+    <w:p/>
+    <w:p>
+      <w:pPr>
+        <w:pStyle w:val="Heading3"/>
+      </w:pPr>
+      <w:r>
+        <w:t>Mermaid: Guest Registration</w:t>
+      </w:r>
+    </w:p>
+    <w:p/>
+    <w:p>
+      <w:pPr>
+        <w:pStyle w:val="IntenseQuote"/>
+      </w:pPr>
+      <w:r>
+        <w:t>MERMAID</w:t>
+      </w:r>
+    </w:p>
+    <w:p>
+      <w:pPr>
+        <w:pStyle w:val="CodeBlock"/>
+      </w:pPr>
+      <w:r>
+        <w:t>sequenceDiagram</w:t>
+      </w:r>
+    </w:p>
+    <w:p>
+      <w:pPr>
+        <w:pStyle w:val="CodeBlock"/>
+      </w:pPr>
+      <w:r>
+        <w:t xml:space="preserve">    actor Guest</w:t>
+      </w:r>
+    </w:p>
+    <w:p>
+      <w:pPr>
+        <w:pStyle w:val="CodeBlock"/>
+      </w:pPr>
+      <w:r>
+        <w:t xml:space="preserve">    participant UI as Public Event Page</w:t>
+      </w:r>
+    </w:p>
+    <w:p>
+      <w:pPr>
+        <w:pStyle w:val="CodeBlock"/>
+      </w:pPr>
+      <w:r>
+        <w:t xml:space="preserve">    participant API as GuestService</w:t>
+      </w:r>
+    </w:p>
+    <w:p>
+      <w:pPr>
+        <w:pStyle w:val="CodeBlock"/>
+      </w:pPr>
+      <w:r>
+        <w:t xml:space="preserve">    participant DB as Supabase Postgres</w:t>
+      </w:r>
+    </w:p>
+    <w:p>
+      <w:pPr>
+        <w:pStyle w:val="CodeBlock"/>
+      </w:pPr>
+      <w:r>
+        <w:t xml:space="preserve"> </w:t>
+      </w:r>
+    </w:p>
+    <w:p>
+      <w:pPr>
+        <w:pStyle w:val="CodeBlock"/>
+      </w:pPr>
+      <w:r>
+        <w:t xml:space="preserve">    Guest-&gt;&gt;UI: Open /e/{slug}</w:t>
+      </w:r>
+    </w:p>
+    <w:p>
+      <w:pPr>
+        <w:pStyle w:val="CodeBlock"/>
+      </w:pPr>
+      <w:r>
+        <w:t xml:space="preserve">    UI-&gt;&gt;API: GET /api/public/events/{slug}</w:t>
+      </w:r>
+    </w:p>
+    <w:p>
+      <w:pPr>
+        <w:pStyle w:val="CodeBlock"/>
+      </w:pPr>
+      <w:r>
+        <w:t xml:space="preserve">    API-&gt;&gt;DB: Read published event by slug</w:t>
+      </w:r>
+    </w:p>
+    <w:p>
+      <w:pPr>
+        <w:pStyle w:val="CodeBlock"/>
+      </w:pPr>
+      <w:r>
+        <w:t xml:space="preserve">    DB--&gt;&gt;API: Event details</w:t>
+      </w:r>
+    </w:p>
+    <w:p>
+      <w:pPr>
+        <w:pStyle w:val="CodeBlock"/>
+      </w:pPr>
+      <w:r>
+        <w:t xml:space="preserve">    API--&gt;&gt;UI: Event page payload</w:t>
+      </w:r>
+    </w:p>
+    <w:p>
+      <w:pPr>
+        <w:pStyle w:val="CodeBlock"/>
+      </w:pPr>
+      <w:r>
+        <w:t xml:space="preserve">    Guest-&gt;&gt;UI: Submit registration form</w:t>
+      </w:r>
+    </w:p>
+    <w:p>
+      <w:pPr>
+        <w:pStyle w:val="CodeBlock"/>
+      </w:pPr>
+      <w:r>
+        <w:t xml:space="preserve">    UI-&gt;&gt;API: POST /api/guests/register</w:t>
+      </w:r>
+    </w:p>
+    <w:p>
+      <w:pPr>
+        <w:pStyle w:val="CodeBlock"/>
+      </w:pPr>
+      <w:r>
+        <w:t xml:space="preserve">    API-&gt;&gt;DB: Validate event and create guest</w:t>
+      </w:r>
+    </w:p>
+    <w:p>
+      <w:pPr>
+        <w:pStyle w:val="CodeBlock"/>
+      </w:pPr>
+      <w:r>
+        <w:t xml:space="preserve">    DB--&gt;&gt;API: Guest record created</w:t>
+      </w:r>
+    </w:p>
+    <w:p>
+      <w:pPr>
+        <w:pStyle w:val="CodeBlock"/>
+      </w:pPr>
+      <w:r>
+        <w:t xml:space="preserve">    API--&gt;&gt;UI: Registration success response</w:t>
+      </w:r>
+    </w:p>
+    <w:p>
+      <w:pPr>
+        <w:pStyle w:val="CodeBlock"/>
+      </w:pPr>
+      <w:r>
+        <w:t xml:space="preserve">    UI--&gt;&gt;Guest: Confirmation shown</w:t>
+      </w:r>
+    </w:p>
+    <w:p/>
+    <w:p>
+      <w:pPr>
+        <w:pStyle w:val="Heading3"/>
+      </w:pPr>
+      <w:r>
+        <w:t>Mermaid: Offline Check-in</w:t>
+      </w:r>
+    </w:p>
+    <w:p/>
+    <w:p>
+      <w:pPr>
+        <w:pStyle w:val="IntenseQuote"/>
+      </w:pPr>
+      <w:r>
+        <w:t>MERMAID</w:t>
+      </w:r>
+    </w:p>
+    <w:p>
+      <w:pPr>
+        <w:pStyle w:val="CodeBlock"/>
+      </w:pPr>
+      <w:r>
+        <w:t>sequenceDiagram</w:t>
+      </w:r>
+    </w:p>
+    <w:p>
+      <w:pPr>
+        <w:pStyle w:val="CodeBlock"/>
+      </w:pPr>
+      <w:r>
+        <w:t xml:space="preserve">    actor Organizer</w:t>
+      </w:r>
+    </w:p>
+    <w:p>
+      <w:pPr>
+        <w:pStyle w:val="CodeBlock"/>
+      </w:pPr>
+      <w:r>
+        <w:t xml:space="preserve">    participant UI as Check-in Screen</w:t>
+      </w:r>
+    </w:p>
+    <w:p>
+      <w:pPr>
+        <w:pStyle w:val="CodeBlock"/>
+      </w:pPr>
+      <w:r>
+        <w:t xml:space="preserve">    participant API as CheckInService</w:t>
+      </w:r>
+    </w:p>
+    <w:p>
+      <w:pPr>
+        <w:pStyle w:val="CodeBlock"/>
+      </w:pPr>
+      <w:r>
+        <w:t xml:space="preserve">    participant DB as Supabase Postgres</w:t>
+      </w:r>
+    </w:p>
+    <w:p>
+      <w:pPr>
+        <w:pStyle w:val="CodeBlock"/>
+      </w:pPr>
+      <w:r>
+        <w:t xml:space="preserve"> </w:t>
+      </w:r>
+    </w:p>
+    <w:p>
+      <w:pPr>
+        <w:pStyle w:val="CodeBlock"/>
+      </w:pPr>
+      <w:r>
+        <w:t xml:space="preserve">    Organizer-&gt;&gt;UI: Open event guest list or check-in screen</w:t>
+      </w:r>
+    </w:p>
+    <w:p>
+      <w:pPr>
+        <w:pStyle w:val="CodeBlock"/>
+      </w:pPr>
+      <w:r>
+        <w:t xml:space="preserve">    UI-&gt;&gt;API: GET /api/events/{eventId}/guests</w:t>
+      </w:r>
+    </w:p>
+    <w:p>
+      <w:pPr>
+        <w:pStyle w:val="CodeBlock"/>
+      </w:pPr>
+      <w:r>
+        <w:t xml:space="preserve">    API-&gt;&gt;DB: Fetch registered guests</w:t>
+      </w:r>
+    </w:p>
+    <w:p>
+      <w:pPr>
+        <w:pStyle w:val="CodeBlock"/>
+      </w:pPr>
+      <w:r>
+        <w:t xml:space="preserve">    DB--&gt;&gt;API: Guest list</w:t>
+      </w:r>
+    </w:p>
+    <w:p>
+      <w:pPr>
+        <w:pStyle w:val="CodeBlock"/>
+      </w:pPr>
+      <w:r>
+        <w:t xml:space="preserve">    API--&gt;&gt;UI: Guest list response</w:t>
+      </w:r>
+    </w:p>
+    <w:p>
+      <w:pPr>
+        <w:pStyle w:val="CodeBlock"/>
+      </w:pPr>
+      <w:r>
+        <w:t xml:space="preserve">    Organizer-&gt;&gt;UI: Select guest and confirm check-in</w:t>
+      </w:r>
+    </w:p>
+    <w:p>
+      <w:pPr>
+        <w:pStyle w:val="CodeBlock"/>
+      </w:pPr>
+      <w:r>
+        <w:t xml:space="preserve">    UI-&gt;&gt;API: POST /api/guests/{guestId}/checkin</w:t>
+      </w:r>
+    </w:p>
+    <w:p>
+      <w:pPr>
+        <w:pStyle w:val="CodeBlock"/>
+      </w:pPr>
+      <w:r>
+        <w:t xml:space="preserve">    API-&gt;&gt;DB: Update guest status and checked_in_at</w:t>
+      </w:r>
+    </w:p>
+    <w:p>
+      <w:pPr>
+        <w:pStyle w:val="CodeBlock"/>
+      </w:pPr>
+      <w:r>
+        <w:t xml:space="preserve">    DB--&gt;&gt;API: Updated guest</w:t>
+      </w:r>
+    </w:p>
+    <w:p>
+      <w:pPr>
+        <w:pStyle w:val="CodeBlock"/>
+      </w:pPr>
+      <w:r>
+        <w:t xml:space="preserve">    API--&gt;&gt;UI: Check-in success response</w:t>
+      </w:r>
+    </w:p>
+    <w:p>
+      <w:pPr>
+        <w:pStyle w:val="CodeBlock"/>
+      </w:pPr>
+      <w:r>
+        <w:t xml:space="preserve">    UI--&gt;&gt;Organizer: Attendance updated</w:t>
       </w:r>
     </w:p>
     <w:p/>

</xml_diff>

<commit_message>
Add combined diagrams page and complete sequence coverage
</commit_message>
<xml_diff>
--- a/deliverables/RiziEvents-Technical-Documentation.docx
+++ b/deliverables/RiziEvents-Technical-Documentation.docx
@@ -497,6 +497,11 @@
         <w:t>The high-level architecture is documented in `docs/diagrams/system-architecture.mmd`.</w:t>
       </w:r>
     </w:p>
+    <w:p>
+      <w:r>
+        <w:t>GitHub-rendered diagrams are also collected in `docs/diagrams.md`.</w:t>
+      </w:r>
+    </w:p>
     <w:p/>
     <w:p>
       <w:pPr>
@@ -2701,6 +2706,14 @@
         <w:pStyle w:val="ListBullet"/>
       </w:pPr>
       <w:r>
+        <w:t>`docs/diagrams/sequence-organizer-auth.mmd`</w:t>
+      </w:r>
+    </w:p>
+    <w:p>
+      <w:pPr>
+        <w:pStyle w:val="ListBullet"/>
+      </w:pPr>
+      <w:r>
         <w:t>`docs/diagrams/sequence-create-publish.mmd`</w:t>
       </w:r>
     </w:p>
@@ -2735,6 +2748,14 @@
         <w:pStyle w:val="ListBullet"/>
       </w:pPr>
       <w:r>
+        <w:t>Organizer registration and sign in.</w:t>
+      </w:r>
+    </w:p>
+    <w:p>
+      <w:pPr>
+        <w:pStyle w:val="ListBullet"/>
+      </w:pPr>
+      <w:r>
         <w:t>Organizer creates and publishes an event.</w:t>
       </w:r>
     </w:p>
@@ -2760,6 +2781,223 @@
         <w:pStyle w:val="Heading3"/>
       </w:pPr>
       <w:r>
+        <w:t>Sequence coverage note</w:t>
+      </w:r>
+    </w:p>
+    <w:p/>
+    <w:p>
+      <w:r>
+        <w:t>Together, the sequence diagrams cover the full MVP flow from organizer authentication to event publishing, guest registration, guest list retrieval, and offline check-in. The create/publish and guest-registration sequences also cover the Should Have stories around agenda, speakers, and venue directions at the level expected for this MVP.</w:t>
+      </w:r>
+    </w:p>
+    <w:p/>
+    <w:p>
+      <w:pPr>
+        <w:pStyle w:val="Heading3"/>
+      </w:pPr>
+      <w:r>
+        <w:t>Mermaid: Organizer Authentication</w:t>
+      </w:r>
+    </w:p>
+    <w:p/>
+    <w:p>
+      <w:pPr>
+        <w:pStyle w:val="IntenseQuote"/>
+      </w:pPr>
+      <w:r>
+        <w:t>MERMAID</w:t>
+      </w:r>
+    </w:p>
+    <w:p>
+      <w:pPr>
+        <w:pStyle w:val="CodeBlock"/>
+      </w:pPr>
+      <w:r>
+        <w:t>sequenceDiagram</w:t>
+      </w:r>
+    </w:p>
+    <w:p>
+      <w:pPr>
+        <w:pStyle w:val="CodeBlock"/>
+      </w:pPr>
+      <w:r>
+        <w:t xml:space="preserve">    actor Organizer</w:t>
+      </w:r>
+    </w:p>
+    <w:p>
+      <w:pPr>
+        <w:pStyle w:val="CodeBlock"/>
+      </w:pPr>
+      <w:r>
+        <w:t xml:space="preserve">    participant UI as Auth UI</w:t>
+      </w:r>
+    </w:p>
+    <w:p>
+      <w:pPr>
+        <w:pStyle w:val="CodeBlock"/>
+      </w:pPr>
+      <w:r>
+        <w:t xml:space="preserve">    participant API as AuthService</w:t>
+      </w:r>
+    </w:p>
+    <w:p>
+      <w:pPr>
+        <w:pStyle w:val="CodeBlock"/>
+      </w:pPr>
+      <w:r>
+        <w:t xml:space="preserve">    participant Auth as Supabase Auth</w:t>
+      </w:r>
+    </w:p>
+    <w:p>
+      <w:pPr>
+        <w:pStyle w:val="CodeBlock"/>
+      </w:pPr>
+      <w:r>
+        <w:t xml:space="preserve">    participant DB as Supabase Postgres</w:t>
+      </w:r>
+    </w:p>
+    <w:p>
+      <w:pPr>
+        <w:pStyle w:val="CodeBlock"/>
+      </w:pPr>
+      <w:r>
+        <w:t xml:space="preserve"> </w:t>
+      </w:r>
+    </w:p>
+    <w:p>
+      <w:pPr>
+        <w:pStyle w:val="CodeBlock"/>
+      </w:pPr>
+      <w:r>
+        <w:t xml:space="preserve">    Organizer-&gt;&gt;UI: Open sign up or sign in screen</w:t>
+      </w:r>
+    </w:p>
+    <w:p>
+      <w:pPr>
+        <w:pStyle w:val="CodeBlock"/>
+      </w:pPr>
+      <w:r>
+        <w:t xml:space="preserve">    alt New organizer registration</w:t>
+      </w:r>
+    </w:p>
+    <w:p>
+      <w:pPr>
+        <w:pStyle w:val="CodeBlock"/>
+      </w:pPr>
+      <w:r>
+        <w:t xml:space="preserve">        Organizer-&gt;&gt;UI: Submit register form</w:t>
+      </w:r>
+    </w:p>
+    <w:p>
+      <w:pPr>
+        <w:pStyle w:val="CodeBlock"/>
+      </w:pPr>
+      <w:r>
+        <w:t xml:space="preserve">        UI-&gt;&gt;API: POST /api/auth/register</w:t>
+      </w:r>
+    </w:p>
+    <w:p>
+      <w:pPr>
+        <w:pStyle w:val="CodeBlock"/>
+      </w:pPr>
+      <w:r>
+        <w:t xml:space="preserve">        API-&gt;&gt;Auth: Create auth account</w:t>
+      </w:r>
+    </w:p>
+    <w:p>
+      <w:pPr>
+        <w:pStyle w:val="CodeBlock"/>
+      </w:pPr>
+      <w:r>
+        <w:t xml:space="preserve">        Auth-&gt;&gt;DB: Create organizer profile record</w:t>
+      </w:r>
+    </w:p>
+    <w:p>
+      <w:pPr>
+        <w:pStyle w:val="CodeBlock"/>
+      </w:pPr>
+      <w:r>
+        <w:t xml:space="preserve">        DB--&gt;&gt;Auth: Profile saved</w:t>
+      </w:r>
+    </w:p>
+    <w:p>
+      <w:pPr>
+        <w:pStyle w:val="CodeBlock"/>
+      </w:pPr>
+      <w:r>
+        <w:t xml:space="preserve">        Auth--&gt;&gt;API: Account created</w:t>
+      </w:r>
+    </w:p>
+    <w:p>
+      <w:pPr>
+        <w:pStyle w:val="CodeBlock"/>
+      </w:pPr>
+      <w:r>
+        <w:t xml:space="preserve">        API--&gt;&gt;UI: Registration success</w:t>
+      </w:r>
+    </w:p>
+    <w:p>
+      <w:pPr>
+        <w:pStyle w:val="CodeBlock"/>
+      </w:pPr>
+      <w:r>
+        <w:t xml:space="preserve">    else Existing organizer login</w:t>
+      </w:r>
+    </w:p>
+    <w:p>
+      <w:pPr>
+        <w:pStyle w:val="CodeBlock"/>
+      </w:pPr>
+      <w:r>
+        <w:t xml:space="preserve">        Organizer-&gt;&gt;UI: Submit login form</w:t>
+      </w:r>
+    </w:p>
+    <w:p>
+      <w:pPr>
+        <w:pStyle w:val="CodeBlock"/>
+      </w:pPr>
+      <w:r>
+        <w:t xml:space="preserve">        UI-&gt;&gt;API: POST /api/auth/login</w:t>
+      </w:r>
+    </w:p>
+    <w:p>
+      <w:pPr>
+        <w:pStyle w:val="CodeBlock"/>
+      </w:pPr>
+      <w:r>
+        <w:t xml:space="preserve">        API-&gt;&gt;Auth: Validate credentials</w:t>
+      </w:r>
+    </w:p>
+    <w:p>
+      <w:pPr>
+        <w:pStyle w:val="CodeBlock"/>
+      </w:pPr>
+      <w:r>
+        <w:t xml:space="preserve">        Auth--&gt;&gt;API: Session returned</w:t>
+      </w:r>
+    </w:p>
+    <w:p>
+      <w:pPr>
+        <w:pStyle w:val="CodeBlock"/>
+      </w:pPr>
+      <w:r>
+        <w:t xml:space="preserve">        API--&gt;&gt;UI: Authenticated session</w:t>
+      </w:r>
+    </w:p>
+    <w:p>
+      <w:pPr>
+        <w:pStyle w:val="CodeBlock"/>
+      </w:pPr>
+      <w:r>
+        <w:t xml:space="preserve">    end</w:t>
+      </w:r>
+    </w:p>
+    <w:p/>
+    <w:p>
+      <w:pPr>
+        <w:pStyle w:val="Heading3"/>
+      </w:pPr>
+      <w:r>
         <w:t>Mermaid: Create and Publish Event</w:t>
       </w:r>
     </w:p>
@@ -2793,7 +3031,2763 @@
         <w:pStyle w:val="CodeBlock"/>
       </w:pPr>
       <w:r>
-        <w:t xml:space="preserve">    participant UI as Next.js Web App</w:t>
+        <w:t xml:space="preserve">    participant UI as Event Management UI</w:t>
+      </w:r>
+    </w:p>
+    <w:p>
+      <w:pPr>
+        <w:pStyle w:val="CodeBlock"/>
+      </w:pPr>
+      <w:r>
+        <w:t xml:space="preserve">    participant API as EventService</w:t>
+      </w:r>
+    </w:p>
+    <w:p>
+      <w:pPr>
+        <w:pStyle w:val="CodeBlock"/>
+      </w:pPr>
+      <w:r>
+        <w:t xml:space="preserve">    participant Maps as VenueLocationService</w:t>
+      </w:r>
+    </w:p>
+    <w:p>
+      <w:pPr>
+        <w:pStyle w:val="CodeBlock"/>
+      </w:pPr>
+      <w:r>
+        <w:t xml:space="preserve">    participant DB as Supabase Postgres</w:t>
+      </w:r>
+    </w:p>
+    <w:p>
+      <w:pPr>
+        <w:pStyle w:val="CodeBlock"/>
+      </w:pPr>
+      <w:r>
+        <w:t xml:space="preserve"> </w:t>
+      </w:r>
+    </w:p>
+    <w:p>
+      <w:pPr>
+        <w:pStyle w:val="CodeBlock"/>
+      </w:pPr>
+      <w:r>
+        <w:t xml:space="preserve">    Organizer-&gt;&gt;UI: Open create event form</w:t>
+      </w:r>
+    </w:p>
+    <w:p>
+      <w:pPr>
+        <w:pStyle w:val="CodeBlock"/>
+      </w:pPr>
+      <w:r>
+        <w:t xml:space="preserve">    Organizer-&gt;&gt;UI: Enter title, dates, capacity, branding</w:t>
+      </w:r>
+    </w:p>
+    <w:p>
+      <w:pPr>
+        <w:pStyle w:val="CodeBlock"/>
+      </w:pPr>
+      <w:r>
+        <w:t xml:space="preserve">    Organizer-&gt;&gt;UI: Search venue</w:t>
+      </w:r>
+    </w:p>
+    <w:p>
+      <w:pPr>
+        <w:pStyle w:val="CodeBlock"/>
+      </w:pPr>
+      <w:r>
+        <w:t xml:space="preserve">    UI-&gt;&gt;Maps: Resolve place data from Google Maps</w:t>
+      </w:r>
+    </w:p>
+    <w:p>
+      <w:pPr>
+        <w:pStyle w:val="CodeBlock"/>
+      </w:pPr>
+      <w:r>
+        <w:t xml:space="preserve">    Maps--&gt;&gt;UI: place_id, address, latitude, longitude</w:t>
+      </w:r>
+    </w:p>
+    <w:p>
+      <w:pPr>
+        <w:pStyle w:val="CodeBlock"/>
+      </w:pPr>
+      <w:r>
+        <w:t xml:space="preserve">    Organizer-&gt;&gt;UI: Save draft</w:t>
+      </w:r>
+    </w:p>
+    <w:p>
+      <w:pPr>
+        <w:pStyle w:val="CodeBlock"/>
+      </w:pPr>
+      <w:r>
+        <w:t xml:space="preserve">    UI-&gt;&gt;API: POST /api/events</w:t>
+      </w:r>
+    </w:p>
+    <w:p>
+      <w:pPr>
+        <w:pStyle w:val="CodeBlock"/>
+      </w:pPr>
+      <w:r>
+        <w:t xml:space="preserve">    API-&gt;&gt;DB: Insert draft event with slug and venue data</w:t>
+      </w:r>
+    </w:p>
+    <w:p>
+      <w:pPr>
+        <w:pStyle w:val="CodeBlock"/>
+      </w:pPr>
+      <w:r>
+        <w:t xml:space="preserve">    DB--&gt;&gt;API: Event created</w:t>
+      </w:r>
+    </w:p>
+    <w:p>
+      <w:pPr>
+        <w:pStyle w:val="CodeBlock"/>
+      </w:pPr>
+      <w:r>
+        <w:t xml:space="preserve">    API--&gt;&gt;UI: Draft event response</w:t>
+      </w:r>
+    </w:p>
+    <w:p>
+      <w:pPr>
+        <w:pStyle w:val="CodeBlock"/>
+      </w:pPr>
+      <w:r>
+        <w:t xml:space="preserve">    Organizer-&gt;&gt;UI: Add optional agenda and speakers</w:t>
+      </w:r>
+    </w:p>
+    <w:p>
+      <w:pPr>
+        <w:pStyle w:val="CodeBlock"/>
+      </w:pPr>
+      <w:r>
+        <w:t xml:space="preserve">    UI-&gt;&gt;API: PATCH /api/events/{eventId}</w:t>
+      </w:r>
+    </w:p>
+    <w:p>
+      <w:pPr>
+        <w:pStyle w:val="CodeBlock"/>
+      </w:pPr>
+      <w:r>
+        <w:t xml:space="preserve">    API-&gt;&gt;DB: Update event content</w:t>
+      </w:r>
+    </w:p>
+    <w:p>
+      <w:pPr>
+        <w:pStyle w:val="CodeBlock"/>
+      </w:pPr>
+      <w:r>
+        <w:t xml:space="preserve">    DB--&gt;&gt;API: Event updated</w:t>
+      </w:r>
+    </w:p>
+    <w:p>
+      <w:pPr>
+        <w:pStyle w:val="CodeBlock"/>
+      </w:pPr>
+      <w:r>
+        <w:t xml:space="preserve">    API--&gt;&gt;UI: Updated event response</w:t>
+      </w:r>
+    </w:p>
+    <w:p>
+      <w:pPr>
+        <w:pStyle w:val="CodeBlock"/>
+      </w:pPr>
+      <w:r>
+        <w:t xml:space="preserve">    Organizer-&gt;&gt;UI: Publish event</w:t>
+      </w:r>
+    </w:p>
+    <w:p>
+      <w:pPr>
+        <w:pStyle w:val="CodeBlock"/>
+      </w:pPr>
+      <w:r>
+        <w:t xml:space="preserve">    UI-&gt;&gt;API: POST /api/events/{eventId}/publish</w:t>
+      </w:r>
+    </w:p>
+    <w:p>
+      <w:pPr>
+        <w:pStyle w:val="CodeBlock"/>
+      </w:pPr>
+      <w:r>
+        <w:t xml:space="preserve">    API-&gt;&gt;DB: Update event status to published</w:t>
+      </w:r>
+    </w:p>
+    <w:p>
+      <w:pPr>
+        <w:pStyle w:val="CodeBlock"/>
+      </w:pPr>
+      <w:r>
+        <w:t xml:space="preserve">    DB--&gt;&gt;API: Published event</w:t>
+      </w:r>
+    </w:p>
+    <w:p>
+      <w:pPr>
+        <w:pStyle w:val="CodeBlock"/>
+      </w:pPr>
+      <w:r>
+        <w:t xml:space="preserve">    API--&gt;&gt;UI: Public URL returned</w:t>
+      </w:r>
+    </w:p>
+    <w:p/>
+    <w:p>
+      <w:pPr>
+        <w:pStyle w:val="Heading3"/>
+      </w:pPr>
+      <w:r>
+        <w:t>Mermaid: Guest Registration</w:t>
+      </w:r>
+    </w:p>
+    <w:p/>
+    <w:p>
+      <w:pPr>
+        <w:pStyle w:val="IntenseQuote"/>
+      </w:pPr>
+      <w:r>
+        <w:t>MERMAID</w:t>
+      </w:r>
+    </w:p>
+    <w:p>
+      <w:pPr>
+        <w:pStyle w:val="CodeBlock"/>
+      </w:pPr>
+      <w:r>
+        <w:t>sequenceDiagram</w:t>
+      </w:r>
+    </w:p>
+    <w:p>
+      <w:pPr>
+        <w:pStyle w:val="CodeBlock"/>
+      </w:pPr>
+      <w:r>
+        <w:t xml:space="preserve">    actor Guest</w:t>
+      </w:r>
+    </w:p>
+    <w:p>
+      <w:pPr>
+        <w:pStyle w:val="CodeBlock"/>
+      </w:pPr>
+      <w:r>
+        <w:t xml:space="preserve">    participant UI as Public Event Page</w:t>
+      </w:r>
+    </w:p>
+    <w:p>
+      <w:pPr>
+        <w:pStyle w:val="CodeBlock"/>
+      </w:pPr>
+      <w:r>
+        <w:t xml:space="preserve">    participant API as GuestService</w:t>
+      </w:r>
+    </w:p>
+    <w:p>
+      <w:pPr>
+        <w:pStyle w:val="CodeBlock"/>
+      </w:pPr>
+      <w:r>
+        <w:t xml:space="preserve">    participant Maps as VenueLocationService</w:t>
+      </w:r>
+    </w:p>
+    <w:p>
+      <w:pPr>
+        <w:pStyle w:val="CodeBlock"/>
+      </w:pPr>
+      <w:r>
+        <w:t xml:space="preserve">    participant DB as Supabase Postgres</w:t>
+      </w:r>
+    </w:p>
+    <w:p>
+      <w:pPr>
+        <w:pStyle w:val="CodeBlock"/>
+      </w:pPr>
+      <w:r>
+        <w:t xml:space="preserve"> </w:t>
+      </w:r>
+    </w:p>
+    <w:p>
+      <w:pPr>
+        <w:pStyle w:val="CodeBlock"/>
+      </w:pPr>
+      <w:r>
+        <w:t xml:space="preserve">    Guest-&gt;&gt;UI: Open /e/{slug}</w:t>
+      </w:r>
+    </w:p>
+    <w:p>
+      <w:pPr>
+        <w:pStyle w:val="CodeBlock"/>
+      </w:pPr>
+      <w:r>
+        <w:t xml:space="preserve">    UI-&gt;&gt;API: GET /api/public/events/{slug}</w:t>
+      </w:r>
+    </w:p>
+    <w:p>
+      <w:pPr>
+        <w:pStyle w:val="CodeBlock"/>
+      </w:pPr>
+      <w:r>
+        <w:t xml:space="preserve">    API-&gt;&gt;DB: Read published event by slug</w:t>
+      </w:r>
+    </w:p>
+    <w:p>
+      <w:pPr>
+        <w:pStyle w:val="CodeBlock"/>
+      </w:pPr>
+      <w:r>
+        <w:t xml:space="preserve">    DB--&gt;&gt;API: Event details, agenda, speakers, venue</w:t>
+      </w:r>
+    </w:p>
+    <w:p>
+      <w:pPr>
+        <w:pStyle w:val="CodeBlock"/>
+      </w:pPr>
+      <w:r>
+        <w:t xml:space="preserve">    API--&gt;&gt;UI: Event page payload</w:t>
+      </w:r>
+    </w:p>
+    <w:p>
+      <w:pPr>
+        <w:pStyle w:val="CodeBlock"/>
+      </w:pPr>
+      <w:r>
+        <w:t xml:space="preserve">    UI-&gt;&gt;Maps: Build directions link from venue data</w:t>
+      </w:r>
+    </w:p>
+    <w:p>
+      <w:pPr>
+        <w:pStyle w:val="CodeBlock"/>
+      </w:pPr>
+      <w:r>
+        <w:t xml:space="preserve">    Maps--&gt;&gt;UI: Directions URL</w:t>
+      </w:r>
+    </w:p>
+    <w:p>
+      <w:pPr>
+        <w:pStyle w:val="CodeBlock"/>
+      </w:pPr>
+      <w:r>
+        <w:t xml:space="preserve">    Guest-&gt;&gt;UI: Review details and submit registration form</w:t>
+      </w:r>
+    </w:p>
+    <w:p>
+      <w:pPr>
+        <w:pStyle w:val="CodeBlock"/>
+      </w:pPr>
+      <w:r>
+        <w:t xml:space="preserve">    UI-&gt;&gt;API: POST /api/guests/register</w:t>
+      </w:r>
+    </w:p>
+    <w:p>
+      <w:pPr>
+        <w:pStyle w:val="CodeBlock"/>
+      </w:pPr>
+      <w:r>
+        <w:t xml:space="preserve">    API-&gt;&gt;DB: Validate event and create guest</w:t>
+      </w:r>
+    </w:p>
+    <w:p>
+      <w:pPr>
+        <w:pStyle w:val="CodeBlock"/>
+      </w:pPr>
+      <w:r>
+        <w:t xml:space="preserve">    DB--&gt;&gt;API: Guest record created</w:t>
+      </w:r>
+    </w:p>
+    <w:p>
+      <w:pPr>
+        <w:pStyle w:val="CodeBlock"/>
+      </w:pPr>
+      <w:r>
+        <w:t xml:space="preserve">    API--&gt;&gt;UI: Registration success response</w:t>
+      </w:r>
+    </w:p>
+    <w:p>
+      <w:pPr>
+        <w:pStyle w:val="CodeBlock"/>
+      </w:pPr>
+      <w:r>
+        <w:t xml:space="preserve">    UI--&gt;&gt;Guest: Confirmation shown</w:t>
+      </w:r>
+    </w:p>
+    <w:p/>
+    <w:p>
+      <w:pPr>
+        <w:pStyle w:val="Heading3"/>
+      </w:pPr>
+      <w:r>
+        <w:t>Mermaid: Offline Check-in</w:t>
+      </w:r>
+    </w:p>
+    <w:p/>
+    <w:p>
+      <w:pPr>
+        <w:pStyle w:val="IntenseQuote"/>
+      </w:pPr>
+      <w:r>
+        <w:t>MERMAID</w:t>
+      </w:r>
+    </w:p>
+    <w:p>
+      <w:pPr>
+        <w:pStyle w:val="CodeBlock"/>
+      </w:pPr>
+      <w:r>
+        <w:t>sequenceDiagram</w:t>
+      </w:r>
+    </w:p>
+    <w:p>
+      <w:pPr>
+        <w:pStyle w:val="CodeBlock"/>
+      </w:pPr>
+      <w:r>
+        <w:t xml:space="preserve">    actor Organizer</w:t>
+      </w:r>
+    </w:p>
+    <w:p>
+      <w:pPr>
+        <w:pStyle w:val="CodeBlock"/>
+      </w:pPr>
+      <w:r>
+        <w:t xml:space="preserve">    participant UI as Guest List and Check-in UI</w:t>
+      </w:r>
+    </w:p>
+    <w:p>
+      <w:pPr>
+        <w:pStyle w:val="CodeBlock"/>
+      </w:pPr>
+      <w:r>
+        <w:t xml:space="preserve">    participant GuestAPI as GuestService</w:t>
+      </w:r>
+    </w:p>
+    <w:p>
+      <w:pPr>
+        <w:pStyle w:val="CodeBlock"/>
+      </w:pPr>
+      <w:r>
+        <w:t xml:space="preserve">    participant API as CheckInService</w:t>
+      </w:r>
+    </w:p>
+    <w:p>
+      <w:pPr>
+        <w:pStyle w:val="CodeBlock"/>
+      </w:pPr>
+      <w:r>
+        <w:t xml:space="preserve">    participant DB as Supabase Postgres</w:t>
+      </w:r>
+    </w:p>
+    <w:p>
+      <w:pPr>
+        <w:pStyle w:val="CodeBlock"/>
+      </w:pPr>
+      <w:r>
+        <w:t xml:space="preserve"> </w:t>
+      </w:r>
+    </w:p>
+    <w:p>
+      <w:pPr>
+        <w:pStyle w:val="CodeBlock"/>
+      </w:pPr>
+      <w:r>
+        <w:t xml:space="preserve">    Organizer-&gt;&gt;UI: Open guest list</w:t>
+      </w:r>
+    </w:p>
+    <w:p>
+      <w:pPr>
+        <w:pStyle w:val="CodeBlock"/>
+      </w:pPr>
+      <w:r>
+        <w:t xml:space="preserve">    UI-&gt;&gt;GuestAPI: GET /api/events/{eventId}/guests</w:t>
+      </w:r>
+    </w:p>
+    <w:p>
+      <w:pPr>
+        <w:pStyle w:val="CodeBlock"/>
+      </w:pPr>
+      <w:r>
+        <w:t xml:space="preserve">    GuestAPI-&gt;&gt;DB: Fetch registered guests</w:t>
+      </w:r>
+    </w:p>
+    <w:p>
+      <w:pPr>
+        <w:pStyle w:val="CodeBlock"/>
+      </w:pPr>
+      <w:r>
+        <w:t xml:space="preserve">    DB--&gt;&gt;GuestAPI: Guest list</w:t>
+      </w:r>
+    </w:p>
+    <w:p>
+      <w:pPr>
+        <w:pStyle w:val="CodeBlock"/>
+      </w:pPr>
+      <w:r>
+        <w:t xml:space="preserve">    GuestAPI--&gt;&gt;UI: Guest list response</w:t>
+      </w:r>
+    </w:p>
+    <w:p>
+      <w:pPr>
+        <w:pStyle w:val="CodeBlock"/>
+      </w:pPr>
+      <w:r>
+        <w:t xml:space="preserve">    Organizer-&gt;&gt;UI: Search guest and confirm check-in</w:t>
+      </w:r>
+    </w:p>
+    <w:p>
+      <w:pPr>
+        <w:pStyle w:val="CodeBlock"/>
+      </w:pPr>
+      <w:r>
+        <w:t xml:space="preserve">    UI-&gt;&gt;API: POST /api/guests/{guestId}/checkin</w:t>
+      </w:r>
+    </w:p>
+    <w:p>
+      <w:pPr>
+        <w:pStyle w:val="CodeBlock"/>
+      </w:pPr>
+      <w:r>
+        <w:t xml:space="preserve">    API-&gt;&gt;DB: Update guest status and checked_in_at</w:t>
+      </w:r>
+    </w:p>
+    <w:p>
+      <w:pPr>
+        <w:pStyle w:val="CodeBlock"/>
+      </w:pPr>
+      <w:r>
+        <w:t xml:space="preserve">    DB--&gt;&gt;API: Updated guest</w:t>
+      </w:r>
+    </w:p>
+    <w:p>
+      <w:pPr>
+        <w:pStyle w:val="CodeBlock"/>
+      </w:pPr>
+      <w:r>
+        <w:t xml:space="preserve">    API--&gt;&gt;UI: Check-in success response</w:t>
+      </w:r>
+    </w:p>
+    <w:p>
+      <w:pPr>
+        <w:pStyle w:val="CodeBlock"/>
+      </w:pPr>
+      <w:r>
+        <w:t xml:space="preserve">    UI--&gt;&gt;Organizer: Attendance updated</w:t>
+      </w:r>
+    </w:p>
+    <w:p/>
+    <w:p>
+      <w:pPr>
+        <w:pStyle w:val="Heading2"/>
+      </w:pPr>
+      <w:r>
+        <w:t>9. API Specifications</w:t>
+      </w:r>
+    </w:p>
+    <w:p/>
+    <w:p>
+      <w:r>
+        <w:t>The detailed endpoint definitions are documented in `docs/api-spec.md`.</w:t>
+      </w:r>
+    </w:p>
+    <w:p/>
+    <w:p>
+      <w:pPr>
+        <w:pStyle w:val="Heading3"/>
+      </w:pPr>
+      <w:r>
+        <w:t>MVP endpoint set</w:t>
+      </w:r>
+    </w:p>
+    <w:p/>
+    <w:p>
+      <w:pPr>
+        <w:pStyle w:val="ListBullet"/>
+      </w:pPr>
+      <w:r>
+        <w:t>`POST /api/auth/register`</w:t>
+      </w:r>
+    </w:p>
+    <w:p>
+      <w:pPr>
+        <w:pStyle w:val="ListBullet"/>
+      </w:pPr>
+      <w:r>
+        <w:t>`POST /api/auth/login`</w:t>
+      </w:r>
+    </w:p>
+    <w:p>
+      <w:pPr>
+        <w:pStyle w:val="ListBullet"/>
+      </w:pPr>
+      <w:r>
+        <w:t>`POST /api/events`</w:t>
+      </w:r>
+    </w:p>
+    <w:p>
+      <w:pPr>
+        <w:pStyle w:val="ListBullet"/>
+      </w:pPr>
+      <w:r>
+        <w:t>`GET /api/events`</w:t>
+      </w:r>
+    </w:p>
+    <w:p>
+      <w:pPr>
+        <w:pStyle w:val="ListBullet"/>
+      </w:pPr>
+      <w:r>
+        <w:t>`GET /api/events/{eventId}`</w:t>
+      </w:r>
+    </w:p>
+    <w:p>
+      <w:pPr>
+        <w:pStyle w:val="ListBullet"/>
+      </w:pPr>
+      <w:r>
+        <w:t>`PATCH /api/events/{eventId}`</w:t>
+      </w:r>
+    </w:p>
+    <w:p>
+      <w:pPr>
+        <w:pStyle w:val="ListBullet"/>
+      </w:pPr>
+      <w:r>
+        <w:t>`POST /api/events/{eventId}/publish`</w:t>
+      </w:r>
+    </w:p>
+    <w:p>
+      <w:pPr>
+        <w:pStyle w:val="ListBullet"/>
+      </w:pPr>
+      <w:r>
+        <w:t>`GET /api/public/events/{slug}`</w:t>
+      </w:r>
+    </w:p>
+    <w:p>
+      <w:pPr>
+        <w:pStyle w:val="ListBullet"/>
+      </w:pPr>
+      <w:r>
+        <w:t>`POST /api/guests/register`</w:t>
+      </w:r>
+    </w:p>
+    <w:p>
+      <w:pPr>
+        <w:pStyle w:val="ListBullet"/>
+      </w:pPr>
+      <w:r>
+        <w:t>`GET /api/events/{eventId}/guests`</w:t>
+      </w:r>
+    </w:p>
+    <w:p>
+      <w:pPr>
+        <w:pStyle w:val="ListBullet"/>
+      </w:pPr>
+      <w:r>
+        <w:t>`POST /api/guests/{guestId}/checkin`</w:t>
+      </w:r>
+    </w:p>
+    <w:p/>
+    <w:p>
+      <w:pPr>
+        <w:pStyle w:val="Heading2"/>
+      </w:pPr>
+      <w:r>
+        <w:t>10. SCM and QA</w:t>
+      </w:r>
+    </w:p>
+    <w:p/>
+    <w:p>
+      <w:r>
+        <w:t>The full plan is documented in `docs/scm-qa-plan.md`.</w:t>
+      </w:r>
+    </w:p>
+    <w:p/>
+    <w:p>
+      <w:pPr>
+        <w:pStyle w:val="Heading3"/>
+      </w:pPr>
+      <w:r>
+        <w:t>SCM summary</w:t>
+      </w:r>
+    </w:p>
+    <w:p/>
+    <w:p>
+      <w:pPr>
+        <w:pStyle w:val="ListBullet"/>
+      </w:pPr>
+      <w:r>
+        <w:t>`main` is the protected branch.</w:t>
+      </w:r>
+    </w:p>
+    <w:p>
+      <w:pPr>
+        <w:pStyle w:val="ListBullet"/>
+      </w:pPr>
+      <w:r>
+        <w:t>Each task is developed in a short-lived feature branch.</w:t>
+      </w:r>
+    </w:p>
+    <w:p>
+      <w:pPr>
+        <w:pStyle w:val="ListBullet"/>
+      </w:pPr>
+      <w:r>
+        <w:t>Pull requests are reviewed before merge.</w:t>
+      </w:r>
+    </w:p>
+    <w:p>
+      <w:pPr>
+        <w:pStyle w:val="ListBullet"/>
+      </w:pPr>
+      <w:r>
+        <w:t>Commits stay small and tied to one task or fix.</w:t>
+      </w:r>
+    </w:p>
+    <w:p/>
+    <w:p>
+      <w:pPr>
+        <w:pStyle w:val="Heading3"/>
+      </w:pPr>
+      <w:r>
+        <w:t>QA summary</w:t>
+      </w:r>
+    </w:p>
+    <w:p/>
+    <w:p>
+      <w:pPr>
+        <w:pStyle w:val="ListBullet"/>
+      </w:pPr>
+      <w:r>
+        <w:t>Manual smoke tests cover the main organizer and guest flows.</w:t>
+      </w:r>
+    </w:p>
+    <w:p>
+      <w:pPr>
+        <w:pStyle w:val="ListBullet"/>
+      </w:pPr>
+      <w:r>
+        <w:t>Targeted component and API tests are added where feasible.</w:t>
+      </w:r>
+    </w:p>
+    <w:p>
+      <w:pPr>
+        <w:pStyle w:val="ListBullet"/>
+      </w:pPr>
+      <w:r>
+        <w:t>Staging is used for validation before production release.</w:t>
+      </w:r>
+    </w:p>
+    <w:p/>
+    <w:p>
+      <w:pPr>
+        <w:pStyle w:val="Heading2"/>
+      </w:pPr>
+      <w:r>
+        <w:t>11. Technical Justifications</w:t>
+      </w:r>
+    </w:p>
+    <w:p/>
+    <w:p>
+      <w:r>
+        <w:t>The full rationale is documented in `docs/technical-justifications.md`.</w:t>
+      </w:r>
+    </w:p>
+    <w:p/>
+    <w:p>
+      <w:pPr>
+        <w:pStyle w:val="Heading3"/>
+      </w:pPr>
+      <w:r>
+        <w:t>Main decisions</w:t>
+      </w:r>
+    </w:p>
+    <w:p/>
+    <w:p>
+      <w:pPr>
+        <w:pStyle w:val="ListBullet"/>
+      </w:pPr>
+      <w:r>
+        <w:t>Supabase reduces backend setup overhead and provides Auth, Postgres, and access control quickly.</w:t>
+      </w:r>
+    </w:p>
+    <w:p>
+      <w:pPr>
+        <w:pStyle w:val="ListBullet"/>
+      </w:pPr>
+      <w:r>
+        <w:t>Vercel is a practical fit for Next.js deployment, preview environments, and fast iteration.</w:t>
+      </w:r>
+    </w:p>
+    <w:p>
+      <w:pPr>
+        <w:pStyle w:val="ListBullet"/>
+      </w:pPr>
+      <w:r>
+        <w:t>Google Maps is the most useful external integration for accurate venue location and directions.</w:t>
+      </w:r>
+    </w:p>
+    <w:p>
+      <w:pPr>
+        <w:pStyle w:val="ListBullet"/>
+      </w:pPr>
+      <w:r>
+        <w:t>Online payments are intentionally deferred to keep the MVP realistic and deliverable for a small student team.</w:t>
+      </w:r>
+    </w:p>
+    <w:p/>
+    <w:p>
+      <w:pPr>
+        <w:pStyle w:val="Heading2"/>
+      </w:pPr>
+      <w:r>
+        <w:t>12. Acceptance Criteria</w:t>
+      </w:r>
+    </w:p>
+    <w:p/>
+    <w:p>
+      <w:pPr>
+        <w:pStyle w:val="ListBullet"/>
+      </w:pPr>
+      <w:r>
+        <w:t>The repository documents only the reduced MVP scope.</w:t>
+      </w:r>
+    </w:p>
+    <w:p>
+      <w:pPr>
+        <w:pStyle w:val="ListBullet"/>
+      </w:pPr>
+      <w:r>
+        <w:t>The diagrams match the documented architecture and database design.</w:t>
+      </w:r>
+    </w:p>
+    <w:p>
+      <w:pPr>
+        <w:pStyle w:val="ListBullet"/>
+      </w:pPr>
+      <w:r>
+        <w:t>The API specification aligns with the user stories and sequence diagrams.</w:t>
+      </w:r>
+    </w:p>
+    <w:p>
+      <w:pPr>
+        <w:pStyle w:val="ListBullet"/>
+      </w:pPr>
+      <w:r>
+        <w:t>The SCM and QA plan is realistic for a four-member student team.</w:t>
+      </w:r>
+    </w:p>
+    <w:p>
+      <w:pPr>
+        <w:pStyle w:val="ListBullet"/>
+      </w:pPr>
+      <w:r>
+        <w:t>The `.docx` submission file is generated from the repo content and ready to upload.</w:t>
+      </w:r>
+    </w:p>
+    <w:p>
+      <w:r>
+        <w:br w:type="page"/>
+      </w:r>
+    </w:p>
+    <w:p>
+      <w:pPr>
+        <w:pStyle w:val="Heading1"/>
+      </w:pPr>
+      <w:r>
+        <w:t>RiziEvents Diagrams</w:t>
+      </w:r>
+    </w:p>
+    <w:p/>
+    <w:p>
+      <w:r>
+        <w:t>This page collects every Mermaid diagram used in the reduced MVP documentation so GitHub can render them in one place.</w:t>
+      </w:r>
+    </w:p>
+    <w:p/>
+    <w:p>
+      <w:pPr>
+        <w:pStyle w:val="Heading2"/>
+      </w:pPr>
+      <w:r>
+        <w:t>Story Coverage Matrix</w:t>
+      </w:r>
+    </w:p>
+    <w:p/>
+    <w:p>
+      <w:r>
+        <w:t>| User Story | Diagram Coverage |</w:t>
+      </w:r>
+    </w:p>
+    <w:p>
+      <w:r>
+        <w:t>| --- | --- |</w:t>
+      </w:r>
+    </w:p>
+    <w:p>
+      <w:r>
+        <w:t>| Organizer creates an account and signs in | Organizer Authentication Sequence, Class Diagram, System Architecture |</w:t>
+      </w:r>
+    </w:p>
+    <w:p>
+      <w:r>
+        <w:t>| Organizer creates an event with title, date, venue, and capacity | Create and Publish Event Sequence, Class Diagram, ER Diagram |</w:t>
+      </w:r>
+    </w:p>
+    <w:p>
+      <w:r>
+        <w:t>| Organizer publishes an event to a public URL | Create and Publish Event Sequence, System Architecture |</w:t>
+      </w:r>
+    </w:p>
+    <w:p>
+      <w:r>
+        <w:t>| Guest opens the public event page | Guest Registration Sequence, System Architecture |</w:t>
+      </w:r>
+    </w:p>
+    <w:p>
+      <w:r>
+        <w:t>| Guest registers for the event | Guest Registration Sequence, Class Diagram, ER Diagram |</w:t>
+      </w:r>
+    </w:p>
+    <w:p>
+      <w:r>
+        <w:t>| Organizer sees the registered guest list | Offline Check-in Sequence, Class Diagram |</w:t>
+      </w:r>
+    </w:p>
+    <w:p>
+      <w:r>
+        <w:t>| Organizer checks in guests manually | Offline Check-in Sequence, Class Diagram |</w:t>
+      </w:r>
+    </w:p>
+    <w:p>
+      <w:r>
+        <w:t>| Organizer adds agenda items | ER Diagram, Class Diagram |</w:t>
+      </w:r>
+    </w:p>
+    <w:p>
+      <w:r>
+        <w:t>| Organizer adds speakers | ER Diagram, Class Diagram |</w:t>
+      </w:r>
+    </w:p>
+    <w:p>
+      <w:r>
+        <w:t>| Guest uses venue directions | System Architecture, Class Diagram |</w:t>
+      </w:r>
+    </w:p>
+    <w:p/>
+    <w:p>
+      <w:pPr>
+        <w:pStyle w:val="Heading2"/>
+      </w:pPr>
+      <w:r>
+        <w:t>System Architecture</w:t>
+      </w:r>
+    </w:p>
+    <w:p/>
+    <w:p>
+      <w:pPr>
+        <w:pStyle w:val="IntenseQuote"/>
+      </w:pPr>
+      <w:r>
+        <w:t>MERMAID</w:t>
+      </w:r>
+    </w:p>
+    <w:p>
+      <w:pPr>
+        <w:pStyle w:val="CodeBlock"/>
+      </w:pPr>
+      <w:r>
+        <w:t>flowchart LR</w:t>
+      </w:r>
+    </w:p>
+    <w:p>
+      <w:pPr>
+        <w:pStyle w:val="CodeBlock"/>
+      </w:pPr>
+      <w:r>
+        <w:t xml:space="preserve">    Guest["Guest User"] --&gt; Browser["Web Browser"]</w:t>
+      </w:r>
+    </w:p>
+    <w:p>
+      <w:pPr>
+        <w:pStyle w:val="CodeBlock"/>
+      </w:pPr>
+      <w:r>
+        <w:t xml:space="preserve">    Organizer["Organizer"] --&gt; Browser</w:t>
+      </w:r>
+    </w:p>
+    <w:p>
+      <w:pPr>
+        <w:pStyle w:val="CodeBlock"/>
+      </w:pPr>
+      <w:r>
+        <w:t xml:space="preserve"> </w:t>
+      </w:r>
+    </w:p>
+    <w:p>
+      <w:pPr>
+        <w:pStyle w:val="CodeBlock"/>
+      </w:pPr>
+      <w:r>
+        <w:t xml:space="preserve">    Browser --&gt; Vercel["Vercel / Next.js Web App"]</w:t>
+      </w:r>
+    </w:p>
+    <w:p>
+      <w:pPr>
+        <w:pStyle w:val="CodeBlock"/>
+      </w:pPr>
+      <w:r>
+        <w:t xml:space="preserve">    Vercel --&gt; Auth["Supabase Auth"]</w:t>
+      </w:r>
+    </w:p>
+    <w:p>
+      <w:pPr>
+        <w:pStyle w:val="CodeBlock"/>
+      </w:pPr>
+      <w:r>
+        <w:t xml:space="preserve">    Vercel --&gt; DB["Supabase Postgres"]</w:t>
+      </w:r>
+    </w:p>
+    <w:p>
+      <w:pPr>
+        <w:pStyle w:val="CodeBlock"/>
+      </w:pPr>
+      <w:r>
+        <w:t xml:space="preserve">    Vercel --&gt; Storage["Supabase Storage"]</w:t>
+      </w:r>
+    </w:p>
+    <w:p>
+      <w:pPr>
+        <w:pStyle w:val="CodeBlock"/>
+      </w:pPr>
+      <w:r>
+        <w:t xml:space="preserve">    Vercel --&gt; Maps["Google Maps API and Places SDK"]</w:t>
+      </w:r>
+    </w:p>
+    <w:p>
+      <w:pPr>
+        <w:pStyle w:val="CodeBlock"/>
+      </w:pPr>
+      <w:r>
+        <w:t xml:space="preserve"> </w:t>
+      </w:r>
+    </w:p>
+    <w:p>
+      <w:pPr>
+        <w:pStyle w:val="CodeBlock"/>
+      </w:pPr>
+      <w:r>
+        <w:t xml:space="preserve">    Auth --&gt; DB</w:t>
+      </w:r>
+    </w:p>
+    <w:p>
+      <w:pPr>
+        <w:pStyle w:val="CodeBlock"/>
+      </w:pPr>
+      <w:r>
+        <w:t xml:space="preserve">    DB --&gt; RLS["Row Level Security Policies"]</w:t>
+      </w:r>
+    </w:p>
+    <w:p>
+      <w:pPr>
+        <w:pStyle w:val="CodeBlock"/>
+      </w:pPr>
+      <w:r>
+        <w:t xml:space="preserve"> </w:t>
+      </w:r>
+    </w:p>
+    <w:p>
+      <w:pPr>
+        <w:pStyle w:val="CodeBlock"/>
+      </w:pPr>
+      <w:r>
+        <w:t xml:space="preserve">    subgraph Environments</w:t>
+      </w:r>
+    </w:p>
+    <w:p>
+      <w:pPr>
+        <w:pStyle w:val="CodeBlock"/>
+      </w:pPr>
+      <w:r>
+        <w:t xml:space="preserve">      Prod["Production: rizi.app"]</w:t>
+      </w:r>
+    </w:p>
+    <w:p>
+      <w:pPr>
+        <w:pStyle w:val="CodeBlock"/>
+      </w:pPr>
+      <w:r>
+        <w:t xml:space="preserve">      Stage["Staging: staging.rizi.app"]</w:t>
+      </w:r>
+    </w:p>
+    <w:p>
+      <w:pPr>
+        <w:pStyle w:val="CodeBlock"/>
+      </w:pPr>
+      <w:r>
+        <w:t xml:space="preserve">    end</w:t>
+      </w:r>
+    </w:p>
+    <w:p>
+      <w:pPr>
+        <w:pStyle w:val="CodeBlock"/>
+      </w:pPr>
+      <w:r>
+        <w:t xml:space="preserve"> </w:t>
+      </w:r>
+    </w:p>
+    <w:p>
+      <w:pPr>
+        <w:pStyle w:val="CodeBlock"/>
+      </w:pPr>
+      <w:r>
+        <w:t xml:space="preserve">    Prod -. deploy .-&gt; Vercel</w:t>
+      </w:r>
+    </w:p>
+    <w:p>
+      <w:pPr>
+        <w:pStyle w:val="CodeBlock"/>
+      </w:pPr>
+      <w:r>
+        <w:t xml:space="preserve">    Stage -. validate .-&gt; Vercel</w:t>
+      </w:r>
+    </w:p>
+    <w:p/>
+    <w:p>
+      <w:pPr>
+        <w:pStyle w:val="Heading2"/>
+      </w:pPr>
+      <w:r>
+        <w:t>Class and Component Diagram</w:t>
+      </w:r>
+    </w:p>
+    <w:p/>
+    <w:p>
+      <w:pPr>
+        <w:pStyle w:val="IntenseQuote"/>
+      </w:pPr>
+      <w:r>
+        <w:t>MERMAID</w:t>
+      </w:r>
+    </w:p>
+    <w:p>
+      <w:pPr>
+        <w:pStyle w:val="CodeBlock"/>
+      </w:pPr>
+      <w:r>
+        <w:t>classDiagram</w:t>
+      </w:r>
+    </w:p>
+    <w:p>
+      <w:pPr>
+        <w:pStyle w:val="CodeBlock"/>
+      </w:pPr>
+      <w:r>
+        <w:t xml:space="preserve">    class AuthUI {</w:t>
+      </w:r>
+    </w:p>
+    <w:p>
+      <w:pPr>
+        <w:pStyle w:val="CodeBlock"/>
+      </w:pPr>
+      <w:r>
+        <w:t xml:space="preserve">        +renderLoginForm()</w:t>
+      </w:r>
+    </w:p>
+    <w:p>
+      <w:pPr>
+        <w:pStyle w:val="CodeBlock"/>
+      </w:pPr>
+      <w:r>
+        <w:t xml:space="preserve">        +renderRegisterForm()</w:t>
+      </w:r>
+    </w:p>
+    <w:p>
+      <w:pPr>
+        <w:pStyle w:val="CodeBlock"/>
+      </w:pPr>
+      <w:r>
+        <w:t xml:space="preserve">        +submitCredentials()</w:t>
+      </w:r>
+    </w:p>
+    <w:p>
+      <w:pPr>
+        <w:pStyle w:val="CodeBlock"/>
+      </w:pPr>
+      <w:r>
+        <w:t xml:space="preserve">    }</w:t>
+      </w:r>
+    </w:p>
+    <w:p>
+      <w:pPr>
+        <w:pStyle w:val="CodeBlock"/>
+      </w:pPr>
+      <w:r>
+        <w:t xml:space="preserve"> </w:t>
+      </w:r>
+    </w:p>
+    <w:p>
+      <w:pPr>
+        <w:pStyle w:val="CodeBlock"/>
+      </w:pPr>
+      <w:r>
+        <w:t xml:space="preserve">    class EventManagementUI {</w:t>
+      </w:r>
+    </w:p>
+    <w:p>
+      <w:pPr>
+        <w:pStyle w:val="CodeBlock"/>
+      </w:pPr>
+      <w:r>
+        <w:t xml:space="preserve">        +renderEventForm()</w:t>
+      </w:r>
+    </w:p>
+    <w:p>
+      <w:pPr>
+        <w:pStyle w:val="CodeBlock"/>
+      </w:pPr>
+      <w:r>
+        <w:t xml:space="preserve">        +saveDraft()</w:t>
+      </w:r>
+    </w:p>
+    <w:p>
+      <w:pPr>
+        <w:pStyle w:val="CodeBlock"/>
+      </w:pPr>
+      <w:r>
+        <w:t xml:space="preserve">        +publishEvent()</w:t>
+      </w:r>
+    </w:p>
+    <w:p>
+      <w:pPr>
+        <w:pStyle w:val="CodeBlock"/>
+      </w:pPr>
+      <w:r>
+        <w:t xml:space="preserve">        +viewGuestList()</w:t>
+      </w:r>
+    </w:p>
+    <w:p>
+      <w:pPr>
+        <w:pStyle w:val="CodeBlock"/>
+      </w:pPr>
+      <w:r>
+        <w:t xml:space="preserve">    }</w:t>
+      </w:r>
+    </w:p>
+    <w:p>
+      <w:pPr>
+        <w:pStyle w:val="CodeBlock"/>
+      </w:pPr>
+      <w:r>
+        <w:t xml:space="preserve"> </w:t>
+      </w:r>
+    </w:p>
+    <w:p>
+      <w:pPr>
+        <w:pStyle w:val="CodeBlock"/>
+      </w:pPr>
+      <w:r>
+        <w:t xml:space="preserve">    class PublicEventPage {</w:t>
+      </w:r>
+    </w:p>
+    <w:p>
+      <w:pPr>
+        <w:pStyle w:val="CodeBlock"/>
+      </w:pPr>
+      <w:r>
+        <w:t xml:space="preserve">        +loadEventBySlug()</w:t>
+      </w:r>
+    </w:p>
+    <w:p>
+      <w:pPr>
+        <w:pStyle w:val="CodeBlock"/>
+      </w:pPr>
+      <w:r>
+        <w:t xml:space="preserve">        +renderEventDetails()</w:t>
+      </w:r>
+    </w:p>
+    <w:p>
+      <w:pPr>
+        <w:pStyle w:val="CodeBlock"/>
+      </w:pPr>
+      <w:r>
+        <w:t xml:space="preserve">        +showVenueDirections()</w:t>
+      </w:r>
+    </w:p>
+    <w:p>
+      <w:pPr>
+        <w:pStyle w:val="CodeBlock"/>
+      </w:pPr>
+      <w:r>
+        <w:t xml:space="preserve">    }</w:t>
+      </w:r>
+    </w:p>
+    <w:p>
+      <w:pPr>
+        <w:pStyle w:val="CodeBlock"/>
+      </w:pPr>
+      <w:r>
+        <w:t xml:space="preserve"> </w:t>
+      </w:r>
+    </w:p>
+    <w:p>
+      <w:pPr>
+        <w:pStyle w:val="CodeBlock"/>
+      </w:pPr>
+      <w:r>
+        <w:t xml:space="preserve">    class GuestRegistrationUI {</w:t>
+      </w:r>
+    </w:p>
+    <w:p>
+      <w:pPr>
+        <w:pStyle w:val="CodeBlock"/>
+      </w:pPr>
+      <w:r>
+        <w:t xml:space="preserve">        +renderRegistrationForm()</w:t>
+      </w:r>
+    </w:p>
+    <w:p>
+      <w:pPr>
+        <w:pStyle w:val="CodeBlock"/>
+      </w:pPr>
+      <w:r>
+        <w:t xml:space="preserve">        +submitRegistration()</w:t>
+      </w:r>
+    </w:p>
+    <w:p>
+      <w:pPr>
+        <w:pStyle w:val="CodeBlock"/>
+      </w:pPr>
+      <w:r>
+        <w:t xml:space="preserve">        +showConfirmation()</w:t>
+      </w:r>
+    </w:p>
+    <w:p>
+      <w:pPr>
+        <w:pStyle w:val="CodeBlock"/>
+      </w:pPr>
+      <w:r>
+        <w:t xml:space="preserve">    }</w:t>
+      </w:r>
+    </w:p>
+    <w:p>
+      <w:pPr>
+        <w:pStyle w:val="CodeBlock"/>
+      </w:pPr>
+      <w:r>
+        <w:t xml:space="preserve"> </w:t>
+      </w:r>
+    </w:p>
+    <w:p>
+      <w:pPr>
+        <w:pStyle w:val="CodeBlock"/>
+      </w:pPr>
+      <w:r>
+        <w:t xml:space="preserve">    class GuestListUI {</w:t>
+      </w:r>
+    </w:p>
+    <w:p>
+      <w:pPr>
+        <w:pStyle w:val="CodeBlock"/>
+      </w:pPr>
+      <w:r>
+        <w:t xml:space="preserve">        +renderGuestList()</w:t>
+      </w:r>
+    </w:p>
+    <w:p>
+      <w:pPr>
+        <w:pStyle w:val="CodeBlock"/>
+      </w:pPr>
+      <w:r>
+        <w:t xml:space="preserve">        +filterGuests()</w:t>
+      </w:r>
+    </w:p>
+    <w:p>
+      <w:pPr>
+        <w:pStyle w:val="CodeBlock"/>
+      </w:pPr>
+      <w:r>
+        <w:t xml:space="preserve">        +openCheckInScreen()</w:t>
+      </w:r>
+    </w:p>
+    <w:p>
+      <w:pPr>
+        <w:pStyle w:val="CodeBlock"/>
+      </w:pPr>
+      <w:r>
+        <w:t xml:space="preserve">    }</w:t>
+      </w:r>
+    </w:p>
+    <w:p>
+      <w:pPr>
+        <w:pStyle w:val="CodeBlock"/>
+      </w:pPr>
+      <w:r>
+        <w:t xml:space="preserve"> </w:t>
+      </w:r>
+    </w:p>
+    <w:p>
+      <w:pPr>
+        <w:pStyle w:val="CodeBlock"/>
+      </w:pPr>
+      <w:r>
+        <w:t xml:space="preserve">    class OfflineCheckInUI {</w:t>
+      </w:r>
+    </w:p>
+    <w:p>
+      <w:pPr>
+        <w:pStyle w:val="CodeBlock"/>
+      </w:pPr>
+      <w:r>
+        <w:t xml:space="preserve">        +searchGuest()</w:t>
+      </w:r>
+    </w:p>
+    <w:p>
+      <w:pPr>
+        <w:pStyle w:val="CodeBlock"/>
+      </w:pPr>
+      <w:r>
+        <w:t xml:space="preserve">        +confirmCheckIn()</w:t>
+      </w:r>
+    </w:p>
+    <w:p>
+      <w:pPr>
+        <w:pStyle w:val="CodeBlock"/>
+      </w:pPr>
+      <w:r>
+        <w:t xml:space="preserve">        +showAttendanceStatus()</w:t>
+      </w:r>
+    </w:p>
+    <w:p>
+      <w:pPr>
+        <w:pStyle w:val="CodeBlock"/>
+      </w:pPr>
+      <w:r>
+        <w:t xml:space="preserve">    }</w:t>
+      </w:r>
+    </w:p>
+    <w:p>
+      <w:pPr>
+        <w:pStyle w:val="CodeBlock"/>
+      </w:pPr>
+      <w:r>
+        <w:t xml:space="preserve"> </w:t>
+      </w:r>
+    </w:p>
+    <w:p>
+      <w:pPr>
+        <w:pStyle w:val="CodeBlock"/>
+      </w:pPr>
+      <w:r>
+        <w:t xml:space="preserve">    class AuthService {</w:t>
+      </w:r>
+    </w:p>
+    <w:p>
+      <w:pPr>
+        <w:pStyle w:val="CodeBlock"/>
+      </w:pPr>
+      <w:r>
+        <w:t xml:space="preserve">        +registerOrganizer()</w:t>
+      </w:r>
+    </w:p>
+    <w:p>
+      <w:pPr>
+        <w:pStyle w:val="CodeBlock"/>
+      </w:pPr>
+      <w:r>
+        <w:t xml:space="preserve">        +loginOrganizer()</w:t>
+      </w:r>
+    </w:p>
+    <w:p>
+      <w:pPr>
+        <w:pStyle w:val="CodeBlock"/>
+      </w:pPr>
+      <w:r>
+        <w:t xml:space="preserve">        +getCurrentOrganizer()</w:t>
+      </w:r>
+    </w:p>
+    <w:p>
+      <w:pPr>
+        <w:pStyle w:val="CodeBlock"/>
+      </w:pPr>
+      <w:r>
+        <w:t xml:space="preserve">    }</w:t>
+      </w:r>
+    </w:p>
+    <w:p>
+      <w:pPr>
+        <w:pStyle w:val="CodeBlock"/>
+      </w:pPr>
+      <w:r>
+        <w:t xml:space="preserve"> </w:t>
+      </w:r>
+    </w:p>
+    <w:p>
+      <w:pPr>
+        <w:pStyle w:val="CodeBlock"/>
+      </w:pPr>
+      <w:r>
+        <w:t xml:space="preserve">    class EventService {</w:t>
+      </w:r>
+    </w:p>
+    <w:p>
+      <w:pPr>
+        <w:pStyle w:val="CodeBlock"/>
+      </w:pPr>
+      <w:r>
+        <w:t xml:space="preserve">        +createEvent()</w:t>
+      </w:r>
+    </w:p>
+    <w:p>
+      <w:pPr>
+        <w:pStyle w:val="CodeBlock"/>
+      </w:pPr>
+      <w:r>
+        <w:t xml:space="preserve">        +updateEvent()</w:t>
+      </w:r>
+    </w:p>
+    <w:p>
+      <w:pPr>
+        <w:pStyle w:val="CodeBlock"/>
+      </w:pPr>
+      <w:r>
+        <w:t xml:space="preserve">        +publishEvent()</w:t>
+      </w:r>
+    </w:p>
+    <w:p>
+      <w:pPr>
+        <w:pStyle w:val="CodeBlock"/>
+      </w:pPr>
+      <w:r>
+        <w:t xml:space="preserve">        +getPublicEventBySlug()</w:t>
+      </w:r>
+    </w:p>
+    <w:p>
+      <w:pPr>
+        <w:pStyle w:val="CodeBlock"/>
+      </w:pPr>
+      <w:r>
+        <w:t xml:space="preserve">    }</w:t>
+      </w:r>
+    </w:p>
+    <w:p>
+      <w:pPr>
+        <w:pStyle w:val="CodeBlock"/>
+      </w:pPr>
+      <w:r>
+        <w:t xml:space="preserve"> </w:t>
+      </w:r>
+    </w:p>
+    <w:p>
+      <w:pPr>
+        <w:pStyle w:val="CodeBlock"/>
+      </w:pPr>
+      <w:r>
+        <w:t xml:space="preserve">    class GuestService {</w:t>
+      </w:r>
+    </w:p>
+    <w:p>
+      <w:pPr>
+        <w:pStyle w:val="CodeBlock"/>
+      </w:pPr>
+      <w:r>
+        <w:t xml:space="preserve">        +registerGuest()</w:t>
+      </w:r>
+    </w:p>
+    <w:p>
+      <w:pPr>
+        <w:pStyle w:val="CodeBlock"/>
+      </w:pPr>
+      <w:r>
+        <w:t xml:space="preserve">        +listGuestsByEvent()</w:t>
+      </w:r>
+    </w:p>
+    <w:p>
+      <w:pPr>
+        <w:pStyle w:val="CodeBlock"/>
+      </w:pPr>
+      <w:r>
+        <w:t xml:space="preserve">        +getGuestById()</w:t>
+      </w:r>
+    </w:p>
+    <w:p>
+      <w:pPr>
+        <w:pStyle w:val="CodeBlock"/>
+      </w:pPr>
+      <w:r>
+        <w:t xml:space="preserve">    }</w:t>
+      </w:r>
+    </w:p>
+    <w:p>
+      <w:pPr>
+        <w:pStyle w:val="CodeBlock"/>
+      </w:pPr>
+      <w:r>
+        <w:t xml:space="preserve"> </w:t>
+      </w:r>
+    </w:p>
+    <w:p>
+      <w:pPr>
+        <w:pStyle w:val="CodeBlock"/>
+      </w:pPr>
+      <w:r>
+        <w:t xml:space="preserve">    class VenueLocationService {</w:t>
+      </w:r>
+    </w:p>
+    <w:p>
+      <w:pPr>
+        <w:pStyle w:val="CodeBlock"/>
+      </w:pPr>
+      <w:r>
+        <w:t xml:space="preserve">        +saveVenueLocation()</w:t>
+      </w:r>
+    </w:p>
+    <w:p>
+      <w:pPr>
+        <w:pStyle w:val="CodeBlock"/>
+      </w:pPr>
+      <w:r>
+        <w:t xml:space="preserve">        +buildDirectionsUrl()</w:t>
+      </w:r>
+    </w:p>
+    <w:p>
+      <w:pPr>
+        <w:pStyle w:val="CodeBlock"/>
+      </w:pPr>
+      <w:r>
+        <w:t xml:space="preserve">        +mapPlaceToVenueFields()</w:t>
+      </w:r>
+    </w:p>
+    <w:p>
+      <w:pPr>
+        <w:pStyle w:val="CodeBlock"/>
+      </w:pPr>
+      <w:r>
+        <w:t xml:space="preserve">    }</w:t>
+      </w:r>
+    </w:p>
+    <w:p>
+      <w:pPr>
+        <w:pStyle w:val="CodeBlock"/>
+      </w:pPr>
+      <w:r>
+        <w:t xml:space="preserve"> </w:t>
+      </w:r>
+    </w:p>
+    <w:p>
+      <w:pPr>
+        <w:pStyle w:val="CodeBlock"/>
+      </w:pPr>
+      <w:r>
+        <w:t xml:space="preserve">    class CheckInService {</w:t>
+      </w:r>
+    </w:p>
+    <w:p>
+      <w:pPr>
+        <w:pStyle w:val="CodeBlock"/>
+      </w:pPr>
+      <w:r>
+        <w:t xml:space="preserve">        +checkInGuest()</w:t>
+      </w:r>
+    </w:p>
+    <w:p>
+      <w:pPr>
+        <w:pStyle w:val="CodeBlock"/>
+      </w:pPr>
+      <w:r>
+        <w:t xml:space="preserve">        +getAttendanceStatus()</w:t>
+      </w:r>
+    </w:p>
+    <w:p>
+      <w:pPr>
+        <w:pStyle w:val="CodeBlock"/>
+      </w:pPr>
+      <w:r>
+        <w:t xml:space="preserve">        +preventDuplicateCheckIn()</w:t>
+      </w:r>
+    </w:p>
+    <w:p>
+      <w:pPr>
+        <w:pStyle w:val="CodeBlock"/>
+      </w:pPr>
+      <w:r>
+        <w:t xml:space="preserve">    }</w:t>
+      </w:r>
+    </w:p>
+    <w:p>
+      <w:pPr>
+        <w:pStyle w:val="CodeBlock"/>
+      </w:pPr>
+      <w:r>
+        <w:t xml:space="preserve"> </w:t>
+      </w:r>
+    </w:p>
+    <w:p>
+      <w:pPr>
+        <w:pStyle w:val="CodeBlock"/>
+      </w:pPr>
+      <w:r>
+        <w:t xml:space="preserve">    class User {</w:t>
+      </w:r>
+    </w:p>
+    <w:p>
+      <w:pPr>
+        <w:pStyle w:val="CodeBlock"/>
+      </w:pPr>
+      <w:r>
+        <w:t xml:space="preserve">        +uuid id</w:t>
+      </w:r>
+    </w:p>
+    <w:p>
+      <w:pPr>
+        <w:pStyle w:val="CodeBlock"/>
+      </w:pPr>
+      <w:r>
+        <w:t xml:space="preserve">        +string email</w:t>
+      </w:r>
+    </w:p>
+    <w:p>
+      <w:pPr>
+        <w:pStyle w:val="CodeBlock"/>
+      </w:pPr>
+      <w:r>
+        <w:t xml:space="preserve">        +string name</w:t>
+      </w:r>
+    </w:p>
+    <w:p>
+      <w:pPr>
+        <w:pStyle w:val="CodeBlock"/>
+      </w:pPr>
+      <w:r>
+        <w:t xml:space="preserve">        +string role</w:t>
+      </w:r>
+    </w:p>
+    <w:p>
+      <w:pPr>
+        <w:pStyle w:val="CodeBlock"/>
+      </w:pPr>
+      <w:r>
+        <w:t xml:space="preserve">    }</w:t>
+      </w:r>
+    </w:p>
+    <w:p>
+      <w:pPr>
+        <w:pStyle w:val="CodeBlock"/>
+      </w:pPr>
+      <w:r>
+        <w:t xml:space="preserve"> </w:t>
+      </w:r>
+    </w:p>
+    <w:p>
+      <w:pPr>
+        <w:pStyle w:val="CodeBlock"/>
+      </w:pPr>
+      <w:r>
+        <w:t xml:space="preserve">    class Event {</w:t>
+      </w:r>
+    </w:p>
+    <w:p>
+      <w:pPr>
+        <w:pStyle w:val="CodeBlock"/>
+      </w:pPr>
+      <w:r>
+        <w:t xml:space="preserve">        +uuid id</w:t>
+      </w:r>
+    </w:p>
+    <w:p>
+      <w:pPr>
+        <w:pStyle w:val="CodeBlock"/>
+      </w:pPr>
+      <w:r>
+        <w:t xml:space="preserve">        +uuid organizerId</w:t>
+      </w:r>
+    </w:p>
+    <w:p>
+      <w:pPr>
+        <w:pStyle w:val="CodeBlock"/>
+      </w:pPr>
+      <w:r>
+        <w:t xml:space="preserve">        +string slug</w:t>
+      </w:r>
+    </w:p>
+    <w:p>
+      <w:pPr>
+        <w:pStyle w:val="CodeBlock"/>
+      </w:pPr>
+      <w:r>
+        <w:t xml:space="preserve">        +string title</w:t>
+      </w:r>
+    </w:p>
+    <w:p>
+      <w:pPr>
+        <w:pStyle w:val="CodeBlock"/>
+      </w:pPr>
+      <w:r>
+        <w:t xml:space="preserve">        +string status</w:t>
+      </w:r>
+    </w:p>
+    <w:p>
+      <w:pPr>
+        <w:pStyle w:val="CodeBlock"/>
+      </w:pPr>
+      <w:r>
+        <w:t xml:space="preserve">        +int capacity</w:t>
+      </w:r>
+    </w:p>
+    <w:p>
+      <w:pPr>
+        <w:pStyle w:val="CodeBlock"/>
+      </w:pPr>
+      <w:r>
+        <w:t xml:space="preserve">        +string placeId</w:t>
+      </w:r>
+    </w:p>
+    <w:p>
+      <w:pPr>
+        <w:pStyle w:val="CodeBlock"/>
+      </w:pPr>
+      <w:r>
+        <w:t xml:space="preserve">        +float latitude</w:t>
+      </w:r>
+    </w:p>
+    <w:p>
+      <w:pPr>
+        <w:pStyle w:val="CodeBlock"/>
+      </w:pPr>
+      <w:r>
+        <w:t xml:space="preserve">        +float longitude</w:t>
+      </w:r>
+    </w:p>
+    <w:p>
+      <w:pPr>
+        <w:pStyle w:val="CodeBlock"/>
+      </w:pPr>
+      <w:r>
+        <w:t xml:space="preserve">    }</w:t>
+      </w:r>
+    </w:p>
+    <w:p>
+      <w:pPr>
+        <w:pStyle w:val="CodeBlock"/>
+      </w:pPr>
+      <w:r>
+        <w:t xml:space="preserve"> </w:t>
+      </w:r>
+    </w:p>
+    <w:p>
+      <w:pPr>
+        <w:pStyle w:val="CodeBlock"/>
+      </w:pPr>
+      <w:r>
+        <w:t xml:space="preserve">    class Guest {</w:t>
+      </w:r>
+    </w:p>
+    <w:p>
+      <w:pPr>
+        <w:pStyle w:val="CodeBlock"/>
+      </w:pPr>
+      <w:r>
+        <w:t xml:space="preserve">        +uuid id</w:t>
+      </w:r>
+    </w:p>
+    <w:p>
+      <w:pPr>
+        <w:pStyle w:val="CodeBlock"/>
+      </w:pPr>
+      <w:r>
+        <w:t xml:space="preserve">        +uuid eventId</w:t>
+      </w:r>
+    </w:p>
+    <w:p>
+      <w:pPr>
+        <w:pStyle w:val="CodeBlock"/>
+      </w:pPr>
+      <w:r>
+        <w:t xml:space="preserve">        +string fullName</w:t>
+      </w:r>
+    </w:p>
+    <w:p>
+      <w:pPr>
+        <w:pStyle w:val="CodeBlock"/>
+      </w:pPr>
+      <w:r>
+        <w:t xml:space="preserve">        +string email</w:t>
+      </w:r>
+    </w:p>
+    <w:p>
+      <w:pPr>
+        <w:pStyle w:val="CodeBlock"/>
+      </w:pPr>
+      <w:r>
+        <w:t xml:space="preserve">        +string phone</w:t>
+      </w:r>
+    </w:p>
+    <w:p>
+      <w:pPr>
+        <w:pStyle w:val="CodeBlock"/>
+      </w:pPr>
+      <w:r>
+        <w:t xml:space="preserve">        +string tier</w:t>
+      </w:r>
+    </w:p>
+    <w:p>
+      <w:pPr>
+        <w:pStyle w:val="CodeBlock"/>
+      </w:pPr>
+      <w:r>
+        <w:t xml:space="preserve">        +string status</w:t>
+      </w:r>
+    </w:p>
+    <w:p>
+      <w:pPr>
+        <w:pStyle w:val="CodeBlock"/>
+      </w:pPr>
+      <w:r>
+        <w:t xml:space="preserve">        +datetime checkedInAt</w:t>
+      </w:r>
+    </w:p>
+    <w:p>
+      <w:pPr>
+        <w:pStyle w:val="CodeBlock"/>
+      </w:pPr>
+      <w:r>
+        <w:t xml:space="preserve">    }</w:t>
+      </w:r>
+    </w:p>
+    <w:p>
+      <w:pPr>
+        <w:pStyle w:val="CodeBlock"/>
+      </w:pPr>
+      <w:r>
+        <w:t xml:space="preserve"> </w:t>
+      </w:r>
+    </w:p>
+    <w:p>
+      <w:pPr>
+        <w:pStyle w:val="CodeBlock"/>
+      </w:pPr>
+      <w:r>
+        <w:t xml:space="preserve">    class AgendaItem {</w:t>
+      </w:r>
+    </w:p>
+    <w:p>
+      <w:pPr>
+        <w:pStyle w:val="CodeBlock"/>
+      </w:pPr>
+      <w:r>
+        <w:t xml:space="preserve">        +uuid id</w:t>
+      </w:r>
+    </w:p>
+    <w:p>
+      <w:pPr>
+        <w:pStyle w:val="CodeBlock"/>
+      </w:pPr>
+      <w:r>
+        <w:t xml:space="preserve">        +uuid eventId</w:t>
+      </w:r>
+    </w:p>
+    <w:p>
+      <w:pPr>
+        <w:pStyle w:val="CodeBlock"/>
+      </w:pPr>
+      <w:r>
+        <w:t xml:space="preserve">        +uuid speakerId</w:t>
+      </w:r>
+    </w:p>
+    <w:p>
+      <w:pPr>
+        <w:pStyle w:val="CodeBlock"/>
+      </w:pPr>
+      <w:r>
+        <w:t xml:space="preserve">        +string title</w:t>
+      </w:r>
+    </w:p>
+    <w:p>
+      <w:pPr>
+        <w:pStyle w:val="CodeBlock"/>
+      </w:pPr>
+      <w:r>
+        <w:t xml:space="preserve">        +datetime startTime</w:t>
+      </w:r>
+    </w:p>
+    <w:p>
+      <w:pPr>
+        <w:pStyle w:val="CodeBlock"/>
+      </w:pPr>
+      <w:r>
+        <w:t xml:space="preserve">        +datetime endTime</w:t>
+      </w:r>
+    </w:p>
+    <w:p>
+      <w:pPr>
+        <w:pStyle w:val="CodeBlock"/>
+      </w:pPr>
+      <w:r>
+        <w:t xml:space="preserve">    }</w:t>
+      </w:r>
+    </w:p>
+    <w:p>
+      <w:pPr>
+        <w:pStyle w:val="CodeBlock"/>
+      </w:pPr>
+      <w:r>
+        <w:t xml:space="preserve"> </w:t>
+      </w:r>
+    </w:p>
+    <w:p>
+      <w:pPr>
+        <w:pStyle w:val="CodeBlock"/>
+      </w:pPr>
+      <w:r>
+        <w:t xml:space="preserve">    class Speaker {</w:t>
+      </w:r>
+    </w:p>
+    <w:p>
+      <w:pPr>
+        <w:pStyle w:val="CodeBlock"/>
+      </w:pPr>
+      <w:r>
+        <w:t xml:space="preserve">        +uuid id</w:t>
+      </w:r>
+    </w:p>
+    <w:p>
+      <w:pPr>
+        <w:pStyle w:val="CodeBlock"/>
+      </w:pPr>
+      <w:r>
+        <w:t xml:space="preserve">        +uuid eventId</w:t>
+      </w:r>
+    </w:p>
+    <w:p>
+      <w:pPr>
+        <w:pStyle w:val="CodeBlock"/>
+      </w:pPr>
+      <w:r>
+        <w:t xml:space="preserve">        +string fullName</w:t>
+      </w:r>
+    </w:p>
+    <w:p>
+      <w:pPr>
+        <w:pStyle w:val="CodeBlock"/>
+      </w:pPr>
+      <w:r>
+        <w:t xml:space="preserve">        +string jobTitle</w:t>
+      </w:r>
+    </w:p>
+    <w:p>
+      <w:pPr>
+        <w:pStyle w:val="CodeBlock"/>
+      </w:pPr>
+      <w:r>
+        <w:t xml:space="preserve">        +string bio</w:t>
+      </w:r>
+    </w:p>
+    <w:p>
+      <w:pPr>
+        <w:pStyle w:val="CodeBlock"/>
+      </w:pPr>
+      <w:r>
+        <w:t xml:space="preserve">    }</w:t>
+      </w:r>
+    </w:p>
+    <w:p>
+      <w:pPr>
+        <w:pStyle w:val="CodeBlock"/>
+      </w:pPr>
+      <w:r>
+        <w:t xml:space="preserve"> </w:t>
+      </w:r>
+    </w:p>
+    <w:p>
+      <w:pPr>
+        <w:pStyle w:val="CodeBlock"/>
+      </w:pPr>
+      <w:r>
+        <w:t xml:space="preserve">    AuthUI --&gt; AuthService : uses</w:t>
+      </w:r>
+    </w:p>
+    <w:p>
+      <w:pPr>
+        <w:pStyle w:val="CodeBlock"/>
+      </w:pPr>
+      <w:r>
+        <w:t xml:space="preserve">    EventManagementUI --&gt; EventService : uses</w:t>
+      </w:r>
+    </w:p>
+    <w:p>
+      <w:pPr>
+        <w:pStyle w:val="CodeBlock"/>
+      </w:pPr>
+      <w:r>
+        <w:t xml:space="preserve">    EventManagementUI --&gt; GuestService : reads guests</w:t>
+      </w:r>
+    </w:p>
+    <w:p>
+      <w:pPr>
+        <w:pStyle w:val="CodeBlock"/>
+      </w:pPr>
+      <w:r>
+        <w:t xml:space="preserve">    PublicEventPage --&gt; EventService : loads event</w:t>
+      </w:r>
+    </w:p>
+    <w:p>
+      <w:pPr>
+        <w:pStyle w:val="CodeBlock"/>
+      </w:pPr>
+      <w:r>
+        <w:t xml:space="preserve">    PublicEventPage --&gt; VenueLocationService : gets map data</w:t>
+      </w:r>
+    </w:p>
+    <w:p>
+      <w:pPr>
+        <w:pStyle w:val="CodeBlock"/>
+      </w:pPr>
+      <w:r>
+        <w:t xml:space="preserve">    GuestRegistrationUI --&gt; GuestService : registers guest</w:t>
+      </w:r>
+    </w:p>
+    <w:p>
+      <w:pPr>
+        <w:pStyle w:val="CodeBlock"/>
+      </w:pPr>
+      <w:r>
+        <w:t xml:space="preserve">    GuestListUI --&gt; GuestService : lists guests</w:t>
+      </w:r>
+    </w:p>
+    <w:p>
+      <w:pPr>
+        <w:pStyle w:val="CodeBlock"/>
+      </w:pPr>
+      <w:r>
+        <w:t xml:space="preserve">    OfflineCheckInUI --&gt; CheckInService : checks in guest</w:t>
+      </w:r>
+    </w:p>
+    <w:p>
+      <w:pPr>
+        <w:pStyle w:val="CodeBlock"/>
+      </w:pPr>
+      <w:r>
+        <w:t xml:space="preserve">    CheckInService --&gt; GuestService : reads guest</w:t>
+      </w:r>
+    </w:p>
+    <w:p>
+      <w:pPr>
+        <w:pStyle w:val="CodeBlock"/>
+      </w:pPr>
+      <w:r>
+        <w:t xml:space="preserve"> </w:t>
+      </w:r>
+    </w:p>
+    <w:p>
+      <w:pPr>
+        <w:pStyle w:val="CodeBlock"/>
+      </w:pPr>
+      <w:r>
+        <w:t xml:space="preserve">    User "1" --&gt; "many" Event : creates</w:t>
+      </w:r>
+    </w:p>
+    <w:p>
+      <w:pPr>
+        <w:pStyle w:val="CodeBlock"/>
+      </w:pPr>
+      <w:r>
+        <w:t xml:space="preserve">    Event "1" --&gt; "many" Guest : contains</w:t>
+      </w:r>
+    </w:p>
+    <w:p>
+      <w:pPr>
+        <w:pStyle w:val="CodeBlock"/>
+      </w:pPr>
+      <w:r>
+        <w:t xml:space="preserve">    Event "1" --&gt; "many" AgendaItem : schedules</w:t>
+      </w:r>
+    </w:p>
+    <w:p>
+      <w:pPr>
+        <w:pStyle w:val="CodeBlock"/>
+      </w:pPr>
+      <w:r>
+        <w:t xml:space="preserve">    Event "1" --&gt; "many" Speaker : features</w:t>
+      </w:r>
+    </w:p>
+    <w:p>
+      <w:pPr>
+        <w:pStyle w:val="CodeBlock"/>
+      </w:pPr>
+      <w:r>
+        <w:t xml:space="preserve">    Speaker "0..1" --&gt; "many" AgendaItem : presents</w:t>
+      </w:r>
+    </w:p>
+    <w:p/>
+    <w:p>
+      <w:pPr>
+        <w:pStyle w:val="Heading2"/>
+      </w:pPr>
+      <w:r>
+        <w:t>Database ER Diagram</w:t>
+      </w:r>
+    </w:p>
+    <w:p/>
+    <w:p>
+      <w:pPr>
+        <w:pStyle w:val="IntenseQuote"/>
+      </w:pPr>
+      <w:r>
+        <w:t>MERMAID</w:t>
+      </w:r>
+    </w:p>
+    <w:p>
+      <w:pPr>
+        <w:pStyle w:val="CodeBlock"/>
+      </w:pPr>
+      <w:r>
+        <w:t>erDiagram</w:t>
+      </w:r>
+    </w:p>
+    <w:p>
+      <w:pPr>
+        <w:pStyle w:val="CodeBlock"/>
+      </w:pPr>
+      <w:r>
+        <w:t xml:space="preserve">    USERS ||--o{ EVENTS : creates</w:t>
+      </w:r>
+    </w:p>
+    <w:p>
+      <w:pPr>
+        <w:pStyle w:val="CodeBlock"/>
+      </w:pPr>
+      <w:r>
+        <w:t xml:space="preserve">    EVENTS ||--o{ GUESTS : registers</w:t>
+      </w:r>
+    </w:p>
+    <w:p>
+      <w:pPr>
+        <w:pStyle w:val="CodeBlock"/>
+      </w:pPr>
+      <w:r>
+        <w:t xml:space="preserve">    EVENTS ||--o{ AGENDA_ITEMS : includes</w:t>
+      </w:r>
+    </w:p>
+    <w:p>
+      <w:pPr>
+        <w:pStyle w:val="CodeBlock"/>
+      </w:pPr>
+      <w:r>
+        <w:t xml:space="preserve">    EVENTS ||--o{ SPEAKERS : features</w:t>
+      </w:r>
+    </w:p>
+    <w:p>
+      <w:pPr>
+        <w:pStyle w:val="CodeBlock"/>
+      </w:pPr>
+      <w:r>
+        <w:t xml:space="preserve">    SPEAKERS o|--o{ AGENDA_ITEMS : may_present</w:t>
+      </w:r>
+    </w:p>
+    <w:p>
+      <w:pPr>
+        <w:pStyle w:val="CodeBlock"/>
+      </w:pPr>
+      <w:r>
+        <w:t xml:space="preserve"> </w:t>
+      </w:r>
+    </w:p>
+    <w:p>
+      <w:pPr>
+        <w:pStyle w:val="CodeBlock"/>
+      </w:pPr>
+      <w:r>
+        <w:t xml:space="preserve">    USERS {</w:t>
+      </w:r>
+    </w:p>
+    <w:p>
+      <w:pPr>
+        <w:pStyle w:val="CodeBlock"/>
+      </w:pPr>
+      <w:r>
+        <w:t xml:space="preserve">        uuid id PK</w:t>
+      </w:r>
+    </w:p>
+    <w:p>
+      <w:pPr>
+        <w:pStyle w:val="CodeBlock"/>
+      </w:pPr>
+      <w:r>
+        <w:t xml:space="preserve">        string email</w:t>
+      </w:r>
+    </w:p>
+    <w:p>
+      <w:pPr>
+        <w:pStyle w:val="CodeBlock"/>
+      </w:pPr>
+      <w:r>
+        <w:t xml:space="preserve">        string name</w:t>
+      </w:r>
+    </w:p>
+    <w:p>
+      <w:pPr>
+        <w:pStyle w:val="CodeBlock"/>
+      </w:pPr>
+      <w:r>
+        <w:t xml:space="preserve">        string role</w:t>
+      </w:r>
+    </w:p>
+    <w:p>
+      <w:pPr>
+        <w:pStyle w:val="CodeBlock"/>
+      </w:pPr>
+      <w:r>
+        <w:t xml:space="preserve">        datetime created_at</w:t>
+      </w:r>
+    </w:p>
+    <w:p>
+      <w:pPr>
+        <w:pStyle w:val="CodeBlock"/>
+      </w:pPr>
+      <w:r>
+        <w:t xml:space="preserve">    }</w:t>
+      </w:r>
+    </w:p>
+    <w:p>
+      <w:pPr>
+        <w:pStyle w:val="CodeBlock"/>
+      </w:pPr>
+      <w:r>
+        <w:t xml:space="preserve"> </w:t>
+      </w:r>
+    </w:p>
+    <w:p>
+      <w:pPr>
+        <w:pStyle w:val="CodeBlock"/>
+      </w:pPr>
+      <w:r>
+        <w:t xml:space="preserve">    EVENTS {</w:t>
+      </w:r>
+    </w:p>
+    <w:p>
+      <w:pPr>
+        <w:pStyle w:val="CodeBlock"/>
+      </w:pPr>
+      <w:r>
+        <w:t xml:space="preserve">        uuid id PK</w:t>
+      </w:r>
+    </w:p>
+    <w:p>
+      <w:pPr>
+        <w:pStyle w:val="CodeBlock"/>
+      </w:pPr>
+      <w:r>
+        <w:t xml:space="preserve">        uuid organizer_id FK</w:t>
+      </w:r>
+    </w:p>
+    <w:p>
+      <w:pPr>
+        <w:pStyle w:val="CodeBlock"/>
+      </w:pPr>
+      <w:r>
+        <w:t xml:space="preserve">        string slug</w:t>
+      </w:r>
+    </w:p>
+    <w:p>
+      <w:pPr>
+        <w:pStyle w:val="CodeBlock"/>
+      </w:pPr>
+      <w:r>
+        <w:t xml:space="preserve">        string title</w:t>
+      </w:r>
+    </w:p>
+    <w:p>
+      <w:pPr>
+        <w:pStyle w:val="CodeBlock"/>
+      </w:pPr>
+      <w:r>
+        <w:t xml:space="preserve">        string status</w:t>
+      </w:r>
+    </w:p>
+    <w:p>
+      <w:pPr>
+        <w:pStyle w:val="CodeBlock"/>
+      </w:pPr>
+      <w:r>
+        <w:t xml:space="preserve">        datetime start_date</w:t>
+      </w:r>
+    </w:p>
+    <w:p>
+      <w:pPr>
+        <w:pStyle w:val="CodeBlock"/>
+      </w:pPr>
+      <w:r>
+        <w:t xml:space="preserve">        datetime end_date</w:t>
+      </w:r>
+    </w:p>
+    <w:p>
+      <w:pPr>
+        <w:pStyle w:val="CodeBlock"/>
+      </w:pPr>
+      <w:r>
+        <w:t xml:space="preserve">        string venue_name</w:t>
+      </w:r>
+    </w:p>
+    <w:p>
+      <w:pPr>
+        <w:pStyle w:val="CodeBlock"/>
+      </w:pPr>
+      <w:r>
+        <w:t xml:space="preserve">        string venue_address</w:t>
+      </w:r>
+    </w:p>
+    <w:p>
+      <w:pPr>
+        <w:pStyle w:val="CodeBlock"/>
+      </w:pPr>
+      <w:r>
+        <w:t xml:space="preserve">        string city</w:t>
+      </w:r>
+    </w:p>
+    <w:p>
+      <w:pPr>
+        <w:pStyle w:val="CodeBlock"/>
+      </w:pPr>
+      <w:r>
+        <w:t xml:space="preserve">        string place_id</w:t>
+      </w:r>
+    </w:p>
+    <w:p>
+      <w:pPr>
+        <w:pStyle w:val="CodeBlock"/>
+      </w:pPr>
+      <w:r>
+        <w:t xml:space="preserve">        float latitude</w:t>
+      </w:r>
+    </w:p>
+    <w:p>
+      <w:pPr>
+        <w:pStyle w:val="CodeBlock"/>
+      </w:pPr>
+      <w:r>
+        <w:t xml:space="preserve">        float longitude</w:t>
+      </w:r>
+    </w:p>
+    <w:p>
+      <w:pPr>
+        <w:pStyle w:val="CodeBlock"/>
+      </w:pPr>
+      <w:r>
+        <w:t xml:space="preserve">        int capacity</w:t>
+      </w:r>
+    </w:p>
+    <w:p>
+      <w:pPr>
+        <w:pStyle w:val="CodeBlock"/>
+      </w:pPr>
+      <w:r>
+        <w:t xml:space="preserve">        json brand_config</w:t>
+      </w:r>
+    </w:p>
+    <w:p>
+      <w:pPr>
+        <w:pStyle w:val="CodeBlock"/>
+      </w:pPr>
+      <w:r>
+        <w:t xml:space="preserve">        datetime created_at</w:t>
+      </w:r>
+    </w:p>
+    <w:p>
+      <w:pPr>
+        <w:pStyle w:val="CodeBlock"/>
+      </w:pPr>
+      <w:r>
+        <w:t xml:space="preserve">    }</w:t>
+      </w:r>
+    </w:p>
+    <w:p>
+      <w:pPr>
+        <w:pStyle w:val="CodeBlock"/>
+      </w:pPr>
+      <w:r>
+        <w:t xml:space="preserve"> </w:t>
+      </w:r>
+    </w:p>
+    <w:p>
+      <w:pPr>
+        <w:pStyle w:val="CodeBlock"/>
+      </w:pPr>
+      <w:r>
+        <w:t xml:space="preserve">    GUESTS {</w:t>
+      </w:r>
+    </w:p>
+    <w:p>
+      <w:pPr>
+        <w:pStyle w:val="CodeBlock"/>
+      </w:pPr>
+      <w:r>
+        <w:t xml:space="preserve">        uuid id PK</w:t>
+      </w:r>
+    </w:p>
+    <w:p>
+      <w:pPr>
+        <w:pStyle w:val="CodeBlock"/>
+      </w:pPr>
+      <w:r>
+        <w:t xml:space="preserve">        uuid event_id FK</w:t>
+      </w:r>
+    </w:p>
+    <w:p>
+      <w:pPr>
+        <w:pStyle w:val="CodeBlock"/>
+      </w:pPr>
+      <w:r>
+        <w:t xml:space="preserve">        string full_name</w:t>
+      </w:r>
+    </w:p>
+    <w:p>
+      <w:pPr>
+        <w:pStyle w:val="CodeBlock"/>
+      </w:pPr>
+      <w:r>
+        <w:t xml:space="preserve">        string email</w:t>
+      </w:r>
+    </w:p>
+    <w:p>
+      <w:pPr>
+        <w:pStyle w:val="CodeBlock"/>
+      </w:pPr>
+      <w:r>
+        <w:t xml:space="preserve">        string phone</w:t>
+      </w:r>
+    </w:p>
+    <w:p>
+      <w:pPr>
+        <w:pStyle w:val="CodeBlock"/>
+      </w:pPr>
+      <w:r>
+        <w:t xml:space="preserve">        string tier</w:t>
+      </w:r>
+    </w:p>
+    <w:p>
+      <w:pPr>
+        <w:pStyle w:val="CodeBlock"/>
+      </w:pPr>
+      <w:r>
+        <w:t xml:space="preserve">        string status</w:t>
+      </w:r>
+    </w:p>
+    <w:p>
+      <w:pPr>
+        <w:pStyle w:val="CodeBlock"/>
+      </w:pPr>
+      <w:r>
+        <w:t xml:space="preserve">        datetime checked_in_at</w:t>
+      </w:r>
+    </w:p>
+    <w:p>
+      <w:pPr>
+        <w:pStyle w:val="CodeBlock"/>
+      </w:pPr>
+      <w:r>
+        <w:t xml:space="preserve">        datetime created_at</w:t>
+      </w:r>
+    </w:p>
+    <w:p>
+      <w:pPr>
+        <w:pStyle w:val="CodeBlock"/>
+      </w:pPr>
+      <w:r>
+        <w:t xml:space="preserve">    }</w:t>
+      </w:r>
+    </w:p>
+    <w:p>
+      <w:pPr>
+        <w:pStyle w:val="CodeBlock"/>
+      </w:pPr>
+      <w:r>
+        <w:t xml:space="preserve"> </w:t>
+      </w:r>
+    </w:p>
+    <w:p>
+      <w:pPr>
+        <w:pStyle w:val="CodeBlock"/>
+      </w:pPr>
+      <w:r>
+        <w:t xml:space="preserve">    AGENDA_ITEMS {</w:t>
+      </w:r>
+    </w:p>
+    <w:p>
+      <w:pPr>
+        <w:pStyle w:val="CodeBlock"/>
+      </w:pPr>
+      <w:r>
+        <w:t xml:space="preserve">        uuid id PK</w:t>
+      </w:r>
+    </w:p>
+    <w:p>
+      <w:pPr>
+        <w:pStyle w:val="CodeBlock"/>
+      </w:pPr>
+      <w:r>
+        <w:t xml:space="preserve">        uuid event_id FK</w:t>
+      </w:r>
+    </w:p>
+    <w:p>
+      <w:pPr>
+        <w:pStyle w:val="CodeBlock"/>
+      </w:pPr>
+      <w:r>
+        <w:t xml:space="preserve">        uuid speaker_id FK</w:t>
+      </w:r>
+    </w:p>
+    <w:p>
+      <w:pPr>
+        <w:pStyle w:val="CodeBlock"/>
+      </w:pPr>
+      <w:r>
+        <w:t xml:space="preserve">        string title</w:t>
+      </w:r>
+    </w:p>
+    <w:p>
+      <w:pPr>
+        <w:pStyle w:val="CodeBlock"/>
+      </w:pPr>
+      <w:r>
+        <w:t xml:space="preserve">        string item_type</w:t>
+      </w:r>
+    </w:p>
+    <w:p>
+      <w:pPr>
+        <w:pStyle w:val="CodeBlock"/>
+      </w:pPr>
+      <w:r>
+        <w:t xml:space="preserve">        datetime start_time</w:t>
+      </w:r>
+    </w:p>
+    <w:p>
+      <w:pPr>
+        <w:pStyle w:val="CodeBlock"/>
+      </w:pPr>
+      <w:r>
+        <w:t xml:space="preserve">        datetime end_time</w:t>
+      </w:r>
+    </w:p>
+    <w:p>
+      <w:pPr>
+        <w:pStyle w:val="CodeBlock"/>
+      </w:pPr>
+      <w:r>
+        <w:t xml:space="preserve">        string location_name</w:t>
+      </w:r>
+    </w:p>
+    <w:p>
+      <w:pPr>
+        <w:pStyle w:val="CodeBlock"/>
+      </w:pPr>
+      <w:r>
+        <w:t xml:space="preserve">    }</w:t>
+      </w:r>
+    </w:p>
+    <w:p>
+      <w:pPr>
+        <w:pStyle w:val="CodeBlock"/>
+      </w:pPr>
+      <w:r>
+        <w:t xml:space="preserve"> </w:t>
+      </w:r>
+    </w:p>
+    <w:p>
+      <w:pPr>
+        <w:pStyle w:val="CodeBlock"/>
+      </w:pPr>
+      <w:r>
+        <w:t xml:space="preserve">    SPEAKERS {</w:t>
+      </w:r>
+    </w:p>
+    <w:p>
+      <w:pPr>
+        <w:pStyle w:val="CodeBlock"/>
+      </w:pPr>
+      <w:r>
+        <w:t xml:space="preserve">        uuid id PK</w:t>
+      </w:r>
+    </w:p>
+    <w:p>
+      <w:pPr>
+        <w:pStyle w:val="CodeBlock"/>
+      </w:pPr>
+      <w:r>
+        <w:t xml:space="preserve">        uuid event_id FK</w:t>
+      </w:r>
+    </w:p>
+    <w:p>
+      <w:pPr>
+        <w:pStyle w:val="CodeBlock"/>
+      </w:pPr>
+      <w:r>
+        <w:t xml:space="preserve">        string full_name</w:t>
+      </w:r>
+    </w:p>
+    <w:p>
+      <w:pPr>
+        <w:pStyle w:val="CodeBlock"/>
+      </w:pPr>
+      <w:r>
+        <w:t xml:space="preserve">        string job_title</w:t>
+      </w:r>
+    </w:p>
+    <w:p>
+      <w:pPr>
+        <w:pStyle w:val="CodeBlock"/>
+      </w:pPr>
+      <w:r>
+        <w:t xml:space="preserve">        string bio</w:t>
+      </w:r>
+    </w:p>
+    <w:p>
+      <w:pPr>
+        <w:pStyle w:val="CodeBlock"/>
+      </w:pPr>
+      <w:r>
+        <w:t xml:space="preserve">    }</w:t>
+      </w:r>
+    </w:p>
+    <w:p/>
+    <w:p>
+      <w:pPr>
+        <w:pStyle w:val="Heading2"/>
+      </w:pPr>
+      <w:r>
+        <w:t>Sequence: Organizer Authentication</w:t>
+      </w:r>
+    </w:p>
+    <w:p/>
+    <w:p>
+      <w:pPr>
+        <w:pStyle w:val="IntenseQuote"/>
+      </w:pPr>
+      <w:r>
+        <w:t>MERMAID</w:t>
+      </w:r>
+    </w:p>
+    <w:p>
+      <w:pPr>
+        <w:pStyle w:val="CodeBlock"/>
+      </w:pPr>
+      <w:r>
+        <w:t>sequenceDiagram</w:t>
+      </w:r>
+    </w:p>
+    <w:p>
+      <w:pPr>
+        <w:pStyle w:val="CodeBlock"/>
+      </w:pPr>
+      <w:r>
+        <w:t xml:space="preserve">    actor Organizer</w:t>
+      </w:r>
+    </w:p>
+    <w:p>
+      <w:pPr>
+        <w:pStyle w:val="CodeBlock"/>
+      </w:pPr>
+      <w:r>
+        <w:t xml:space="preserve">    participant UI as Auth UI</w:t>
+      </w:r>
+    </w:p>
+    <w:p>
+      <w:pPr>
+        <w:pStyle w:val="CodeBlock"/>
+      </w:pPr>
+      <w:r>
+        <w:t xml:space="preserve">    participant API as AuthService</w:t>
       </w:r>
     </w:p>
     <w:p>
@@ -2809,6 +5803,192 @@
         <w:pStyle w:val="CodeBlock"/>
       </w:pPr>
       <w:r>
+        <w:t xml:space="preserve">    participant DB as Supabase Postgres</w:t>
+      </w:r>
+    </w:p>
+    <w:p>
+      <w:pPr>
+        <w:pStyle w:val="CodeBlock"/>
+      </w:pPr>
+      <w:r>
+        <w:t xml:space="preserve"> </w:t>
+      </w:r>
+    </w:p>
+    <w:p>
+      <w:pPr>
+        <w:pStyle w:val="CodeBlock"/>
+      </w:pPr>
+      <w:r>
+        <w:t xml:space="preserve">    Organizer-&gt;&gt;UI: Open sign up or sign in screen</w:t>
+      </w:r>
+    </w:p>
+    <w:p>
+      <w:pPr>
+        <w:pStyle w:val="CodeBlock"/>
+      </w:pPr>
+      <w:r>
+        <w:t xml:space="preserve">    alt New organizer registration</w:t>
+      </w:r>
+    </w:p>
+    <w:p>
+      <w:pPr>
+        <w:pStyle w:val="CodeBlock"/>
+      </w:pPr>
+      <w:r>
+        <w:t xml:space="preserve">        Organizer-&gt;&gt;UI: Submit register form</w:t>
+      </w:r>
+    </w:p>
+    <w:p>
+      <w:pPr>
+        <w:pStyle w:val="CodeBlock"/>
+      </w:pPr>
+      <w:r>
+        <w:t xml:space="preserve">        UI-&gt;&gt;API: POST /api/auth/register</w:t>
+      </w:r>
+    </w:p>
+    <w:p>
+      <w:pPr>
+        <w:pStyle w:val="CodeBlock"/>
+      </w:pPr>
+      <w:r>
+        <w:t xml:space="preserve">        API-&gt;&gt;Auth: Create auth account</w:t>
+      </w:r>
+    </w:p>
+    <w:p>
+      <w:pPr>
+        <w:pStyle w:val="CodeBlock"/>
+      </w:pPr>
+      <w:r>
+        <w:t xml:space="preserve">        Auth-&gt;&gt;DB: Create organizer profile record</w:t>
+      </w:r>
+    </w:p>
+    <w:p>
+      <w:pPr>
+        <w:pStyle w:val="CodeBlock"/>
+      </w:pPr>
+      <w:r>
+        <w:t xml:space="preserve">        DB--&gt;&gt;Auth: Profile saved</w:t>
+      </w:r>
+    </w:p>
+    <w:p>
+      <w:pPr>
+        <w:pStyle w:val="CodeBlock"/>
+      </w:pPr>
+      <w:r>
+        <w:t xml:space="preserve">        Auth--&gt;&gt;API: Account created</w:t>
+      </w:r>
+    </w:p>
+    <w:p>
+      <w:pPr>
+        <w:pStyle w:val="CodeBlock"/>
+      </w:pPr>
+      <w:r>
+        <w:t xml:space="preserve">        API--&gt;&gt;UI: Registration success</w:t>
+      </w:r>
+    </w:p>
+    <w:p>
+      <w:pPr>
+        <w:pStyle w:val="CodeBlock"/>
+      </w:pPr>
+      <w:r>
+        <w:t xml:space="preserve">    else Existing organizer login</w:t>
+      </w:r>
+    </w:p>
+    <w:p>
+      <w:pPr>
+        <w:pStyle w:val="CodeBlock"/>
+      </w:pPr>
+      <w:r>
+        <w:t xml:space="preserve">        Organizer-&gt;&gt;UI: Submit login form</w:t>
+      </w:r>
+    </w:p>
+    <w:p>
+      <w:pPr>
+        <w:pStyle w:val="CodeBlock"/>
+      </w:pPr>
+      <w:r>
+        <w:t xml:space="preserve">        UI-&gt;&gt;API: POST /api/auth/login</w:t>
+      </w:r>
+    </w:p>
+    <w:p>
+      <w:pPr>
+        <w:pStyle w:val="CodeBlock"/>
+      </w:pPr>
+      <w:r>
+        <w:t xml:space="preserve">        API-&gt;&gt;Auth: Validate credentials</w:t>
+      </w:r>
+    </w:p>
+    <w:p>
+      <w:pPr>
+        <w:pStyle w:val="CodeBlock"/>
+      </w:pPr>
+      <w:r>
+        <w:t xml:space="preserve">        Auth--&gt;&gt;API: Session returned</w:t>
+      </w:r>
+    </w:p>
+    <w:p>
+      <w:pPr>
+        <w:pStyle w:val="CodeBlock"/>
+      </w:pPr>
+      <w:r>
+        <w:t xml:space="preserve">        API--&gt;&gt;UI: Authenticated session</w:t>
+      </w:r>
+    </w:p>
+    <w:p>
+      <w:pPr>
+        <w:pStyle w:val="CodeBlock"/>
+      </w:pPr>
+      <w:r>
+        <w:t xml:space="preserve">    end</w:t>
+      </w:r>
+    </w:p>
+    <w:p/>
+    <w:p>
+      <w:pPr>
+        <w:pStyle w:val="Heading2"/>
+      </w:pPr>
+      <w:r>
+        <w:t>Sequence: Create and Publish Event</w:t>
+      </w:r>
+    </w:p>
+    <w:p/>
+    <w:p>
+      <w:pPr>
+        <w:pStyle w:val="IntenseQuote"/>
+      </w:pPr>
+      <w:r>
+        <w:t>MERMAID</w:t>
+      </w:r>
+    </w:p>
+    <w:p>
+      <w:pPr>
+        <w:pStyle w:val="CodeBlock"/>
+      </w:pPr>
+      <w:r>
+        <w:t>sequenceDiagram</w:t>
+      </w:r>
+    </w:p>
+    <w:p>
+      <w:pPr>
+        <w:pStyle w:val="CodeBlock"/>
+      </w:pPr>
+      <w:r>
+        <w:t xml:space="preserve">    actor Organizer</w:t>
+      </w:r>
+    </w:p>
+    <w:p>
+      <w:pPr>
+        <w:pStyle w:val="CodeBlock"/>
+      </w:pPr>
+      <w:r>
+        <w:t xml:space="preserve">    participant UI as Event Management UI</w:t>
+      </w:r>
+    </w:p>
+    <w:p>
+      <w:pPr>
+        <w:pStyle w:val="CodeBlock"/>
+      </w:pPr>
+      <w:r>
         <w:t xml:space="preserve">    participant API as EventService</w:t>
       </w:r>
     </w:p>
@@ -2817,6 +5997,14 @@
         <w:pStyle w:val="CodeBlock"/>
       </w:pPr>
       <w:r>
+        <w:t xml:space="preserve">    participant Maps as VenueLocationService</w:t>
+      </w:r>
+    </w:p>
+    <w:p>
+      <w:pPr>
+        <w:pStyle w:val="CodeBlock"/>
+      </w:pPr>
+      <w:r>
         <w:t xml:space="preserve">    participant DB as Supabase Postgres</w:t>
       </w:r>
     </w:p>
@@ -2833,31 +6021,47 @@
         <w:pStyle w:val="CodeBlock"/>
       </w:pPr>
       <w:r>
-        <w:t xml:space="preserve">    Organizer-&gt;&gt;UI: Sign in with email and password</w:t>
-      </w:r>
-    </w:p>
-    <w:p>
-      <w:pPr>
-        <w:pStyle w:val="CodeBlock"/>
-      </w:pPr>
-      <w:r>
-        <w:t xml:space="preserve">    UI-&gt;&gt;Auth: Authenticate organizer</w:t>
-      </w:r>
-    </w:p>
-    <w:p>
-      <w:pPr>
-        <w:pStyle w:val="CodeBlock"/>
-      </w:pPr>
-      <w:r>
-        <w:t xml:space="preserve">    Auth--&gt;&gt;UI: Session returned</w:t>
-      </w:r>
-    </w:p>
-    <w:p>
-      <w:pPr>
-        <w:pStyle w:val="CodeBlock"/>
-      </w:pPr>
-      <w:r>
-        <w:t xml:space="preserve">    Organizer-&gt;&gt;UI: Submit create event form</w:t>
+        <w:t xml:space="preserve">    Organizer-&gt;&gt;UI: Open create event form</w:t>
+      </w:r>
+    </w:p>
+    <w:p>
+      <w:pPr>
+        <w:pStyle w:val="CodeBlock"/>
+      </w:pPr>
+      <w:r>
+        <w:t xml:space="preserve">    Organizer-&gt;&gt;UI: Enter title, dates, capacity, branding</w:t>
+      </w:r>
+    </w:p>
+    <w:p>
+      <w:pPr>
+        <w:pStyle w:val="CodeBlock"/>
+      </w:pPr>
+      <w:r>
+        <w:t xml:space="preserve">    Organizer-&gt;&gt;UI: Search venue</w:t>
+      </w:r>
+    </w:p>
+    <w:p>
+      <w:pPr>
+        <w:pStyle w:val="CodeBlock"/>
+      </w:pPr>
+      <w:r>
+        <w:t xml:space="preserve">    UI-&gt;&gt;Maps: Resolve place data from Google Maps</w:t>
+      </w:r>
+    </w:p>
+    <w:p>
+      <w:pPr>
+        <w:pStyle w:val="CodeBlock"/>
+      </w:pPr>
+      <w:r>
+        <w:t xml:space="preserve">    Maps--&gt;&gt;UI: place_id, address, latitude, longitude</w:t>
+      </w:r>
+    </w:p>
+    <w:p>
+      <w:pPr>
+        <w:pStyle w:val="CodeBlock"/>
+      </w:pPr>
+      <w:r>
+        <w:t xml:space="preserve">    Organizer-&gt;&gt;UI: Save draft</w:t>
       </w:r>
     </w:p>
     <w:p>
@@ -2873,7 +6077,7 @@
         <w:pStyle w:val="CodeBlock"/>
       </w:pPr>
       <w:r>
-        <w:t xml:space="preserve">    API-&gt;&gt;DB: Insert draft event and generated slug</w:t>
+        <w:t xml:space="preserve">    API-&gt;&gt;DB: Insert draft event with slug and venue data</w:t>
       </w:r>
     </w:p>
     <w:p>
@@ -2897,6 +6101,46 @@
         <w:pStyle w:val="CodeBlock"/>
       </w:pPr>
       <w:r>
+        <w:t xml:space="preserve">    Organizer-&gt;&gt;UI: Add optional agenda and speakers</w:t>
+      </w:r>
+    </w:p>
+    <w:p>
+      <w:pPr>
+        <w:pStyle w:val="CodeBlock"/>
+      </w:pPr>
+      <w:r>
+        <w:t xml:space="preserve">    UI-&gt;&gt;API: PATCH /api/events/{eventId}</w:t>
+      </w:r>
+    </w:p>
+    <w:p>
+      <w:pPr>
+        <w:pStyle w:val="CodeBlock"/>
+      </w:pPr>
+      <w:r>
+        <w:t xml:space="preserve">    API-&gt;&gt;DB: Update event content</w:t>
+      </w:r>
+    </w:p>
+    <w:p>
+      <w:pPr>
+        <w:pStyle w:val="CodeBlock"/>
+      </w:pPr>
+      <w:r>
+        <w:t xml:space="preserve">    DB--&gt;&gt;API: Event updated</w:t>
+      </w:r>
+    </w:p>
+    <w:p>
+      <w:pPr>
+        <w:pStyle w:val="CodeBlock"/>
+      </w:pPr>
+      <w:r>
+        <w:t xml:space="preserve">    API--&gt;&gt;UI: Updated event response</w:t>
+      </w:r>
+    </w:p>
+    <w:p>
+      <w:pPr>
+        <w:pStyle w:val="CodeBlock"/>
+      </w:pPr>
+      <w:r>
         <w:t xml:space="preserve">    Organizer-&gt;&gt;UI: Publish event</w:t>
       </w:r>
     </w:p>
@@ -2935,10 +6179,10 @@
     <w:p/>
     <w:p>
       <w:pPr>
-        <w:pStyle w:val="Heading3"/>
-      </w:pPr>
-      <w:r>
-        <w:t>Mermaid: Guest Registration</w:t>
+        <w:pStyle w:val="Heading2"/>
+      </w:pPr>
+      <w:r>
+        <w:t>Sequence: Guest Registration</w:t>
       </w:r>
     </w:p>
     <w:p/>
@@ -2987,6 +6231,14 @@
         <w:pStyle w:val="CodeBlock"/>
       </w:pPr>
       <w:r>
+        <w:t xml:space="preserve">    participant Maps as VenueLocationService</w:t>
+      </w:r>
+    </w:p>
+    <w:p>
+      <w:pPr>
+        <w:pStyle w:val="CodeBlock"/>
+      </w:pPr>
+      <w:r>
         <w:t xml:space="preserve">    participant DB as Supabase Postgres</w:t>
       </w:r>
     </w:p>
@@ -3027,7 +6279,7 @@
         <w:pStyle w:val="CodeBlock"/>
       </w:pPr>
       <w:r>
-        <w:t xml:space="preserve">    DB--&gt;&gt;API: Event details</w:t>
+        <w:t xml:space="preserve">    DB--&gt;&gt;API: Event details, agenda, speakers, venue</w:t>
       </w:r>
     </w:p>
     <w:p>
@@ -3043,7 +6295,23 @@
         <w:pStyle w:val="CodeBlock"/>
       </w:pPr>
       <w:r>
-        <w:t xml:space="preserve">    Guest-&gt;&gt;UI: Submit registration form</w:t>
+        <w:t xml:space="preserve">    UI-&gt;&gt;Maps: Build directions link from venue data</w:t>
+      </w:r>
+    </w:p>
+    <w:p>
+      <w:pPr>
+        <w:pStyle w:val="CodeBlock"/>
+      </w:pPr>
+      <w:r>
+        <w:t xml:space="preserve">    Maps--&gt;&gt;UI: Directions URL</w:t>
+      </w:r>
+    </w:p>
+    <w:p>
+      <w:pPr>
+        <w:pStyle w:val="CodeBlock"/>
+      </w:pPr>
+      <w:r>
+        <w:t xml:space="preserve">    Guest-&gt;&gt;UI: Review details and submit registration form</w:t>
       </w:r>
     </w:p>
     <w:p>
@@ -3089,10 +6357,10 @@
     <w:p/>
     <w:p>
       <w:pPr>
-        <w:pStyle w:val="Heading3"/>
-      </w:pPr>
-      <w:r>
-        <w:t>Mermaid: Offline Check-in</w:t>
+        <w:pStyle w:val="Heading2"/>
+      </w:pPr>
+      <w:r>
+        <w:t>Sequence: Offline Check-in</w:t>
       </w:r>
     </w:p>
     <w:p/>
@@ -3125,15 +6393,23 @@
         <w:pStyle w:val="CodeBlock"/>
       </w:pPr>
       <w:r>
-        <w:t xml:space="preserve">    participant UI as Check-in Screen</w:t>
-      </w:r>
-    </w:p>
-    <w:p>
-      <w:pPr>
-        <w:pStyle w:val="CodeBlock"/>
-      </w:pPr>
-      <w:r>
-        <w:t xml:space="preserve">    participant API as CheckInService</w:t>
+        <w:t xml:space="preserve">    participant UI as Guest List and Check-in UI</w:t>
+      </w:r>
+    </w:p>
+    <w:p>
+      <w:pPr>
+        <w:pStyle w:val="CodeBlock"/>
+      </w:pPr>
+      <w:r>
+        <w:t xml:space="preserve">    participant GuestAPI as GuestService</w:t>
+      </w:r>
+    </w:p>
+    <w:p>
+      <w:pPr>
+        <w:pStyle w:val="CodeBlock"/>
+      </w:pPr>
+      <w:r>
+        <w:t xml:space="preserve">    participant CheckIn as CheckInService</w:t>
       </w:r>
     </w:p>
     <w:p>
@@ -3157,79 +6433,79 @@
         <w:pStyle w:val="CodeBlock"/>
       </w:pPr>
       <w:r>
-        <w:t xml:space="preserve">    Organizer-&gt;&gt;UI: Open event guest list or check-in screen</w:t>
-      </w:r>
-    </w:p>
-    <w:p>
-      <w:pPr>
-        <w:pStyle w:val="CodeBlock"/>
-      </w:pPr>
-      <w:r>
-        <w:t xml:space="preserve">    UI-&gt;&gt;API: GET /api/events/{eventId}/guests</w:t>
-      </w:r>
-    </w:p>
-    <w:p>
-      <w:pPr>
-        <w:pStyle w:val="CodeBlock"/>
-      </w:pPr>
-      <w:r>
-        <w:t xml:space="preserve">    API-&gt;&gt;DB: Fetch registered guests</w:t>
-      </w:r>
-    </w:p>
-    <w:p>
-      <w:pPr>
-        <w:pStyle w:val="CodeBlock"/>
-      </w:pPr>
-      <w:r>
-        <w:t xml:space="preserve">    DB--&gt;&gt;API: Guest list</w:t>
-      </w:r>
-    </w:p>
-    <w:p>
-      <w:pPr>
-        <w:pStyle w:val="CodeBlock"/>
-      </w:pPr>
-      <w:r>
-        <w:t xml:space="preserve">    API--&gt;&gt;UI: Guest list response</w:t>
-      </w:r>
-    </w:p>
-    <w:p>
-      <w:pPr>
-        <w:pStyle w:val="CodeBlock"/>
-      </w:pPr>
-      <w:r>
-        <w:t xml:space="preserve">    Organizer-&gt;&gt;UI: Select guest and confirm check-in</w:t>
-      </w:r>
-    </w:p>
-    <w:p>
-      <w:pPr>
-        <w:pStyle w:val="CodeBlock"/>
-      </w:pPr>
-      <w:r>
-        <w:t xml:space="preserve">    UI-&gt;&gt;API: POST /api/guests/{guestId}/checkin</w:t>
-      </w:r>
-    </w:p>
-    <w:p>
-      <w:pPr>
-        <w:pStyle w:val="CodeBlock"/>
-      </w:pPr>
-      <w:r>
-        <w:t xml:space="preserve">    API-&gt;&gt;DB: Update guest status and checked_in_at</w:t>
-      </w:r>
-    </w:p>
-    <w:p>
-      <w:pPr>
-        <w:pStyle w:val="CodeBlock"/>
-      </w:pPr>
-      <w:r>
-        <w:t xml:space="preserve">    DB--&gt;&gt;API: Updated guest</w:t>
-      </w:r>
-    </w:p>
-    <w:p>
-      <w:pPr>
-        <w:pStyle w:val="CodeBlock"/>
-      </w:pPr>
-      <w:r>
-        <w:t xml:space="preserve">    API--&gt;&gt;UI: Check-in success response</w:t>
+        <w:t xml:space="preserve">    Organizer-&gt;&gt;UI: Open guest list</w:t>
+      </w:r>
+    </w:p>
+    <w:p>
+      <w:pPr>
+        <w:pStyle w:val="CodeBlock"/>
+      </w:pPr>
+      <w:r>
+        <w:t xml:space="preserve">    UI-&gt;&gt;GuestAPI: GET /api/events/{eventId}/guests</w:t>
+      </w:r>
+    </w:p>
+    <w:p>
+      <w:pPr>
+        <w:pStyle w:val="CodeBlock"/>
+      </w:pPr>
+      <w:r>
+        <w:t xml:space="preserve">    GuestAPI-&gt;&gt;DB: Fetch registered guests</w:t>
+      </w:r>
+    </w:p>
+    <w:p>
+      <w:pPr>
+        <w:pStyle w:val="CodeBlock"/>
+      </w:pPr>
+      <w:r>
+        <w:t xml:space="preserve">    DB--&gt;&gt;GuestAPI: Guest list</w:t>
+      </w:r>
+    </w:p>
+    <w:p>
+      <w:pPr>
+        <w:pStyle w:val="CodeBlock"/>
+      </w:pPr>
+      <w:r>
+        <w:t xml:space="preserve">    GuestAPI--&gt;&gt;UI: Guest list response</w:t>
+      </w:r>
+    </w:p>
+    <w:p>
+      <w:pPr>
+        <w:pStyle w:val="CodeBlock"/>
+      </w:pPr>
+      <w:r>
+        <w:t xml:space="preserve">    Organizer-&gt;&gt;UI: Search guest and confirm check-in</w:t>
+      </w:r>
+    </w:p>
+    <w:p>
+      <w:pPr>
+        <w:pStyle w:val="CodeBlock"/>
+      </w:pPr>
+      <w:r>
+        <w:t xml:space="preserve">    UI-&gt;&gt;CheckIn: POST /api/guests/{guestId}/checkin</w:t>
+      </w:r>
+    </w:p>
+    <w:p>
+      <w:pPr>
+        <w:pStyle w:val="CodeBlock"/>
+      </w:pPr>
+      <w:r>
+        <w:t xml:space="preserve">    CheckIn-&gt;&gt;DB: Update guest status and checked_in_at</w:t>
+      </w:r>
+    </w:p>
+    <w:p>
+      <w:pPr>
+        <w:pStyle w:val="CodeBlock"/>
+      </w:pPr>
+      <w:r>
+        <w:t xml:space="preserve">    DB--&gt;&gt;CheckIn: Updated guest</w:t>
+      </w:r>
+    </w:p>
+    <w:p>
+      <w:pPr>
+        <w:pStyle w:val="CodeBlock"/>
+      </w:pPr>
+      <w:r>
+        <w:t xml:space="preserve">    CheckIn--&gt;&gt;UI: Check-in success response</w:t>
       </w:r>
     </w:p>
     <w:p>
@@ -3238,317 +6514,6 @@
       </w:pPr>
       <w:r>
         <w:t xml:space="preserve">    UI--&gt;&gt;Organizer: Attendance updated</w:t>
-      </w:r>
-    </w:p>
-    <w:p/>
-    <w:p>
-      <w:pPr>
-        <w:pStyle w:val="Heading2"/>
-      </w:pPr>
-      <w:r>
-        <w:t>9. API Specifications</w:t>
-      </w:r>
-    </w:p>
-    <w:p/>
-    <w:p>
-      <w:r>
-        <w:t>The detailed endpoint definitions are documented in `docs/api-spec.md`.</w:t>
-      </w:r>
-    </w:p>
-    <w:p/>
-    <w:p>
-      <w:pPr>
-        <w:pStyle w:val="Heading3"/>
-      </w:pPr>
-      <w:r>
-        <w:t>MVP endpoint set</w:t>
-      </w:r>
-    </w:p>
-    <w:p/>
-    <w:p>
-      <w:pPr>
-        <w:pStyle w:val="ListBullet"/>
-      </w:pPr>
-      <w:r>
-        <w:t>`POST /api/auth/register`</w:t>
-      </w:r>
-    </w:p>
-    <w:p>
-      <w:pPr>
-        <w:pStyle w:val="ListBullet"/>
-      </w:pPr>
-      <w:r>
-        <w:t>`POST /api/auth/login`</w:t>
-      </w:r>
-    </w:p>
-    <w:p>
-      <w:pPr>
-        <w:pStyle w:val="ListBullet"/>
-      </w:pPr>
-      <w:r>
-        <w:t>`POST /api/events`</w:t>
-      </w:r>
-    </w:p>
-    <w:p>
-      <w:pPr>
-        <w:pStyle w:val="ListBullet"/>
-      </w:pPr>
-      <w:r>
-        <w:t>`GET /api/events`</w:t>
-      </w:r>
-    </w:p>
-    <w:p>
-      <w:pPr>
-        <w:pStyle w:val="ListBullet"/>
-      </w:pPr>
-      <w:r>
-        <w:t>`GET /api/events/{eventId}`</w:t>
-      </w:r>
-    </w:p>
-    <w:p>
-      <w:pPr>
-        <w:pStyle w:val="ListBullet"/>
-      </w:pPr>
-      <w:r>
-        <w:t>`PATCH /api/events/{eventId}`</w:t>
-      </w:r>
-    </w:p>
-    <w:p>
-      <w:pPr>
-        <w:pStyle w:val="ListBullet"/>
-      </w:pPr>
-      <w:r>
-        <w:t>`POST /api/events/{eventId}/publish`</w:t>
-      </w:r>
-    </w:p>
-    <w:p>
-      <w:pPr>
-        <w:pStyle w:val="ListBullet"/>
-      </w:pPr>
-      <w:r>
-        <w:t>`GET /api/public/events/{slug}`</w:t>
-      </w:r>
-    </w:p>
-    <w:p>
-      <w:pPr>
-        <w:pStyle w:val="ListBullet"/>
-      </w:pPr>
-      <w:r>
-        <w:t>`POST /api/guests/register`</w:t>
-      </w:r>
-    </w:p>
-    <w:p>
-      <w:pPr>
-        <w:pStyle w:val="ListBullet"/>
-      </w:pPr>
-      <w:r>
-        <w:t>`GET /api/events/{eventId}/guests`</w:t>
-      </w:r>
-    </w:p>
-    <w:p>
-      <w:pPr>
-        <w:pStyle w:val="ListBullet"/>
-      </w:pPr>
-      <w:r>
-        <w:t>`POST /api/guests/{guestId}/checkin`</w:t>
-      </w:r>
-    </w:p>
-    <w:p/>
-    <w:p>
-      <w:pPr>
-        <w:pStyle w:val="Heading2"/>
-      </w:pPr>
-      <w:r>
-        <w:t>10. SCM and QA</w:t>
-      </w:r>
-    </w:p>
-    <w:p/>
-    <w:p>
-      <w:r>
-        <w:t>The full plan is documented in `docs/scm-qa-plan.md`.</w:t>
-      </w:r>
-    </w:p>
-    <w:p/>
-    <w:p>
-      <w:pPr>
-        <w:pStyle w:val="Heading3"/>
-      </w:pPr>
-      <w:r>
-        <w:t>SCM summary</w:t>
-      </w:r>
-    </w:p>
-    <w:p/>
-    <w:p>
-      <w:pPr>
-        <w:pStyle w:val="ListBullet"/>
-      </w:pPr>
-      <w:r>
-        <w:t>`main` is the protected branch.</w:t>
-      </w:r>
-    </w:p>
-    <w:p>
-      <w:pPr>
-        <w:pStyle w:val="ListBullet"/>
-      </w:pPr>
-      <w:r>
-        <w:t>Each task is developed in a short-lived feature branch.</w:t>
-      </w:r>
-    </w:p>
-    <w:p>
-      <w:pPr>
-        <w:pStyle w:val="ListBullet"/>
-      </w:pPr>
-      <w:r>
-        <w:t>Pull requests are reviewed before merge.</w:t>
-      </w:r>
-    </w:p>
-    <w:p>
-      <w:pPr>
-        <w:pStyle w:val="ListBullet"/>
-      </w:pPr>
-      <w:r>
-        <w:t>Commits stay small and tied to one task or fix.</w:t>
-      </w:r>
-    </w:p>
-    <w:p/>
-    <w:p>
-      <w:pPr>
-        <w:pStyle w:val="Heading3"/>
-      </w:pPr>
-      <w:r>
-        <w:t>QA summary</w:t>
-      </w:r>
-    </w:p>
-    <w:p/>
-    <w:p>
-      <w:pPr>
-        <w:pStyle w:val="ListBullet"/>
-      </w:pPr>
-      <w:r>
-        <w:t>Manual smoke tests cover the main organizer and guest flows.</w:t>
-      </w:r>
-    </w:p>
-    <w:p>
-      <w:pPr>
-        <w:pStyle w:val="ListBullet"/>
-      </w:pPr>
-      <w:r>
-        <w:t>Targeted component and API tests are added where feasible.</w:t>
-      </w:r>
-    </w:p>
-    <w:p>
-      <w:pPr>
-        <w:pStyle w:val="ListBullet"/>
-      </w:pPr>
-      <w:r>
-        <w:t>Staging is used for validation before production release.</w:t>
-      </w:r>
-    </w:p>
-    <w:p/>
-    <w:p>
-      <w:pPr>
-        <w:pStyle w:val="Heading2"/>
-      </w:pPr>
-      <w:r>
-        <w:t>11. Technical Justifications</w:t>
-      </w:r>
-    </w:p>
-    <w:p/>
-    <w:p>
-      <w:r>
-        <w:t>The full rationale is documented in `docs/technical-justifications.md`.</w:t>
-      </w:r>
-    </w:p>
-    <w:p/>
-    <w:p>
-      <w:pPr>
-        <w:pStyle w:val="Heading3"/>
-      </w:pPr>
-      <w:r>
-        <w:t>Main decisions</w:t>
-      </w:r>
-    </w:p>
-    <w:p/>
-    <w:p>
-      <w:pPr>
-        <w:pStyle w:val="ListBullet"/>
-      </w:pPr>
-      <w:r>
-        <w:t>Supabase reduces backend setup overhead and provides Auth, Postgres, and access control quickly.</w:t>
-      </w:r>
-    </w:p>
-    <w:p>
-      <w:pPr>
-        <w:pStyle w:val="ListBullet"/>
-      </w:pPr>
-      <w:r>
-        <w:t>Vercel is a practical fit for Next.js deployment, preview environments, and fast iteration.</w:t>
-      </w:r>
-    </w:p>
-    <w:p>
-      <w:pPr>
-        <w:pStyle w:val="ListBullet"/>
-      </w:pPr>
-      <w:r>
-        <w:t>Google Maps is the most useful external integration for accurate venue location and directions.</w:t>
-      </w:r>
-    </w:p>
-    <w:p>
-      <w:pPr>
-        <w:pStyle w:val="ListBullet"/>
-      </w:pPr>
-      <w:r>
-        <w:t>Online payments are intentionally deferred to keep the MVP realistic and deliverable for a small student team.</w:t>
-      </w:r>
-    </w:p>
-    <w:p/>
-    <w:p>
-      <w:pPr>
-        <w:pStyle w:val="Heading2"/>
-      </w:pPr>
-      <w:r>
-        <w:t>12. Acceptance Criteria</w:t>
-      </w:r>
-    </w:p>
-    <w:p/>
-    <w:p>
-      <w:pPr>
-        <w:pStyle w:val="ListBullet"/>
-      </w:pPr>
-      <w:r>
-        <w:t>The repository documents only the reduced MVP scope.</w:t>
-      </w:r>
-    </w:p>
-    <w:p>
-      <w:pPr>
-        <w:pStyle w:val="ListBullet"/>
-      </w:pPr>
-      <w:r>
-        <w:t>The diagrams match the documented architecture and database design.</w:t>
-      </w:r>
-    </w:p>
-    <w:p>
-      <w:pPr>
-        <w:pStyle w:val="ListBullet"/>
-      </w:pPr>
-      <w:r>
-        <w:t>The API specification aligns with the user stories and sequence diagrams.</w:t>
-      </w:r>
-    </w:p>
-    <w:p>
-      <w:pPr>
-        <w:pStyle w:val="ListBullet"/>
-      </w:pPr>
-      <w:r>
-        <w:t>The SCM and QA plan is realistic for a four-member student team.</w:t>
-      </w:r>
-    </w:p>
-    <w:p>
-      <w:pPr>
-        <w:pStyle w:val="ListBullet"/>
-      </w:pPr>
-      <w:r>
-        <w:t>The `.docx` submission file is generated from the repo content and ready to upload.</w:t>
       </w:r>
     </w:p>
     <w:p>

</xml_diff>

<commit_message>
Add organizer mockup reference to docs
</commit_message>
<xml_diff>
--- a/deliverables/RiziEvents-Technical-Documentation.docx
+++ b/deliverables/RiziEvents-Technical-Documentation.docx
@@ -482,6 +482,53 @@
       </w:pPr>
       <w:r>
         <w:t>Offline/manual check-in screen</w:t>
+      </w:r>
+    </w:p>
+    <w:p/>
+    <w:p>
+      <w:pPr>
+        <w:pStyle w:val="Heading3"/>
+      </w:pPr>
+      <w:r>
+        <w:t>Organizer Mockups</w:t>
+      </w:r>
+    </w:p>
+    <w:p/>
+    <w:p>
+      <w:r>
+        <w:t>The organizer journey mockup currently covers the organizer-side flow for sign in, dashboard access, event creation and editing, publication readiness, and organizer event management.</w:t>
+      </w:r>
+    </w:p>
+    <w:p/>
+    <w:p>
+      <w:r>
+        <w:t>Direct Figma embed link:</w:t>
+      </w:r>
+    </w:p>
+    <w:p>
+      <w:r>
+        <w:t>`https://embed.figma.com/design/RmJ2tLT6Nm2U7oc9pciS2j/Rizi-Final-Mockup?node-id=15-259&amp;embed-host=share`</w:t>
+      </w:r>
+    </w:p>
+    <w:p/>
+    <w:p>
+      <w:r>
+        <w:t>Embedded mockup reference: https://embed.figma.com/design/RmJ2tLT6Nm2U7oc9pciS2j/Rizi-Final-Mockup?node-id=15-259&amp;embed-host=share</w:t>
+      </w:r>
+    </w:p>
+    <w:p/>
+    <w:p>
+      <w:pPr>
+        <w:pStyle w:val="Heading3"/>
+      </w:pPr>
+      <w:r>
+        <w:t>Visitor Mockups</w:t>
+      </w:r>
+    </w:p>
+    <w:p/>
+    <w:p>
+      <w:r>
+        <w:t>Visitor-side mockups will be added later as a separate visual reference for the guest journey.</w:t>
       </w:r>
     </w:p>
     <w:p/>

</xml_diff>